<commit_message>
Modified windows setup doc
</commit_message>
<xml_diff>
--- a/docs/SetupWindows.docx
+++ b/docs/SetupWindows.docx
@@ -2,7 +2,7 @@
 <file path=word/document.xml><?xml version="1.0" encoding="utf-8"?>
 <w:document xmlns:w="http://schemas.openxmlformats.org/wordprocessingml/2006/main" xmlns:m="http://schemas.openxmlformats.org/officeDocument/2006/math" xmlns:r="http://schemas.openxmlformats.org/officeDocument/2006/relationships" xmlns:o="urn:schemas-microsoft-com:office:office" xmlns:v="urn:schemas-microsoft-com:vml" xmlns:w10="urn:schemas-microsoft-com:office:word" xmlns:a="http://schemas.openxmlformats.org/drawingml/2006/main" xmlns:pic="http://schemas.openxmlformats.org/drawingml/2006/picture" xmlns:wp="http://schemas.openxmlformats.org/drawingml/2006/wordprocessingDrawing">
   <w:body>
-    <w:bookmarkStart w:id="52" w:name="Xf67453e095810f651d0f1f1371aded0ff409dd7"/>
+    <w:bookmarkStart w:id="58" w:name="Xf67453e095810f651d0f1f1371aded0ff409dd7"/>
     <w:p>
       <w:pPr>
         <w:pStyle w:val="Heading1"/>
@@ -135,13 +135,929 @@
         </w:pict>
       </w:r>
     </w:p>
-    <w:bookmarkStart w:id="21" w:name="what-you-need-to-know-first"/>
+    <w:bookmarkStart w:id="27" w:name="hardware-discovery-what-gpu-do-you-have"/>
     <w:p>
       <w:pPr>
         <w:pStyle w:val="Heading2"/>
       </w:pPr>
       <w:r>
-        <w:t xml:space="preserve">1. What you need to know first</w:t>
+        <w:t xml:space="preserve">1. Hardware discovery — what GPU do you have?</w:t>
+      </w:r>
+    </w:p>
+    <w:p>
+      <w:pPr>
+        <w:pStyle w:val="FirstParagraph"/>
+      </w:pPr>
+      <w:r>
+        <w:t xml:space="preserve">On a brand-new laptop,</w:t>
+      </w:r>
+      <w:r>
+        <w:t xml:space="preserve"> </w:t>
+      </w:r>
+      <w:r>
+        <w:rPr>
+          <w:bCs/>
+          <w:b/>
+        </w:rPr>
+        <w:t xml:space="preserve">do this first.</w:t>
+      </w:r>
+      <w:r>
+        <w:t xml:space="preserve"> </w:t>
+      </w:r>
+      <w:r>
+        <w:t xml:space="preserve">Don’t install anything until you’ve confirmed:</w:t>
+      </w:r>
+      <w:r>
+        <w:t xml:space="preserve"> </w:t>
+      </w:r>
+      <w:r>
+        <w:t xml:space="preserve">1. There is an NVIDIA GPU at all (some</w:t>
+      </w:r>
+      <w:r>
+        <w:t xml:space="preserve"> </w:t>
+      </w:r>
+      <w:r>
+        <w:t xml:space="preserve">“</w:t>
+      </w:r>
+      <w:r>
+        <w:t xml:space="preserve">gaming-looking</w:t>
+      </w:r>
+      <w:r>
+        <w:t xml:space="preserve">”</w:t>
+      </w:r>
+      <w:r>
+        <w:t xml:space="preserve"> </w:t>
+      </w:r>
+      <w:r>
+        <w:t xml:space="preserve">laptops are integrated-graphics-only).</w:t>
+      </w:r>
+      <w:r>
+        <w:t xml:space="preserve"> </w:t>
+      </w:r>
+      <w:r>
+        <w:t xml:space="preserve">2. The exact model and architecture.</w:t>
+      </w:r>
+      <w:r>
+        <w:t xml:space="preserve"> </w:t>
+      </w:r>
+      <w:r>
+        <w:t xml:space="preserve">3. That architecture is still supported by current NVIDIA drivers.</w:t>
+      </w:r>
+      <w:r>
+        <w:t xml:space="preserve"> </w:t>
+      </w:r>
+      <w:r>
+        <w:t xml:space="preserve">4. How hybrid graphics is set up (most NVIDIA laptops have two GPUs).</w:t>
+      </w:r>
+    </w:p>
+    <w:p>
+      <w:pPr>
+        <w:pStyle w:val="BodyText"/>
+      </w:pPr>
+      <w:r>
+        <w:t xml:space="preserve">These steps</w:t>
+      </w:r>
+      <w:r>
+        <w:t xml:space="preserve"> </w:t>
+      </w:r>
+      <w:r>
+        <w:rPr>
+          <w:bCs/>
+          <w:b/>
+        </w:rPr>
+        <w:t xml:space="preserve">don’t require any NVIDIA software</w:t>
+      </w:r>
+      <w:r>
+        <w:t xml:space="preserve"> </w:t>
+      </w:r>
+      <w:r>
+        <w:t xml:space="preserve">— Windows can identify the hardware on its own.</w:t>
+      </w:r>
+    </w:p>
+    <w:bookmarkStart w:id="21" w:name="X7b8150b36928482416e5192562c43393946d992"/>
+    <w:p>
+      <w:pPr>
+        <w:pStyle w:val="Heading3"/>
+      </w:pPr>
+      <w:r>
+        <w:t xml:space="preserve">1.1 Identify the GPU (five methods, pick whichever)</w:t>
+      </w:r>
+    </w:p>
+    <w:p>
+      <w:pPr>
+        <w:pStyle w:val="FirstParagraph"/>
+      </w:pPr>
+      <w:r>
+        <w:rPr>
+          <w:bCs/>
+          <w:b/>
+        </w:rPr>
+        <w:t xml:space="preserve">Method A — Task Manager (fastest, no clicks beyond opening it).</w:t>
+      </w:r>
+    </w:p>
+    <w:p>
+      <w:pPr>
+        <w:pStyle w:val="BodyText"/>
+      </w:pPr>
+      <w:r>
+        <w:rPr>
+          <w:rStyle w:val="VerbatimChar"/>
+        </w:rPr>
+        <w:t xml:space="preserve">Ctrl + Shift + Esc</w:t>
+      </w:r>
+      <w:r>
+        <w:t xml:space="preserve"> </w:t>
+      </w:r>
+      <w:r>
+        <w:t xml:space="preserve">→</w:t>
+      </w:r>
+      <w:r>
+        <w:t xml:space="preserve"> </w:t>
+      </w:r>
+      <w:r>
+        <w:rPr>
+          <w:bCs/>
+          <w:b/>
+        </w:rPr>
+        <w:t xml:space="preserve">Performance</w:t>
+      </w:r>
+      <w:r>
+        <w:t xml:space="preserve"> </w:t>
+      </w:r>
+      <w:r>
+        <w:t xml:space="preserve">tab → look in the left sidebar for</w:t>
+      </w:r>
+      <w:r>
+        <w:t xml:space="preserve"> </w:t>
+      </w:r>
+      <w:r>
+        <w:rPr>
+          <w:bCs/>
+          <w:b/>
+        </w:rPr>
+        <w:t xml:space="preserve">GPU 0</w:t>
+      </w:r>
+      <w:r>
+        <w:t xml:space="preserve">,</w:t>
+      </w:r>
+      <w:r>
+        <w:t xml:space="preserve"> </w:t>
+      </w:r>
+      <w:r>
+        <w:rPr>
+          <w:bCs/>
+          <w:b/>
+        </w:rPr>
+        <w:t xml:space="preserve">GPU 1</w:t>
+      </w:r>
+      <w:r>
+        <w:t xml:space="preserve">, etc. Each entry shows the model name in the top-right (</w:t>
+      </w:r>
+      <w:r>
+        <w:t xml:space="preserve">“</w:t>
+      </w:r>
+      <w:r>
+        <w:t xml:space="preserve">NVIDIA GeForce RTX 4060 Laptop GPU</w:t>
+      </w:r>
+      <w:r>
+        <w:t xml:space="preserve">”</w:t>
+      </w:r>
+      <w:r>
+        <w:t xml:space="preserve">). If you see two GPUs (e.g. </w:t>
+      </w:r>
+      <w:r>
+        <w:t xml:space="preserve">“</w:t>
+      </w:r>
+      <w:r>
+        <w:t xml:space="preserve">Intel Iris Xe</w:t>
+      </w:r>
+      <w:r>
+        <w:t xml:space="preserve">”</w:t>
+      </w:r>
+      <w:r>
+        <w:t xml:space="preserve"> </w:t>
+      </w:r>
+      <w:r>
+        <w:t xml:space="preserve">and an NVIDIA one), you have</w:t>
+      </w:r>
+      <w:r>
+        <w:t xml:space="preserve"> </w:t>
+      </w:r>
+      <w:r>
+        <w:rPr>
+          <w:bCs/>
+          <w:b/>
+        </w:rPr>
+        <w:t xml:space="preserve">hybrid graphics</w:t>
+      </w:r>
+      <w:r>
+        <w:t xml:space="preserve"> </w:t>
+      </w:r>
+      <w:r>
+        <w:t xml:space="preserve">— see §1.4.</w:t>
+      </w:r>
+    </w:p>
+    <w:p>
+      <w:pPr>
+        <w:pStyle w:val="BodyText"/>
+      </w:pPr>
+      <w:r>
+        <w:rPr>
+          <w:bCs/>
+          <w:b/>
+        </w:rPr>
+        <w:t xml:space="preserve">Method B — Device Manager.</w:t>
+      </w:r>
+    </w:p>
+    <w:p>
+      <w:pPr>
+        <w:pStyle w:val="BodyText"/>
+      </w:pPr>
+      <w:r>
+        <w:rPr>
+          <w:rStyle w:val="VerbatimChar"/>
+        </w:rPr>
+        <w:t xml:space="preserve">Win + X</w:t>
+      </w:r>
+      <w:r>
+        <w:t xml:space="preserve"> </w:t>
+      </w:r>
+      <w:r>
+        <w:t xml:space="preserve">→</w:t>
+      </w:r>
+      <w:r>
+        <w:t xml:space="preserve"> </w:t>
+      </w:r>
+      <w:r>
+        <w:rPr>
+          <w:iCs/>
+          <w:i/>
+        </w:rPr>
+        <w:t xml:space="preserve">Device Manager</w:t>
+      </w:r>
+      <w:r>
+        <w:t xml:space="preserve"> </w:t>
+      </w:r>
+      <w:r>
+        <w:t xml:space="preserve">→ expand</w:t>
+      </w:r>
+      <w:r>
+        <w:t xml:space="preserve"> </w:t>
+      </w:r>
+      <w:r>
+        <w:rPr>
+          <w:bCs/>
+          <w:b/>
+        </w:rPr>
+        <w:t xml:space="preserve">Display adapters</w:t>
+      </w:r>
+      <w:r>
+        <w:t xml:space="preserve">. Each adapter is listed by exact name. Right-click →</w:t>
+      </w:r>
+      <w:r>
+        <w:t xml:space="preserve"> </w:t>
+      </w:r>
+      <w:r>
+        <w:rPr>
+          <w:iCs/>
+          <w:i/>
+        </w:rPr>
+        <w:t xml:space="preserve">Properties</w:t>
+      </w:r>
+      <w:r>
+        <w:t xml:space="preserve"> </w:t>
+      </w:r>
+      <w:r>
+        <w:t xml:space="preserve">→</w:t>
+      </w:r>
+      <w:r>
+        <w:t xml:space="preserve"> </w:t>
+      </w:r>
+      <w:r>
+        <w:rPr>
+          <w:iCs/>
+          <w:i/>
+        </w:rPr>
+        <w:t xml:space="preserve">Details</w:t>
+      </w:r>
+      <w:r>
+        <w:t xml:space="preserve"> </w:t>
+      </w:r>
+      <w:r>
+        <w:t xml:space="preserve">tab →</w:t>
+      </w:r>
+      <w:r>
+        <w:t xml:space="preserve"> </w:t>
+      </w:r>
+      <w:r>
+        <w:rPr>
+          <w:iCs/>
+          <w:i/>
+        </w:rPr>
+        <w:t xml:space="preserve">Property: Hardware Ids</w:t>
+      </w:r>
+      <w:r>
+        <w:t xml:space="preserve"> </w:t>
+      </w:r>
+      <w:r>
+        <w:t xml:space="preserve">gives you the PCI vendor/device ID (</w:t>
+      </w:r>
+      <w:r>
+        <w:rPr>
+          <w:rStyle w:val="VerbatimChar"/>
+        </w:rPr>
+        <w:t xml:space="preserve">PCI\VEN_10DE&amp;DEV_xxxx</w:t>
+      </w:r>
+      <w:r>
+        <w:t xml:space="preserve"> </w:t>
+      </w:r>
+      <w:r>
+        <w:t xml:space="preserve">—</w:t>
+      </w:r>
+      <w:r>
+        <w:t xml:space="preserve"> </w:t>
+      </w:r>
+      <w:r>
+        <w:rPr>
+          <w:rStyle w:val="VerbatimChar"/>
+        </w:rPr>
+        <w:t xml:space="preserve">10DE</w:t>
+      </w:r>
+      <w:r>
+        <w:t xml:space="preserve"> </w:t>
+      </w:r>
+      <w:r>
+        <w:t xml:space="preserve">is NVIDIA).</w:t>
+      </w:r>
+    </w:p>
+    <w:p>
+      <w:pPr>
+        <w:pStyle w:val="BodyText"/>
+      </w:pPr>
+      <w:r>
+        <w:rPr>
+          <w:bCs/>
+          <w:b/>
+        </w:rPr>
+        <w:t xml:space="preserve">Method C — DirectX Diagnostic Tool (</w:t>
+      </w:r>
+      <w:r>
+        <w:rPr>
+          <w:rStyle w:val="VerbatimChar"/>
+          <w:bCs/>
+          <w:b/>
+        </w:rPr>
+        <w:t xml:space="preserve">dxdiag</w:t>
+      </w:r>
+      <w:r>
+        <w:rPr>
+          <w:bCs/>
+          <w:b/>
+        </w:rPr>
+        <w:t xml:space="preserve">).</w:t>
+      </w:r>
+    </w:p>
+    <w:p>
+      <w:pPr>
+        <w:pStyle w:val="BodyText"/>
+      </w:pPr>
+      <w:r>
+        <w:rPr>
+          <w:rStyle w:val="VerbatimChar"/>
+        </w:rPr>
+        <w:t xml:space="preserve">Win + R</w:t>
+      </w:r>
+      <w:r>
+        <w:t xml:space="preserve"> </w:t>
+      </w:r>
+      <w:r>
+        <w:t xml:space="preserve">→ type</w:t>
+      </w:r>
+      <w:r>
+        <w:t xml:space="preserve"> </w:t>
+      </w:r>
+      <w:r>
+        <w:rPr>
+          <w:rStyle w:val="VerbatimChar"/>
+        </w:rPr>
+        <w:t xml:space="preserve">dxdiag</w:t>
+      </w:r>
+      <w:r>
+        <w:t xml:space="preserve"> </w:t>
+      </w:r>
+      <w:r>
+        <w:t xml:space="preserve">→ Enter →</w:t>
+      </w:r>
+      <w:r>
+        <w:t xml:space="preserve"> </w:t>
+      </w:r>
+      <w:r>
+        <w:rPr>
+          <w:bCs/>
+          <w:b/>
+        </w:rPr>
+        <w:t xml:space="preserve">Display</w:t>
+      </w:r>
+      <w:r>
+        <w:t xml:space="preserve"> </w:t>
+      </w:r>
+      <w:r>
+        <w:t xml:space="preserve">tab(s). Shows manufacturer, chip type, driver version, and DirectX feature level. Multiple Display tabs = multiple GPUs.</w:t>
+      </w:r>
+    </w:p>
+    <w:p>
+      <w:pPr>
+        <w:pStyle w:val="BodyText"/>
+      </w:pPr>
+      <w:r>
+        <w:rPr>
+          <w:bCs/>
+          <w:b/>
+        </w:rPr>
+        <w:t xml:space="preserve">Method D — System Information (</w:t>
+      </w:r>
+      <w:r>
+        <w:rPr>
+          <w:rStyle w:val="VerbatimChar"/>
+          <w:bCs/>
+          <w:b/>
+        </w:rPr>
+        <w:t xml:space="preserve">msinfo32</w:t>
+      </w:r>
+      <w:r>
+        <w:rPr>
+          <w:bCs/>
+          <w:b/>
+        </w:rPr>
+        <w:t xml:space="preserve">).</w:t>
+      </w:r>
+    </w:p>
+    <w:p>
+      <w:pPr>
+        <w:pStyle w:val="BodyText"/>
+      </w:pPr>
+      <w:r>
+        <w:rPr>
+          <w:rStyle w:val="VerbatimChar"/>
+        </w:rPr>
+        <w:t xml:space="preserve">Win + R</w:t>
+      </w:r>
+      <w:r>
+        <w:t xml:space="preserve"> </w:t>
+      </w:r>
+      <w:r>
+        <w:t xml:space="preserve">→</w:t>
+      </w:r>
+      <w:r>
+        <w:t xml:space="preserve"> </w:t>
+      </w:r>
+      <w:r>
+        <w:rPr>
+          <w:rStyle w:val="VerbatimChar"/>
+        </w:rPr>
+        <w:t xml:space="preserve">msinfo32</w:t>
+      </w:r>
+      <w:r>
+        <w:t xml:space="preserve"> </w:t>
+      </w:r>
+      <w:r>
+        <w:t xml:space="preserve">→</w:t>
+      </w:r>
+      <w:r>
+        <w:t xml:space="preserve"> </w:t>
+      </w:r>
+      <w:r>
+        <w:rPr>
+          <w:iCs/>
+          <w:i/>
+        </w:rPr>
+        <w:t xml:space="preserve">Components → Display</w:t>
+      </w:r>
+      <w:r>
+        <w:t xml:space="preserve">. Same data, exportable to a text file via</w:t>
+      </w:r>
+      <w:r>
+        <w:t xml:space="preserve"> </w:t>
+      </w:r>
+      <w:r>
+        <w:rPr>
+          <w:iCs/>
+          <w:i/>
+        </w:rPr>
+        <w:t xml:space="preserve">File → Save</w:t>
+      </w:r>
+      <w:r>
+        <w:t xml:space="preserve">.</w:t>
+      </w:r>
+    </w:p>
+    <w:p>
+      <w:pPr>
+        <w:pStyle w:val="BodyText"/>
+      </w:pPr>
+      <w:r>
+        <w:rPr>
+          <w:bCs/>
+          <w:b/>
+        </w:rPr>
+        <w:t xml:space="preserve">Method E — PowerShell (scriptable, works in a script or remote session).</w:t>
+      </w:r>
+    </w:p>
+    <w:p>
+      <w:pPr>
+        <w:pStyle w:val="SourceCode"/>
+      </w:pPr>
+      <w:r>
+        <w:rPr>
+          <w:rStyle w:val="FunctionTok"/>
+        </w:rPr>
+        <w:t xml:space="preserve">Get-CimInstance</w:t>
+      </w:r>
+      <w:r>
+        <w:rPr>
+          <w:rStyle w:val="NormalTok"/>
+        </w:rPr>
+        <w:t xml:space="preserve"> Win32_VideoController </w:t>
+      </w:r>
+      <w:r>
+        <w:rPr>
+          <w:rStyle w:val="OperatorTok"/>
+        </w:rPr>
+        <w:t xml:space="preserve">|</w:t>
+      </w:r>
+      <w:r>
+        <w:br/>
+      </w:r>
+      <w:r>
+        <w:rPr>
+          <w:rStyle w:val="NormalTok"/>
+        </w:rPr>
+        <w:t xml:space="preserve">  </w:t>
+      </w:r>
+      <w:r>
+        <w:rPr>
+          <w:rStyle w:val="FunctionTok"/>
+        </w:rPr>
+        <w:t xml:space="preserve">Select-Object</w:t>
+      </w:r>
+      <w:r>
+        <w:rPr>
+          <w:rStyle w:val="NormalTok"/>
+        </w:rPr>
+        <w:t xml:space="preserve"> Name</w:t>
+      </w:r>
+      <w:r>
+        <w:rPr>
+          <w:rStyle w:val="OperatorTok"/>
+        </w:rPr>
+        <w:t xml:space="preserve">,</w:t>
+      </w:r>
+      <w:r>
+        <w:rPr>
+          <w:rStyle w:val="NormalTok"/>
+        </w:rPr>
+        <w:t xml:space="preserve"> AdapterRAM</w:t>
+      </w:r>
+      <w:r>
+        <w:rPr>
+          <w:rStyle w:val="OperatorTok"/>
+        </w:rPr>
+        <w:t xml:space="preserve">,</w:t>
+      </w:r>
+      <w:r>
+        <w:rPr>
+          <w:rStyle w:val="NormalTok"/>
+        </w:rPr>
+        <w:t xml:space="preserve"> DriverVersion</w:t>
+      </w:r>
+      <w:r>
+        <w:rPr>
+          <w:rStyle w:val="OperatorTok"/>
+        </w:rPr>
+        <w:t xml:space="preserve">,</w:t>
+      </w:r>
+      <w:r>
+        <w:rPr>
+          <w:rStyle w:val="NormalTok"/>
+        </w:rPr>
+        <w:t xml:space="preserve"> VideoProcessor </w:t>
+      </w:r>
+      <w:r>
+        <w:rPr>
+          <w:rStyle w:val="OperatorTok"/>
+        </w:rPr>
+        <w:t xml:space="preserve">|</w:t>
+      </w:r>
+      <w:r>
+        <w:br/>
+      </w:r>
+      <w:r>
+        <w:rPr>
+          <w:rStyle w:val="NormalTok"/>
+        </w:rPr>
+        <w:t xml:space="preserve">  </w:t>
+      </w:r>
+      <w:r>
+        <w:rPr>
+          <w:rStyle w:val="FunctionTok"/>
+        </w:rPr>
+        <w:t xml:space="preserve">Format-Table</w:t>
+      </w:r>
+      <w:r>
+        <w:rPr>
+          <w:rStyle w:val="NormalTok"/>
+        </w:rPr>
+        <w:t xml:space="preserve"> </w:t>
+      </w:r>
+      <w:r>
+        <w:rPr>
+          <w:rStyle w:val="OperatorTok"/>
+        </w:rPr>
+        <w:t xml:space="preserve">-</w:t>
+      </w:r>
+      <w:r>
+        <w:rPr>
+          <w:rStyle w:val="NormalTok"/>
+        </w:rPr>
+        <w:t xml:space="preserve">AutoSize</w:t>
+      </w:r>
+    </w:p>
+    <w:p>
+      <w:pPr>
+        <w:pStyle w:val="FirstParagraph"/>
+      </w:pPr>
+      <w:r>
+        <w:t xml:space="preserve">Or, by PCI ID (works even when no driver is bound):</w:t>
+      </w:r>
+    </w:p>
+    <w:p>
+      <w:pPr>
+        <w:pStyle w:val="SourceCode"/>
+      </w:pPr>
+      <w:r>
+        <w:rPr>
+          <w:rStyle w:val="NormalTok"/>
+        </w:rPr>
+        <w:t xml:space="preserve">Get</w:t>
+      </w:r>
+      <w:r>
+        <w:rPr>
+          <w:rStyle w:val="OperatorTok"/>
+        </w:rPr>
+        <w:t xml:space="preserve">-</w:t>
+      </w:r>
+      <w:r>
+        <w:rPr>
+          <w:rStyle w:val="NormalTok"/>
+        </w:rPr>
+        <w:t xml:space="preserve">PnpDevice </w:t>
+      </w:r>
+      <w:r>
+        <w:rPr>
+          <w:rStyle w:val="OperatorTok"/>
+        </w:rPr>
+        <w:t xml:space="preserve">-</w:t>
+      </w:r>
+      <w:r>
+        <w:rPr>
+          <w:rStyle w:val="NormalTok"/>
+        </w:rPr>
+        <w:t xml:space="preserve">Class Display </w:t>
+      </w:r>
+      <w:r>
+        <w:rPr>
+          <w:rStyle w:val="OperatorTok"/>
+        </w:rPr>
+        <w:t xml:space="preserve">|</w:t>
+      </w:r>
+      <w:r>
+        <w:br/>
+      </w:r>
+      <w:r>
+        <w:rPr>
+          <w:rStyle w:val="NormalTok"/>
+        </w:rPr>
+        <w:t xml:space="preserve">  </w:t>
+      </w:r>
+      <w:r>
+        <w:rPr>
+          <w:rStyle w:val="FunctionTok"/>
+        </w:rPr>
+        <w:t xml:space="preserve">Select-Object</w:t>
+      </w:r>
+      <w:r>
+        <w:rPr>
+          <w:rStyle w:val="NormalTok"/>
+        </w:rPr>
+        <w:t xml:space="preserve"> FriendlyName</w:t>
+      </w:r>
+      <w:r>
+        <w:rPr>
+          <w:rStyle w:val="OperatorTok"/>
+        </w:rPr>
+        <w:t xml:space="preserve">,</w:t>
+      </w:r>
+      <w:r>
+        <w:rPr>
+          <w:rStyle w:val="NormalTok"/>
+        </w:rPr>
+        <w:t xml:space="preserve"> InstanceId</w:t>
+      </w:r>
+      <w:r>
+        <w:rPr>
+          <w:rStyle w:val="OperatorTok"/>
+        </w:rPr>
+        <w:t xml:space="preserve">,</w:t>
+      </w:r>
+      <w:r>
+        <w:rPr>
+          <w:rStyle w:val="NormalTok"/>
+        </w:rPr>
+        <w:t xml:space="preserve"> Status</w:t>
+      </w:r>
+    </w:p>
+    <w:p>
+      <w:pPr>
+        <w:pStyle w:val="FirstParagraph"/>
+      </w:pPr>
+      <w:r>
+        <w:t xml:space="preserve">The</w:t>
+      </w:r>
+      <w:r>
+        <w:t xml:space="preserve"> </w:t>
+      </w:r>
+      <w:r>
+        <w:rPr>
+          <w:rStyle w:val="VerbatimChar"/>
+        </w:rPr>
+        <w:t xml:space="preserve">InstanceId</w:t>
+      </w:r>
+      <w:r>
+        <w:t xml:space="preserve"> </w:t>
+      </w:r>
+      <w:r>
+        <w:t xml:space="preserve">contains the</w:t>
+      </w:r>
+      <w:r>
+        <w:t xml:space="preserve"> </w:t>
+      </w:r>
+      <w:r>
+        <w:rPr>
+          <w:rStyle w:val="VerbatimChar"/>
+        </w:rPr>
+        <w:t xml:space="preserve">VEN_10DE&amp;DEV_xxxx</w:t>
+      </w:r>
+      <w:r>
+        <w:t xml:space="preserve"> </w:t>
+      </w:r>
+      <w:r>
+        <w:t xml:space="preserve">segment — the four hex digits after</w:t>
+      </w:r>
+      <w:r>
+        <w:t xml:space="preserve"> </w:t>
+      </w:r>
+      <w:r>
+        <w:rPr>
+          <w:rStyle w:val="VerbatimChar"/>
+        </w:rPr>
+        <w:t xml:space="preserve">DEV_</w:t>
+      </w:r>
+      <w:r>
+        <w:t xml:space="preserve"> </w:t>
+      </w:r>
+      <w:r>
+        <w:t xml:space="preserve">are the device ID. Cross-reference at</w:t>
+      </w:r>
+      <w:r>
+        <w:t xml:space="preserve"> </w:t>
+      </w:r>
+      <w:hyperlink r:id="rId20">
+        <w:r>
+          <w:rPr>
+            <w:rStyle w:val="Hyperlink"/>
+          </w:rPr>
+          <w:t xml:space="preserve">https://pci-ids.ucw.cz/read/PC/10de</w:t>
+        </w:r>
+      </w:hyperlink>
+      <w:r>
+        <w:t xml:space="preserve"> </w:t>
+      </w:r>
+      <w:r>
+        <w:t xml:space="preserve">if Windows shows only</w:t>
+      </w:r>
+      <w:r>
+        <w:t xml:space="preserve"> </w:t>
+      </w:r>
+      <w:r>
+        <w:t xml:space="preserve">“</w:t>
+      </w:r>
+      <w:r>
+        <w:t xml:space="preserve">Microsoft Basic Display Adapter</w:t>
+      </w:r>
+      <w:r>
+        <w:t xml:space="preserve">”</w:t>
+      </w:r>
+      <w:r>
+        <w:t xml:space="preserve"> </w:t>
+      </w:r>
+      <w:r>
+        <w:t xml:space="preserve">(i.e. no driver yet).</w:t>
+      </w:r>
+    </w:p>
+    <w:bookmarkEnd w:id="21"/>
+    <w:bookmarkStart w:id="23" w:name="look-up-the-compute-capability"/>
+    <w:p>
+      <w:pPr>
+        <w:pStyle w:val="Heading3"/>
+      </w:pPr>
+      <w:r>
+        <w:t xml:space="preserve">1.2 Look up the compute capability</w:t>
+      </w:r>
+    </w:p>
+    <w:p>
+      <w:pPr>
+        <w:pStyle w:val="FirstParagraph"/>
+      </w:pPr>
+      <w:r>
+        <w:t xml:space="preserve">Once you have the model name, look it up at NVIDIA’s official list:</w:t>
+      </w:r>
+      <w:r>
+        <w:t xml:space="preserve"> </w:t>
+      </w:r>
+      <w:hyperlink r:id="rId22">
+        <w:r>
+          <w:rPr>
+            <w:rStyle w:val="Hyperlink"/>
+          </w:rPr>
+          <w:t xml:space="preserve">https://developer.nvidia.com/cuda-gpus</w:t>
+        </w:r>
+      </w:hyperlink>
+      <w:r>
+        <w:t xml:space="preserve">.</w:t>
+      </w:r>
+    </w:p>
+    <w:p>
+      <w:pPr>
+        <w:pStyle w:val="BodyText"/>
+      </w:pPr>
+      <w:r>
+        <w:t xml:space="preserve">You’ll get a</w:t>
+      </w:r>
+      <w:r>
+        <w:t xml:space="preserve"> </w:t>
+      </w:r>
+      <w:r>
+        <w:rPr>
+          <w:bCs/>
+          <w:b/>
+        </w:rPr>
+        <w:t xml:space="preserve">compute capability</w:t>
+      </w:r>
+      <w:r>
+        <w:t xml:space="preserve"> </w:t>
+      </w:r>
+      <w:r>
+        <w:t xml:space="preserve">number (like</w:t>
+      </w:r>
+      <w:r>
+        <w:t xml:space="preserve"> </w:t>
+      </w:r>
+      <w:r>
+        <w:rPr>
+          <w:rStyle w:val="VerbatimChar"/>
+        </w:rPr>
+        <w:t xml:space="preserve">8.9</w:t>
+      </w:r>
+      <w:r>
+        <w:t xml:space="preserve">). The integer form (</w:t>
+      </w:r>
+      <w:r>
+        <w:rPr>
+          <w:rStyle w:val="VerbatimChar"/>
+        </w:rPr>
+        <w:t xml:space="preserve">89</w:t>
+      </w:r>
+      <w:r>
+        <w:t xml:space="preserve">) is what you pass to CMake as</w:t>
+      </w:r>
+      <w:r>
+        <w:t xml:space="preserve"> </w:t>
+      </w:r>
+      <w:r>
+        <w:rPr>
+          <w:rStyle w:val="VerbatimChar"/>
+        </w:rPr>
+        <w:t xml:space="preserve">-DCMAKE_CUDA_ARCHITECTURES=89</w:t>
+      </w:r>
+      <w:r>
+        <w:t xml:space="preserve">.</w:t>
+      </w:r>
+    </w:p>
+    <w:p>
+      <w:pPr>
+        <w:pStyle w:val="BodyText"/>
+      </w:pPr>
+      <w:r>
+        <w:t xml:space="preserve">Quick reference for common laptop GPUs you might see in 2026:</w:t>
       </w:r>
     </w:p>
     <w:tbl>
@@ -152,8 +1068,10 @@
         <w:jc w:val="start"/>
       </w:tblPr>
       <w:tblGrid>
-        <w:gridCol w:w="3960"/>
-        <w:gridCol w:w="3960"/>
+        <w:gridCol w:w="1980"/>
+        <w:gridCol w:w="1980"/>
+        <w:gridCol w:w="1980"/>
+        <w:gridCol w:w="1980"/>
       </w:tblGrid>
       <w:tr>
         <w:trPr>
@@ -167,19 +1085,43 @@
               <w:jc w:val="left"/>
             </w:pPr>
             <w:r>
-              <w:t xml:space="preserve">Question</w:t>
-            </w:r>
-          </w:p>
-        </w:tc>
-        <w:tc>
-          <w:tcPr/>
-          <w:p>
-            <w:pPr>
-              <w:pStyle w:val="Compact"/>
-              <w:jc w:val="left"/>
-            </w:pPr>
-            <w:r>
-              <w:t xml:space="preserve">Answer</w:t>
+              <w:t xml:space="preserve">Marketing name</w:t>
+            </w:r>
+          </w:p>
+        </w:tc>
+        <w:tc>
+          <w:tcPr/>
+          <w:p>
+            <w:pPr>
+              <w:pStyle w:val="Compact"/>
+              <w:jc w:val="left"/>
+            </w:pPr>
+            <w:r>
+              <w:t xml:space="preserve">Architecture</w:t>
+            </w:r>
+          </w:p>
+        </w:tc>
+        <w:tc>
+          <w:tcPr/>
+          <w:p>
+            <w:pPr>
+              <w:pStyle w:val="Compact"/>
+              <w:jc w:val="left"/>
+            </w:pPr>
+            <w:r>
+              <w:t xml:space="preserve">Compute capability</w:t>
+            </w:r>
+          </w:p>
+        </w:tc>
+        <w:tc>
+          <w:tcPr/>
+          <w:p>
+            <w:pPr>
+              <w:pStyle w:val="Compact"/>
+              <w:jc w:val="left"/>
+            </w:pPr>
+            <w:r>
+              <w:t xml:space="preserve">Driver-support status</w:t>
             </w:r>
           </w:p>
         </w:tc>
@@ -193,87 +1135,40 @@
               <w:jc w:val="left"/>
             </w:pPr>
             <w:r>
-              <w:t xml:space="preserve">Which GPU?</w:t>
-            </w:r>
-          </w:p>
-        </w:tc>
-        <w:tc>
-          <w:tcPr/>
-          <w:p>
-            <w:pPr>
-              <w:pStyle w:val="Compact"/>
-              <w:jc w:val="left"/>
-            </w:pPr>
-            <w:r>
-              <w:t xml:space="preserve">Run</w:t>
-            </w:r>
-            <w:r>
-              <w:t xml:space="preserve"> </w:t>
-            </w:r>
+              <w:t xml:space="preserve">GTX 9-series Mobile (940M, 950M, 960M…)</w:t>
+            </w:r>
+          </w:p>
+        </w:tc>
+        <w:tc>
+          <w:tcPr/>
+          <w:p>
+            <w:pPr>
+              <w:pStyle w:val="Compact"/>
+              <w:jc w:val="left"/>
+            </w:pPr>
+            <w:r>
+              <w:t xml:space="preserve">Maxwell</w:t>
+            </w:r>
+          </w:p>
+        </w:tc>
+        <w:tc>
+          <w:tcPr/>
+          <w:p>
+            <w:pPr>
+              <w:pStyle w:val="Compact"/>
+              <w:jc w:val="left"/>
+            </w:pPr>
             <w:r>
               <w:rPr>
                 <w:rStyle w:val="VerbatimChar"/>
               </w:rPr>
-              <w:t xml:space="preserve">nvidia-smi</w:t>
+              <w:t xml:space="preserve">5.0</w:t>
             </w:r>
             <w:r>
               <w:t xml:space="preserve"> </w:t>
             </w:r>
             <w:r>
-              <w:t xml:space="preserve">(after driver install) or look in</w:t>
-            </w:r>
-            <w:r>
-              <w:t xml:space="preserve"> </w:t>
-            </w:r>
-            <w:r>
-              <w:rPr>
-                <w:iCs/>
-                <w:i/>
-              </w:rPr>
-              <w:t xml:space="preserve">Device Manager → Display adapters</w:t>
-            </w:r>
-            <w:r>
-              <w:t xml:space="preserve">.</w:t>
-            </w:r>
-          </w:p>
-        </w:tc>
-      </w:tr>
-      <w:tr>
-        <w:tc>
-          <w:tcPr/>
-          <w:p>
-            <w:pPr>
-              <w:pStyle w:val="Compact"/>
-              <w:jc w:val="left"/>
-            </w:pPr>
-            <w:r>
-              <w:t xml:space="preserve">Compute capability?</w:t>
-            </w:r>
-          </w:p>
-        </w:tc>
-        <w:tc>
-          <w:tcPr/>
-          <w:p>
-            <w:pPr>
-              <w:pStyle w:val="Compact"/>
-              <w:jc w:val="left"/>
-            </w:pPr>
-            <w:r>
-              <w:t xml:space="preserve">Look up your card at</w:t>
-            </w:r>
-            <w:r>
-              <w:t xml:space="preserve"> </w:t>
-            </w:r>
-            <w:hyperlink r:id="rId20">
-              <w:r>
-                <w:rPr>
-                  <w:rStyle w:val="Hyperlink"/>
-                </w:rPr>
-                <w:t xml:space="preserve">https://developer.nvidia.com/cuda-gpus</w:t>
-              </w:r>
-            </w:hyperlink>
-            <w:r>
-              <w:t xml:space="preserve">. Common laptop values: Turing</w:t>
+              <w:t xml:space="preserve">/</w:t>
             </w:r>
             <w:r>
               <w:t xml:space="preserve"> </w:t>
@@ -282,46 +1177,217 @@
               <w:rPr>
                 <w:rStyle w:val="VerbatimChar"/>
               </w:rPr>
-              <w:t xml:space="preserve">75</w:t>
-            </w:r>
-            <w:r>
-              <w:t xml:space="preserve">, Ampere</w:t>
+              <w:t xml:space="preserve">5.2</w:t>
+            </w:r>
+          </w:p>
+        </w:tc>
+        <w:tc>
+          <w:tcPr/>
+          <w:p>
+            <w:pPr>
+              <w:pStyle w:val="Compact"/>
+              <w:jc w:val="left"/>
+            </w:pPr>
+            <w:r>
+              <w:rPr>
+                <w:bCs/>
+                <w:b/>
+              </w:rPr>
+              <w:t xml:space="preserve">Legacy</w:t>
             </w:r>
             <w:r>
               <w:t xml:space="preserve"> </w:t>
             </w:r>
+            <w:r>
+              <w:t xml:space="preserve">— supported only by the 470 LTS driver. CUDA 12 dropped Maxwell.</w:t>
+            </w:r>
+          </w:p>
+        </w:tc>
+      </w:tr>
+      <w:tr>
+        <w:tc>
+          <w:tcPr/>
+          <w:p>
+            <w:pPr>
+              <w:pStyle w:val="Compact"/>
+              <w:jc w:val="left"/>
+            </w:pPr>
+            <w:r>
+              <w:t xml:space="preserve">GTX 10-series Mobile (1050, 1050 Ti, 1060, 1070, 1080)</w:t>
+            </w:r>
+          </w:p>
+        </w:tc>
+        <w:tc>
+          <w:tcPr/>
+          <w:p>
+            <w:pPr>
+              <w:pStyle w:val="Compact"/>
+              <w:jc w:val="left"/>
+            </w:pPr>
+            <w:r>
+              <w:t xml:space="preserve">Pascal</w:t>
+            </w:r>
+          </w:p>
+        </w:tc>
+        <w:tc>
+          <w:tcPr/>
+          <w:p>
+            <w:pPr>
+              <w:pStyle w:val="Compact"/>
+              <w:jc w:val="left"/>
+            </w:pPr>
             <w:r>
               <w:rPr>
                 <w:rStyle w:val="VerbatimChar"/>
               </w:rPr>
-              <w:t xml:space="preserve">86</w:t>
-            </w:r>
-            <w:r>
-              <w:t xml:space="preserve">, Ada</w:t>
+              <w:t xml:space="preserve">6.1</w:t>
+            </w:r>
+          </w:p>
+        </w:tc>
+        <w:tc>
+          <w:tcPr/>
+          <w:p>
+            <w:pPr>
+              <w:pStyle w:val="Compact"/>
+              <w:jc w:val="left"/>
+            </w:pPr>
+            <w:r>
+              <w:t xml:space="preserve">Supported through driver branch</w:t>
             </w:r>
             <w:r>
               <w:t xml:space="preserve"> </w:t>
             </w:r>
+            <w:r>
+              <w:rPr>
+                <w:bCs/>
+                <w:b/>
+              </w:rPr>
+              <w:t xml:space="preserve">580</w:t>
+            </w:r>
+            <w:r>
+              <w:t xml:space="preserve"> </w:t>
+            </w:r>
+            <w:r>
+              <w:t xml:space="preserve">(LTS);</w:t>
+            </w:r>
+            <w:r>
+              <w:t xml:space="preserve"> </w:t>
+            </w:r>
+            <w:r>
+              <w:rPr>
+                <w:bCs/>
+                <w:b/>
+              </w:rPr>
+              <w:t xml:space="preserve">dropped in 590+</w:t>
+            </w:r>
+            <w:r>
+              <w:t xml:space="preserve">. CUDA 13 dropped Pascal — stay on CUDA 12.x.</w:t>
+            </w:r>
+          </w:p>
+        </w:tc>
+      </w:tr>
+      <w:tr>
+        <w:tc>
+          <w:tcPr/>
+          <w:p>
+            <w:pPr>
+              <w:pStyle w:val="Compact"/>
+              <w:jc w:val="left"/>
+            </w:pPr>
+            <w:r>
+              <w:t xml:space="preserve">MX 150 / 250 / 350</w:t>
+            </w:r>
+          </w:p>
+        </w:tc>
+        <w:tc>
+          <w:tcPr/>
+          <w:p>
+            <w:pPr>
+              <w:pStyle w:val="Compact"/>
+              <w:jc w:val="left"/>
+            </w:pPr>
+            <w:r>
+              <w:t xml:space="preserve">Pascal</w:t>
+            </w:r>
+          </w:p>
+        </w:tc>
+        <w:tc>
+          <w:tcPr/>
+          <w:p>
+            <w:pPr>
+              <w:pStyle w:val="Compact"/>
+              <w:jc w:val="left"/>
+            </w:pPr>
             <w:r>
               <w:rPr>
                 <w:rStyle w:val="VerbatimChar"/>
               </w:rPr>
-              <w:t xml:space="preserve">89</w:t>
-            </w:r>
-            <w:r>
-              <w:t xml:space="preserve">, Blackwell</w:t>
-            </w:r>
-            <w:r>
-              <w:t xml:space="preserve"> </w:t>
-            </w:r>
+              <w:t xml:space="preserve">6.1</w:t>
+            </w:r>
+          </w:p>
+        </w:tc>
+        <w:tc>
+          <w:tcPr/>
+          <w:p>
+            <w:pPr>
+              <w:pStyle w:val="Compact"/>
+              <w:jc w:val="left"/>
+            </w:pPr>
+            <w:r>
+              <w:t xml:space="preserve">Same as above.</w:t>
+            </w:r>
+          </w:p>
+        </w:tc>
+      </w:tr>
+      <w:tr>
+        <w:tc>
+          <w:tcPr/>
+          <w:p>
+            <w:pPr>
+              <w:pStyle w:val="Compact"/>
+              <w:jc w:val="left"/>
+            </w:pPr>
+            <w:r>
+              <w:t xml:space="preserve">GTX 16-series (1650, 1660 Ti Mobile)</w:t>
+            </w:r>
+          </w:p>
+        </w:tc>
+        <w:tc>
+          <w:tcPr/>
+          <w:p>
+            <w:pPr>
+              <w:pStyle w:val="Compact"/>
+              <w:jc w:val="left"/>
+            </w:pPr>
+            <w:r>
+              <w:t xml:space="preserve">Turing</w:t>
+            </w:r>
+          </w:p>
+        </w:tc>
+        <w:tc>
+          <w:tcPr/>
+          <w:p>
+            <w:pPr>
+              <w:pStyle w:val="Compact"/>
+              <w:jc w:val="left"/>
+            </w:pPr>
             <w:r>
               <w:rPr>
                 <w:rStyle w:val="VerbatimChar"/>
               </w:rPr>
-              <w:t xml:space="preserve">120</w:t>
-            </w:r>
-            <w:r>
-              <w:t xml:space="preserve">.</w:t>
+              <w:t xml:space="preserve">7.5</w:t>
+            </w:r>
+          </w:p>
+        </w:tc>
+        <w:tc>
+          <w:tcPr/>
+          <w:p>
+            <w:pPr>
+              <w:pStyle w:val="Compact"/>
+              <w:jc w:val="left"/>
+            </w:pPr>
+            <w:r>
+              <w:t xml:space="preserve">Fully supported, current.</w:t>
             </w:r>
           </w:p>
         </w:tc>
@@ -335,19 +1401,46 @@
               <w:jc w:val="left"/>
             </w:pPr>
             <w:r>
-              <w:t xml:space="preserve">Disk space?</w:t>
-            </w:r>
-          </w:p>
-        </w:tc>
-        <w:tc>
-          <w:tcPr/>
-          <w:p>
-            <w:pPr>
-              <w:pStyle w:val="Compact"/>
-              <w:jc w:val="left"/>
-            </w:pPr>
-            <w:r>
-              <w:t xml:space="preserve">~10 GB total — VS Build Tools alone is ~6 GB; CUDA toolkit ~3 GB.</w:t>
+              <w:t xml:space="preserve">RTX 20-series Mobile (2060, 2070, 2080)</w:t>
+            </w:r>
+          </w:p>
+        </w:tc>
+        <w:tc>
+          <w:tcPr/>
+          <w:p>
+            <w:pPr>
+              <w:pStyle w:val="Compact"/>
+              <w:jc w:val="left"/>
+            </w:pPr>
+            <w:r>
+              <w:t xml:space="preserve">Turing</w:t>
+            </w:r>
+          </w:p>
+        </w:tc>
+        <w:tc>
+          <w:tcPr/>
+          <w:p>
+            <w:pPr>
+              <w:pStyle w:val="Compact"/>
+              <w:jc w:val="left"/>
+            </w:pPr>
+            <w:r>
+              <w:rPr>
+                <w:rStyle w:val="VerbatimChar"/>
+              </w:rPr>
+              <w:t xml:space="preserve">7.5</w:t>
+            </w:r>
+          </w:p>
+        </w:tc>
+        <w:tc>
+          <w:tcPr/>
+          <w:p>
+            <w:pPr>
+              <w:pStyle w:val="Compact"/>
+              <w:jc w:val="left"/>
+            </w:pPr>
+            <w:r>
+              <w:t xml:space="preserve">Fully supported, current.</w:t>
             </w:r>
           </w:p>
         </w:tc>
@@ -361,19 +1454,46 @@
               <w:jc w:val="left"/>
             </w:pPr>
             <w:r>
-              <w:t xml:space="preserve">Admin?</w:t>
-            </w:r>
-          </w:p>
-        </w:tc>
-        <w:tc>
-          <w:tcPr/>
-          <w:p>
-            <w:pPr>
-              <w:pStyle w:val="Compact"/>
-              <w:jc w:val="left"/>
-            </w:pPr>
-            <w:r>
-              <w:t xml:space="preserve">Yes — installer needs to install drivers and put MSVC into Program Files.</w:t>
+              <w:t xml:space="preserve">MX 450 / 550</w:t>
+            </w:r>
+          </w:p>
+        </w:tc>
+        <w:tc>
+          <w:tcPr/>
+          <w:p>
+            <w:pPr>
+              <w:pStyle w:val="Compact"/>
+              <w:jc w:val="left"/>
+            </w:pPr>
+            <w:r>
+              <w:t xml:space="preserve">Turing</w:t>
+            </w:r>
+          </w:p>
+        </w:tc>
+        <w:tc>
+          <w:tcPr/>
+          <w:p>
+            <w:pPr>
+              <w:pStyle w:val="Compact"/>
+              <w:jc w:val="left"/>
+            </w:pPr>
+            <w:r>
+              <w:rPr>
+                <w:rStyle w:val="VerbatimChar"/>
+              </w:rPr>
+              <w:t xml:space="preserve">7.5</w:t>
+            </w:r>
+          </w:p>
+        </w:tc>
+        <w:tc>
+          <w:tcPr/>
+          <w:p>
+            <w:pPr>
+              <w:pStyle w:val="Compact"/>
+              <w:jc w:val="left"/>
+            </w:pPr>
+            <w:r>
+              <w:t xml:space="preserve">Fully supported.</w:t>
             </w:r>
           </w:p>
         </w:tc>
@@ -387,39 +1507,193 @@
               <w:jc w:val="left"/>
             </w:pPr>
             <w:r>
-              <w:t xml:space="preserve">Internet?</w:t>
-            </w:r>
-          </w:p>
-        </w:tc>
-        <w:tc>
-          <w:tcPr/>
-          <w:p>
-            <w:pPr>
-              <w:pStyle w:val="Compact"/>
-              <w:jc w:val="left"/>
-            </w:pPr>
-            <w:r>
-              <w:t xml:space="preserve">Yes — winget pulls everything from official sources.</w:t>
+              <w:t xml:space="preserve">RTX 30-series Mobile (3050, 3060, 3070, 3080 Ti…)</w:t>
+            </w:r>
+          </w:p>
+        </w:tc>
+        <w:tc>
+          <w:tcPr/>
+          <w:p>
+            <w:pPr>
+              <w:pStyle w:val="Compact"/>
+              <w:jc w:val="left"/>
+            </w:pPr>
+            <w:r>
+              <w:t xml:space="preserve">Ampere</w:t>
+            </w:r>
+          </w:p>
+        </w:tc>
+        <w:tc>
+          <w:tcPr/>
+          <w:p>
+            <w:pPr>
+              <w:pStyle w:val="Compact"/>
+              <w:jc w:val="left"/>
+            </w:pPr>
+            <w:r>
+              <w:rPr>
+                <w:rStyle w:val="VerbatimChar"/>
+              </w:rPr>
+              <w:t xml:space="preserve">8.6</w:t>
+            </w:r>
+          </w:p>
+        </w:tc>
+        <w:tc>
+          <w:tcPr/>
+          <w:p>
+            <w:pPr>
+              <w:pStyle w:val="Compact"/>
+              <w:jc w:val="left"/>
+            </w:pPr>
+            <w:r>
+              <w:t xml:space="preserve">Fully supported, current.</w:t>
+            </w:r>
+          </w:p>
+        </w:tc>
+      </w:tr>
+      <w:tr>
+        <w:tc>
+          <w:tcPr/>
+          <w:p>
+            <w:pPr>
+              <w:pStyle w:val="Compact"/>
+              <w:jc w:val="left"/>
+            </w:pPr>
+            <w:r>
+              <w:t xml:space="preserve">RTX 40-series Mobile (4050, 4060, 4070, 4080, 4090)</w:t>
+            </w:r>
+          </w:p>
+        </w:tc>
+        <w:tc>
+          <w:tcPr/>
+          <w:p>
+            <w:pPr>
+              <w:pStyle w:val="Compact"/>
+              <w:jc w:val="left"/>
+            </w:pPr>
+            <w:r>
+              <w:t xml:space="preserve">Ada Lovelace</w:t>
+            </w:r>
+          </w:p>
+        </w:tc>
+        <w:tc>
+          <w:tcPr/>
+          <w:p>
+            <w:pPr>
+              <w:pStyle w:val="Compact"/>
+              <w:jc w:val="left"/>
+            </w:pPr>
+            <w:r>
+              <w:rPr>
+                <w:rStyle w:val="VerbatimChar"/>
+              </w:rPr>
+              <w:t xml:space="preserve">8.9</w:t>
+            </w:r>
+          </w:p>
+        </w:tc>
+        <w:tc>
+          <w:tcPr/>
+          <w:p>
+            <w:pPr>
+              <w:pStyle w:val="Compact"/>
+              <w:jc w:val="left"/>
+            </w:pPr>
+            <w:r>
+              <w:t xml:space="preserve">Fully supported, current.</w:t>
+            </w:r>
+          </w:p>
+        </w:tc>
+      </w:tr>
+      <w:tr>
+        <w:tc>
+          <w:tcPr/>
+          <w:p>
+            <w:pPr>
+              <w:pStyle w:val="Compact"/>
+              <w:jc w:val="left"/>
+            </w:pPr>
+            <w:r>
+              <w:t xml:space="preserve">RTX 50-series Mobile (5060, 5070, 5080, 5090)</w:t>
+            </w:r>
+          </w:p>
+        </w:tc>
+        <w:tc>
+          <w:tcPr/>
+          <w:p>
+            <w:pPr>
+              <w:pStyle w:val="Compact"/>
+              <w:jc w:val="left"/>
+            </w:pPr>
+            <w:r>
+              <w:t xml:space="preserve">Blackwell</w:t>
+            </w:r>
+          </w:p>
+        </w:tc>
+        <w:tc>
+          <w:tcPr/>
+          <w:p>
+            <w:pPr>
+              <w:pStyle w:val="Compact"/>
+              <w:jc w:val="left"/>
+            </w:pPr>
+            <w:r>
+              <w:rPr>
+                <w:rStyle w:val="VerbatimChar"/>
+              </w:rPr>
+              <w:t xml:space="preserve">12.0</w:t>
+            </w:r>
+          </w:p>
+        </w:tc>
+        <w:tc>
+          <w:tcPr/>
+          <w:p>
+            <w:pPr>
+              <w:pStyle w:val="Compact"/>
+              <w:jc w:val="left"/>
+            </w:pPr>
+            <w:r>
+              <w:t xml:space="preserve">Fully supported, requires recent driver (≥570) and CUDA ≥12.8.</w:t>
             </w:r>
           </w:p>
         </w:tc>
       </w:tr>
     </w:tbl>
     <w:p>
-      <w:r>
-        <w:pict>
-          <v:rect style="width:0;height:1.5pt" o:hralign="center" o:hrstd="t" o:hr="t"/>
-        </w:pict>
-      </w:r>
-    </w:p>
-    <w:bookmarkEnd w:id="21"/>
-    <w:bookmarkStart w:id="22" w:name="recommended-stack"/>
-    <w:p>
-      <w:pPr>
-        <w:pStyle w:val="Heading2"/>
-      </w:pPr>
-      <w:r>
-        <w:t xml:space="preserve">2. Recommended stack</w:t>
+      <w:pPr>
+        <w:pStyle w:val="BodyText"/>
+      </w:pPr>
+      <w:r>
+        <w:t xml:space="preserve">If your card isn’t in this short list, the official page above is authoritative.</w:t>
+      </w:r>
+    </w:p>
+    <w:bookmarkEnd w:id="23"/>
+    <w:bookmarkStart w:id="24" w:name="is-your-gpu-still-supported"/>
+    <w:p>
+      <w:pPr>
+        <w:pStyle w:val="Heading3"/>
+      </w:pPr>
+      <w:r>
+        <w:t xml:space="preserve">1.3 Is your GPU still supported?</w:t>
+      </w:r>
+    </w:p>
+    <w:p>
+      <w:pPr>
+        <w:pStyle w:val="FirstParagraph"/>
+      </w:pPr>
+      <w:r>
+        <w:t xml:space="preserve">Two questions to answer:</w:t>
+      </w:r>
+    </w:p>
+    <w:p>
+      <w:pPr>
+        <w:pStyle w:val="BodyText"/>
+      </w:pPr>
+      <w:r>
+        <w:rPr>
+          <w:bCs/>
+          <w:b/>
+        </w:rPr>
+        <w:t xml:space="preserve">A. Is the architecture supported by the current driver branches?</w:t>
       </w:r>
     </w:p>
     <w:tbl>
@@ -446,6 +1720,945 @@
               <w:jc w:val="left"/>
             </w:pPr>
             <w:r>
+              <w:t xml:space="preserve">Architecture</w:t>
+            </w:r>
+          </w:p>
+        </w:tc>
+        <w:tc>
+          <w:tcPr/>
+          <w:p>
+            <w:pPr>
+              <w:pStyle w:val="Compact"/>
+              <w:jc w:val="left"/>
+            </w:pPr>
+            <w:r>
+              <w:t xml:space="preserve">Current driver support (2026)</w:t>
+            </w:r>
+          </w:p>
+        </w:tc>
+        <w:tc>
+          <w:tcPr/>
+          <w:p>
+            <w:pPr>
+              <w:pStyle w:val="Compact"/>
+              <w:jc w:val="left"/>
+            </w:pPr>
+            <w:r>
+              <w:t xml:space="preserve">What this means for you</w:t>
+            </w:r>
+          </w:p>
+        </w:tc>
+      </w:tr>
+      <w:tr>
+        <w:tc>
+          <w:tcPr/>
+          <w:p>
+            <w:pPr>
+              <w:pStyle w:val="Compact"/>
+              <w:jc w:val="left"/>
+            </w:pPr>
+            <w:r>
+              <w:t xml:space="preserve">Kepler (older 6/7-series)</w:t>
+            </w:r>
+          </w:p>
+        </w:tc>
+        <w:tc>
+          <w:tcPr/>
+          <w:p>
+            <w:pPr>
+              <w:pStyle w:val="Compact"/>
+              <w:jc w:val="left"/>
+            </w:pPr>
+            <w:r>
+              <w:t xml:space="preserve">None — last in driver 470 (legacy, 2024 EOL)</w:t>
+            </w:r>
+          </w:p>
+        </w:tc>
+        <w:tc>
+          <w:tcPr/>
+          <w:p>
+            <w:pPr>
+              <w:pStyle w:val="Compact"/>
+              <w:jc w:val="left"/>
+            </w:pPr>
+            <w:r>
+              <w:t xml:space="preserve">CUDA dev not practical; consider CPU-only or upgrade hardware.</w:t>
+            </w:r>
+          </w:p>
+        </w:tc>
+      </w:tr>
+      <w:tr>
+        <w:tc>
+          <w:tcPr/>
+          <w:p>
+            <w:pPr>
+              <w:pStyle w:val="Compact"/>
+              <w:jc w:val="left"/>
+            </w:pPr>
+            <w:r>
+              <w:t xml:space="preserve">Maxwell</w:t>
+            </w:r>
+          </w:p>
+        </w:tc>
+        <w:tc>
+          <w:tcPr/>
+          <w:p>
+            <w:pPr>
+              <w:pStyle w:val="Compact"/>
+              <w:jc w:val="left"/>
+            </w:pPr>
+            <w:r>
+              <w:t xml:space="preserve">Driver 470 LTS only</w:t>
+            </w:r>
+          </w:p>
+        </w:tc>
+        <w:tc>
+          <w:tcPr/>
+          <w:p>
+            <w:pPr>
+              <w:pStyle w:val="Compact"/>
+              <w:jc w:val="left"/>
+            </w:pPr>
+            <w:r>
+              <w:t xml:space="preserve">OK for legacy CUDA 11.x. Skip CUDA 12+.</w:t>
+            </w:r>
+          </w:p>
+        </w:tc>
+      </w:tr>
+      <w:tr>
+        <w:tc>
+          <w:tcPr/>
+          <w:p>
+            <w:pPr>
+              <w:pStyle w:val="Compact"/>
+              <w:jc w:val="left"/>
+            </w:pPr>
+            <w:r>
+              <w:rPr>
+                <w:bCs/>
+                <w:b/>
+              </w:rPr>
+              <w:t xml:space="preserve">Pascal</w:t>
+            </w:r>
+            <w:r>
+              <w:t xml:space="preserve"> </w:t>
+            </w:r>
+            <w:r>
+              <w:t xml:space="preserve">(10-series)</w:t>
+            </w:r>
+          </w:p>
+        </w:tc>
+        <w:tc>
+          <w:tcPr/>
+          <w:p>
+            <w:pPr>
+              <w:pStyle w:val="Compact"/>
+              <w:jc w:val="left"/>
+            </w:pPr>
+            <w:r>
+              <w:t xml:space="preserve">Driver branches 535–580 (580 is LTS through ~2028);</w:t>
+            </w:r>
+            <w:r>
+              <w:t xml:space="preserve"> </w:t>
+            </w:r>
+            <w:r>
+              <w:rPr>
+                <w:bCs/>
+                <w:b/>
+              </w:rPr>
+              <w:t xml:space="preserve">dropped in 590+</w:t>
+            </w:r>
+          </w:p>
+        </w:tc>
+        <w:tc>
+          <w:tcPr/>
+          <w:p>
+            <w:pPr>
+              <w:pStyle w:val="Compact"/>
+              <w:jc w:val="left"/>
+            </w:pPr>
+            <w:r>
+              <w:t xml:space="preserve">Use CUDA 12.x and pin to driver ≤580.</w:t>
+            </w:r>
+          </w:p>
+        </w:tc>
+      </w:tr>
+      <w:tr>
+        <w:tc>
+          <w:tcPr/>
+          <w:p>
+            <w:pPr>
+              <w:pStyle w:val="Compact"/>
+              <w:jc w:val="left"/>
+            </w:pPr>
+            <w:r>
+              <w:t xml:space="preserve">Turing, Ampere, Ada, Hopper, Blackwell</w:t>
+            </w:r>
+          </w:p>
+        </w:tc>
+        <w:tc>
+          <w:tcPr/>
+          <w:p>
+            <w:pPr>
+              <w:pStyle w:val="Compact"/>
+              <w:jc w:val="left"/>
+            </w:pPr>
+            <w:r>
+              <w:t xml:space="preserve">All current branches</w:t>
+            </w:r>
+          </w:p>
+        </w:tc>
+        <w:tc>
+          <w:tcPr/>
+          <w:p>
+            <w:pPr>
+              <w:pStyle w:val="Compact"/>
+              <w:jc w:val="left"/>
+            </w:pPr>
+            <w:r>
+              <w:t xml:space="preserve">No restrictions; use the latest CUDA.</w:t>
+            </w:r>
+          </w:p>
+        </w:tc>
+      </w:tr>
+    </w:tbl>
+    <w:p>
+      <w:pPr>
+        <w:pStyle w:val="BodyText"/>
+      </w:pPr>
+      <w:r>
+        <w:rPr>
+          <w:bCs/>
+          <w:b/>
+        </w:rPr>
+        <w:t xml:space="preserve">B. Is it CUDA-capable at all?</w:t>
+      </w:r>
+    </w:p>
+    <w:p>
+      <w:pPr>
+        <w:pStyle w:val="BodyText"/>
+      </w:pPr>
+      <w:r>
+        <w:t xml:space="preserve">Almost every GeForce, Quadro, RTX, and Tesla card from the last decade is. The exceptions are GeForce</w:t>
+      </w:r>
+      <w:r>
+        <w:t xml:space="preserve"> </w:t>
+      </w:r>
+      <w:r>
+        <w:rPr>
+          <w:bCs/>
+          <w:b/>
+        </w:rPr>
+        <w:t xml:space="preserve">MX 110/130</w:t>
+      </w:r>
+      <w:r>
+        <w:t xml:space="preserve"> </w:t>
+      </w:r>
+      <w:r>
+        <w:t xml:space="preserve">rebranded older Maxwell parts and very old GT-series chips. The list at</w:t>
+      </w:r>
+      <w:r>
+        <w:t xml:space="preserve"> </w:t>
+      </w:r>
+      <w:hyperlink r:id="rId22">
+        <w:r>
+          <w:rPr>
+            <w:rStyle w:val="Hyperlink"/>
+          </w:rPr>
+          <w:t xml:space="preserve">https://developer.nvidia.com/cuda-gpus</w:t>
+        </w:r>
+      </w:hyperlink>
+      <w:r>
+        <w:t xml:space="preserve"> </w:t>
+      </w:r>
+      <w:r>
+        <w:t xml:space="preserve">is definitive — if your card is listed, CUDA works on it.</w:t>
+      </w:r>
+    </w:p>
+    <w:bookmarkEnd w:id="24"/>
+    <w:bookmarkStart w:id="25" w:name="X4dc23d3b7ca0f481bdc3b52f7c012710a97d29c"/>
+    <w:p>
+      <w:pPr>
+        <w:pStyle w:val="Heading3"/>
+      </w:pPr>
+      <w:r>
+        <w:t xml:space="preserve">1.4 Hybrid graphics (NVIDIA Optimus) — laptops only</w:t>
+      </w:r>
+    </w:p>
+    <w:p>
+      <w:pPr>
+        <w:pStyle w:val="FirstParagraph"/>
+      </w:pPr>
+      <w:r>
+        <w:t xml:space="preserve">This trips up almost everyone the first time. Most NVIDIA laptops have</w:t>
+      </w:r>
+      <w:r>
+        <w:t xml:space="preserve"> </w:t>
+      </w:r>
+      <w:r>
+        <w:rPr>
+          <w:bCs/>
+          <w:b/>
+        </w:rPr>
+        <w:t xml:space="preserve">two</w:t>
+      </w:r>
+      <w:r>
+        <w:t xml:space="preserve"> </w:t>
+      </w:r>
+      <w:r>
+        <w:t xml:space="preserve">GPUs:</w:t>
+      </w:r>
+      <w:r>
+        <w:t xml:space="preserve"> </w:t>
+      </w:r>
+      <w:r>
+        <w:t xml:space="preserve">- An</w:t>
+      </w:r>
+      <w:r>
+        <w:t xml:space="preserve"> </w:t>
+      </w:r>
+      <w:r>
+        <w:rPr>
+          <w:bCs/>
+          <w:b/>
+        </w:rPr>
+        <w:t xml:space="preserve">integrated GPU</w:t>
+      </w:r>
+      <w:r>
+        <w:t xml:space="preserve"> </w:t>
+      </w:r>
+      <w:r>
+        <w:t xml:space="preserve">(Intel Iris Xe or AMD Radeon Graphics) that drives the desktop and runs background apps to save battery.</w:t>
+      </w:r>
+      <w:r>
+        <w:t xml:space="preserve"> </w:t>
+      </w:r>
+      <w:r>
+        <w:t xml:space="preserve">- A</w:t>
+      </w:r>
+      <w:r>
+        <w:t xml:space="preserve"> </w:t>
+      </w:r>
+      <w:r>
+        <w:rPr>
+          <w:bCs/>
+          <w:b/>
+        </w:rPr>
+        <w:t xml:space="preserve">discrete NVIDIA GPU</w:t>
+      </w:r>
+      <w:r>
+        <w:t xml:space="preserve"> </w:t>
+      </w:r>
+      <w:r>
+        <w:t xml:space="preserve">that activates only for graphics-heavy or compute apps.</w:t>
+      </w:r>
+    </w:p>
+    <w:p>
+      <w:pPr>
+        <w:pStyle w:val="BodyText"/>
+      </w:pPr>
+      <w:r>
+        <w:t xml:space="preserve">Implications for CUDA:</w:t>
+      </w:r>
+    </w:p>
+    <w:p>
+      <w:pPr>
+        <w:numPr>
+          <w:ilvl w:val="0"/>
+          <w:numId w:val="1001"/>
+        </w:numPr>
+        <w:pStyle w:val="Compact"/>
+      </w:pPr>
+      <w:r>
+        <w:t xml:space="preserve">A CUDA program will use the discrete NVIDIA GPU automatically — that’s where the CUDA driver is. You don’t have to do anything special at runtime.</w:t>
+      </w:r>
+    </w:p>
+    <w:p>
+      <w:pPr>
+        <w:numPr>
+          <w:ilvl w:val="0"/>
+          <w:numId w:val="1001"/>
+        </w:numPr>
+        <w:pStyle w:val="Compact"/>
+      </w:pPr>
+      <w:r>
+        <w:t xml:space="preserve">But Windows may keep the discrete GPU</w:t>
+      </w:r>
+      <w:r>
+        <w:t xml:space="preserve"> </w:t>
+      </w:r>
+      <w:r>
+        <w:rPr>
+          <w:bCs/>
+          <w:b/>
+        </w:rPr>
+        <w:t xml:space="preserve">powered down</w:t>
+      </w:r>
+      <w:r>
+        <w:t xml:space="preserve"> </w:t>
+      </w:r>
+      <w:r>
+        <w:t xml:space="preserve">until something asks for it.</w:t>
+      </w:r>
+      <w:r>
+        <w:t xml:space="preserve"> </w:t>
+      </w:r>
+      <w:r>
+        <w:rPr>
+          <w:rStyle w:val="VerbatimChar"/>
+        </w:rPr>
+        <w:t xml:space="preserve">nvidia-smi</w:t>
+      </w:r>
+      <w:r>
+        <w:t xml:space="preserve"> </w:t>
+      </w:r>
+      <w:r>
+        <w:t xml:space="preserve">waking it up takes a second or two; that’s normal.</w:t>
+      </w:r>
+    </w:p>
+    <w:p>
+      <w:pPr>
+        <w:numPr>
+          <w:ilvl w:val="0"/>
+          <w:numId w:val="1001"/>
+        </w:numPr>
+        <w:pStyle w:val="Compact"/>
+      </w:pPr>
+      <w:r>
+        <w:t xml:space="preserve">Some IDEs / editors get pinned to the integrated GPU by Windows’ graphics preferences. If you want VS Code or Nsight to use the NVIDIA GPU (e.g. for hardware-accelerated rendering), set it manually:</w:t>
+      </w:r>
+      <w:r>
+        <w:t xml:space="preserve"> </w:t>
+      </w:r>
+      <w:r>
+        <w:rPr>
+          <w:iCs/>
+          <w:i/>
+        </w:rPr>
+        <w:t xml:space="preserve">Settings → System → Display → Graphics → Browse → pick the app → Options →</w:t>
+      </w:r>
+      <w:r>
+        <w:rPr>
+          <w:iCs/>
+          <w:i/>
+        </w:rPr>
+        <w:t xml:space="preserve"> </w:t>
+      </w:r>
+      <w:r>
+        <w:rPr>
+          <w:bCs/>
+          <w:b/>
+          <w:iCs/>
+          <w:i/>
+        </w:rPr>
+        <w:t xml:space="preserve">High performance</w:t>
+      </w:r>
+      <w:r>
+        <w:t xml:space="preserve">.</w:t>
+      </w:r>
+    </w:p>
+    <w:p>
+      <w:pPr>
+        <w:pStyle w:val="FirstParagraph"/>
+      </w:pPr>
+      <w:r>
+        <w:t xml:space="preserve">To</w:t>
+      </w:r>
+      <w:r>
+        <w:t xml:space="preserve"> </w:t>
+      </w:r>
+      <w:r>
+        <w:rPr>
+          <w:bCs/>
+          <w:b/>
+        </w:rPr>
+        <w:t xml:space="preserve">confirm both GPUs are visible</w:t>
+      </w:r>
+      <w:r>
+        <w:t xml:space="preserve"> </w:t>
+      </w:r>
+      <w:r>
+        <w:t xml:space="preserve">without installing the driver:</w:t>
+      </w:r>
+    </w:p>
+    <w:p>
+      <w:pPr>
+        <w:pStyle w:val="SourceCode"/>
+      </w:pPr>
+      <w:r>
+        <w:rPr>
+          <w:rStyle w:val="FunctionTok"/>
+        </w:rPr>
+        <w:t xml:space="preserve">Get-CimInstance</w:t>
+      </w:r>
+      <w:r>
+        <w:rPr>
+          <w:rStyle w:val="NormalTok"/>
+        </w:rPr>
+        <w:t xml:space="preserve"> Win32_VideoController </w:t>
+      </w:r>
+      <w:r>
+        <w:rPr>
+          <w:rStyle w:val="OperatorTok"/>
+        </w:rPr>
+        <w:t xml:space="preserve">|</w:t>
+      </w:r>
+      <w:r>
+        <w:rPr>
+          <w:rStyle w:val="NormalTok"/>
+        </w:rPr>
+        <w:t xml:space="preserve"> </w:t>
+      </w:r>
+      <w:r>
+        <w:rPr>
+          <w:rStyle w:val="FunctionTok"/>
+        </w:rPr>
+        <w:t xml:space="preserve">Select-Object</w:t>
+      </w:r>
+      <w:r>
+        <w:rPr>
+          <w:rStyle w:val="NormalTok"/>
+        </w:rPr>
+        <w:t xml:space="preserve"> Name</w:t>
+      </w:r>
+      <w:r>
+        <w:rPr>
+          <w:rStyle w:val="OperatorTok"/>
+        </w:rPr>
+        <w:t xml:space="preserve">,</w:t>
+      </w:r>
+      <w:r>
+        <w:rPr>
+          <w:rStyle w:val="NormalTok"/>
+        </w:rPr>
+        <w:t xml:space="preserve"> AdapterRAM</w:t>
+      </w:r>
+    </w:p>
+    <w:p>
+      <w:pPr>
+        <w:pStyle w:val="FirstParagraph"/>
+      </w:pPr>
+      <w:r>
+        <w:t xml:space="preserve">You should see two rows: one Intel/AMD, one NVIDIA. If you see only the integrated one, the NVIDIA part is either disabled in BIOS, broken, or this is a non-hybrid laptop.</w:t>
+      </w:r>
+    </w:p>
+    <w:p>
+      <w:pPr>
+        <w:pStyle w:val="BodyText"/>
+      </w:pPr>
+      <w:r>
+        <w:t xml:space="preserve">To</w:t>
+      </w:r>
+      <w:r>
+        <w:t xml:space="preserve"> </w:t>
+      </w:r>
+      <w:r>
+        <w:rPr>
+          <w:bCs/>
+          <w:b/>
+        </w:rPr>
+        <w:t xml:space="preserve">check BIOS</w:t>
+      </w:r>
+      <w:r>
+        <w:t xml:space="preserve"> </w:t>
+      </w:r>
+      <w:r>
+        <w:t xml:space="preserve">if the NVIDIA GPU is missing entirely: reboot, enter BIOS/UEFI setup (usually</w:t>
+      </w:r>
+      <w:r>
+        <w:t xml:space="preserve"> </w:t>
+      </w:r>
+      <w:r>
+        <w:rPr>
+          <w:rStyle w:val="VerbatimChar"/>
+        </w:rPr>
+        <w:t xml:space="preserve">F2</w:t>
+      </w:r>
+      <w:r>
+        <w:t xml:space="preserve">,</w:t>
+      </w:r>
+      <w:r>
+        <w:t xml:space="preserve"> </w:t>
+      </w:r>
+      <w:r>
+        <w:rPr>
+          <w:rStyle w:val="VerbatimChar"/>
+        </w:rPr>
+        <w:t xml:space="preserve">Del</w:t>
+      </w:r>
+      <w:r>
+        <w:t xml:space="preserve">, or</w:t>
+      </w:r>
+      <w:r>
+        <w:t xml:space="preserve"> </w:t>
+      </w:r>
+      <w:r>
+        <w:rPr>
+          <w:rStyle w:val="VerbatimChar"/>
+        </w:rPr>
+        <w:t xml:space="preserve">Esc</w:t>
+      </w:r>
+      <w:r>
+        <w:t xml:space="preserve"> </w:t>
+      </w:r>
+      <w:r>
+        <w:t xml:space="preserve">at boot), look for</w:t>
+      </w:r>
+      <w:r>
+        <w:t xml:space="preserve"> </w:t>
+      </w:r>
+      <w:r>
+        <w:rPr>
+          <w:iCs/>
+          <w:i/>
+        </w:rPr>
+        <w:t xml:space="preserve">Graphics</w:t>
+      </w:r>
+      <w:r>
+        <w:t xml:space="preserve">,</w:t>
+      </w:r>
+      <w:r>
+        <w:t xml:space="preserve"> </w:t>
+      </w:r>
+      <w:r>
+        <w:rPr>
+          <w:iCs/>
+          <w:i/>
+        </w:rPr>
+        <w:t xml:space="preserve">Display</w:t>
+      </w:r>
+      <w:r>
+        <w:t xml:space="preserve">, or</w:t>
+      </w:r>
+      <w:r>
+        <w:t xml:space="preserve"> </w:t>
+      </w:r>
+      <w:r>
+        <w:rPr>
+          <w:iCs/>
+          <w:i/>
+        </w:rPr>
+        <w:t xml:space="preserve">MUX Switch</w:t>
+      </w:r>
+      <w:r>
+        <w:t xml:space="preserve"> </w:t>
+      </w:r>
+      <w:r>
+        <w:t xml:space="preserve">settings. Some gaming laptops have a</w:t>
+      </w:r>
+      <w:r>
+        <w:t xml:space="preserve"> </w:t>
+      </w:r>
+      <w:r>
+        <w:t xml:space="preserve">“</w:t>
+      </w:r>
+      <w:r>
+        <w:t xml:space="preserve">discrete GPU only</w:t>
+      </w:r>
+      <w:r>
+        <w:t xml:space="preserve">”</w:t>
+      </w:r>
+      <w:r>
+        <w:t xml:space="preserve"> </w:t>
+      </w:r>
+      <w:r>
+        <w:t xml:space="preserve">mode that disables the integrated GPU and routes the display through the NVIDIA card directly — better for CUDA work, worse for battery.</w:t>
+      </w:r>
+    </w:p>
+    <w:bookmarkEnd w:id="25"/>
+    <w:bookmarkStart w:id="26" w:name="basic-environment-checklist"/>
+    <w:p>
+      <w:pPr>
+        <w:pStyle w:val="Heading3"/>
+      </w:pPr>
+      <w:r>
+        <w:t xml:space="preserve">1.5 Basic environment checklist</w:t>
+      </w:r>
+    </w:p>
+    <w:tbl>
+      <w:tblPr>
+        <w:tblStyle w:val="Table"/>
+        <w:tblW w:type="pct" w:w="5000"/>
+        <w:tblLook w:firstRow="1" w:lastRow="0" w:firstColumn="0" w:lastColumn="0" w:noHBand="0" w:noVBand="0" w:val="0020"/>
+        <w:jc w:val="start"/>
+      </w:tblPr>
+      <w:tblGrid>
+        <w:gridCol w:w="3960"/>
+        <w:gridCol w:w="3960"/>
+      </w:tblGrid>
+      <w:tr>
+        <w:trPr>
+          <w:tblHeader w:val="true"/>
+        </w:trPr>
+        <w:tc>
+          <w:tcPr/>
+          <w:p>
+            <w:pPr>
+              <w:pStyle w:val="Compact"/>
+              <w:jc w:val="left"/>
+            </w:pPr>
+            <w:r>
+              <w:t xml:space="preserve">Question</w:t>
+            </w:r>
+          </w:p>
+        </w:tc>
+        <w:tc>
+          <w:tcPr/>
+          <w:p>
+            <w:pPr>
+              <w:pStyle w:val="Compact"/>
+              <w:jc w:val="left"/>
+            </w:pPr>
+            <w:r>
+              <w:t xml:space="preserve">Answer</w:t>
+            </w:r>
+          </w:p>
+        </w:tc>
+      </w:tr>
+      <w:tr>
+        <w:tc>
+          <w:tcPr/>
+          <w:p>
+            <w:pPr>
+              <w:pStyle w:val="Compact"/>
+              <w:jc w:val="left"/>
+            </w:pPr>
+            <w:r>
+              <w:t xml:space="preserve">Disk space?</w:t>
+            </w:r>
+          </w:p>
+        </w:tc>
+        <w:tc>
+          <w:tcPr/>
+          <w:p>
+            <w:pPr>
+              <w:pStyle w:val="Compact"/>
+              <w:jc w:val="left"/>
+            </w:pPr>
+            <w:r>
+              <w:t xml:space="preserve">~10 GB total — VS Build Tools ~6 GB; CUDA toolkit ~3 GB.</w:t>
+            </w:r>
+          </w:p>
+        </w:tc>
+      </w:tr>
+      <w:tr>
+        <w:tc>
+          <w:tcPr/>
+          <w:p>
+            <w:pPr>
+              <w:pStyle w:val="Compact"/>
+              <w:jc w:val="left"/>
+            </w:pPr>
+            <w:r>
+              <w:t xml:space="preserve">Admin account?</w:t>
+            </w:r>
+          </w:p>
+        </w:tc>
+        <w:tc>
+          <w:tcPr/>
+          <w:p>
+            <w:pPr>
+              <w:pStyle w:val="Compact"/>
+              <w:jc w:val="left"/>
+            </w:pPr>
+            <w:r>
+              <w:t xml:space="preserve">Yes — installer needs to write to Program Files and load drivers.</w:t>
+            </w:r>
+          </w:p>
+        </w:tc>
+      </w:tr>
+      <w:tr>
+        <w:tc>
+          <w:tcPr/>
+          <w:p>
+            <w:pPr>
+              <w:pStyle w:val="Compact"/>
+              <w:jc w:val="left"/>
+            </w:pPr>
+            <w:r>
+              <w:t xml:space="preserve">Internet?</w:t>
+            </w:r>
+          </w:p>
+        </w:tc>
+        <w:tc>
+          <w:tcPr/>
+          <w:p>
+            <w:pPr>
+              <w:pStyle w:val="Compact"/>
+              <w:jc w:val="left"/>
+            </w:pPr>
+            <w:r>
+              <w:t xml:space="preserve">Yes — winget pulls everything from official sources.</w:t>
+            </w:r>
+          </w:p>
+        </w:tc>
+      </w:tr>
+      <w:tr>
+        <w:tc>
+          <w:tcPr/>
+          <w:p>
+            <w:pPr>
+              <w:pStyle w:val="Compact"/>
+              <w:jc w:val="left"/>
+            </w:pPr>
+            <w:r>
+              <w:t xml:space="preserve">Windows up to date?</w:t>
+            </w:r>
+          </w:p>
+        </w:tc>
+        <w:tc>
+          <w:tcPr/>
+          <w:p>
+            <w:pPr>
+              <w:pStyle w:val="Compact"/>
+              <w:jc w:val="left"/>
+            </w:pPr>
+            <w:r>
+              <w:t xml:space="preserve">Recommended —</w:t>
+            </w:r>
+            <w:r>
+              <w:t xml:space="preserve"> </w:t>
+            </w:r>
+            <w:r>
+              <w:rPr>
+                <w:iCs/>
+                <w:i/>
+              </w:rPr>
+              <w:t xml:space="preserve">Settings → Windows Update</w:t>
+            </w:r>
+            <w:r>
+              <w:t xml:space="preserve"> </w:t>
+            </w:r>
+            <w:r>
+              <w:t xml:space="preserve">before installing the NVIDIA driver.</w:t>
+            </w:r>
+          </w:p>
+        </w:tc>
+      </w:tr>
+      <w:tr>
+        <w:tc>
+          <w:tcPr/>
+          <w:p>
+            <w:pPr>
+              <w:pStyle w:val="Compact"/>
+              <w:jc w:val="left"/>
+            </w:pPr>
+            <w:r>
+              <w:rPr>
+                <w:rStyle w:val="VerbatimChar"/>
+              </w:rPr>
+              <w:t xml:space="preserve">winget</w:t>
+            </w:r>
+            <w:r>
+              <w:t xml:space="preserve"> </w:t>
+            </w:r>
+            <w:r>
+              <w:t xml:space="preserve">works?</w:t>
+            </w:r>
+          </w:p>
+        </w:tc>
+        <w:tc>
+          <w:tcPr/>
+          <w:p>
+            <w:pPr>
+              <w:pStyle w:val="Compact"/>
+              <w:jc w:val="left"/>
+            </w:pPr>
+            <w:r>
+              <w:t xml:space="preserve">Test in PowerShell:</w:t>
+            </w:r>
+            <w:r>
+              <w:t xml:space="preserve"> </w:t>
+            </w:r>
+            <w:r>
+              <w:rPr>
+                <w:rStyle w:val="VerbatimChar"/>
+              </w:rPr>
+              <w:t xml:space="preserve">winget --version</w:t>
+            </w:r>
+            <w:r>
+              <w:t xml:space="preserve">. If</w:t>
+            </w:r>
+            <w:r>
+              <w:t xml:space="preserve"> </w:t>
+            </w:r>
+            <w:r>
+              <w:t xml:space="preserve">“</w:t>
+            </w:r>
+            <w:r>
+              <w:t xml:space="preserve">command not found,</w:t>
+            </w:r>
+            <w:r>
+              <w:t xml:space="preserve">”</w:t>
+            </w:r>
+            <w:r>
+              <w:t xml:space="preserve"> </w:t>
+            </w:r>
+            <w:r>
+              <w:t xml:space="preserve">install</w:t>
+            </w:r>
+            <w:r>
+              <w:t xml:space="preserve"> </w:t>
+            </w:r>
+            <w:r>
+              <w:rPr>
+                <w:bCs/>
+                <w:b/>
+              </w:rPr>
+              <w:t xml:space="preserve">App Installer</w:t>
+            </w:r>
+            <w:r>
+              <w:t xml:space="preserve"> </w:t>
+            </w:r>
+            <w:r>
+              <w:t xml:space="preserve">from the Microsoft Store.</w:t>
+            </w:r>
+          </w:p>
+        </w:tc>
+      </w:tr>
+    </w:tbl>
+    <w:p>
+      <w:r>
+        <w:pict>
+          <v:rect style="width:0;height:1.5pt" o:hralign="center" o:hrstd="t" o:hr="t"/>
+        </w:pict>
+      </w:r>
+    </w:p>
+    <w:bookmarkEnd w:id="26"/>
+    <w:bookmarkEnd w:id="27"/>
+    <w:bookmarkStart w:id="28" w:name="recommended-stack"/>
+    <w:p>
+      <w:pPr>
+        <w:pStyle w:val="Heading2"/>
+      </w:pPr>
+      <w:r>
+        <w:t xml:space="preserve">2. Recommended stack</w:t>
+      </w:r>
+    </w:p>
+    <w:tbl>
+      <w:tblPr>
+        <w:tblStyle w:val="Table"/>
+        <w:tblW w:type="pct" w:w="5000"/>
+        <w:tblLook w:firstRow="1" w:lastRow="0" w:firstColumn="0" w:lastColumn="0" w:noHBand="0" w:noVBand="0" w:val="0020"/>
+        <w:jc w:val="start"/>
+      </w:tblPr>
+      <w:tblGrid>
+        <w:gridCol w:w="2640"/>
+        <w:gridCol w:w="2640"/>
+        <w:gridCol w:w="2640"/>
+      </w:tblGrid>
+      <w:tr>
+        <w:trPr>
+          <w:tblHeader w:val="true"/>
+        </w:trPr>
+        <w:tc>
+          <w:tcPr/>
+          <w:p>
+            <w:pPr>
+              <w:pStyle w:val="Compact"/>
+              <w:jc w:val="left"/>
+            </w:pPr>
+            <w:r>
               <w:t xml:space="preserve">Layer</w:t>
             </w:r>
           </w:p>
@@ -941,8 +3154,8 @@
         </w:pict>
       </w:r>
     </w:p>
-    <w:bookmarkEnd w:id="22"/>
-    <w:bookmarkStart w:id="31" w:name="manual-install-reference"/>
+    <w:bookmarkEnd w:id="28"/>
+    <w:bookmarkStart w:id="37" w:name="manual-install-reference"/>
     <w:p>
       <w:pPr>
         <w:pStyle w:val="Heading2"/>
@@ -977,7 +3190,7 @@
         <w:t xml:space="preserve">reference.</w:t>
       </w:r>
     </w:p>
-    <w:bookmarkStart w:id="24" w:name="nvidia-driver"/>
+    <w:bookmarkStart w:id="30" w:name="nvidia-driver"/>
     <w:p>
       <w:pPr>
         <w:pStyle w:val="Heading3"/>
@@ -1124,7 +3337,7 @@
       <w:r>
         <w:t xml:space="preserve"> </w:t>
       </w:r>
-      <w:hyperlink r:id="rId23">
+      <w:hyperlink r:id="rId29">
         <w:r>
           <w:rPr>
             <w:rStyle w:val="Hyperlink"/>
@@ -1136,8 +3349,8 @@
         <w:t xml:space="preserve">.</w:t>
       </w:r>
     </w:p>
-    <w:bookmarkEnd w:id="24"/>
-    <w:bookmarkStart w:id="26" w:name="X7d1814d1f47321e727fe1d035c639724cfab4c3"/>
+    <w:bookmarkEnd w:id="30"/>
+    <w:bookmarkStart w:id="32" w:name="X7d1814d1f47321e727fe1d035c639724cfab4c3"/>
     <w:p>
       <w:pPr>
         <w:pStyle w:val="Heading3"/>
@@ -1386,7 +3599,7 @@
       <w:r>
         <w:t xml:space="preserve"> </w:t>
       </w:r>
-      <w:hyperlink r:id="rId25">
+      <w:hyperlink r:id="rId31">
         <w:r>
           <w:rPr>
             <w:rStyle w:val="Hyperlink"/>
@@ -1459,8 +3672,8 @@
         <w:t xml:space="preserve">.</w:t>
       </w:r>
     </w:p>
-    <w:bookmarkEnd w:id="26"/>
-    <w:bookmarkStart w:id="28" w:name="cuda-toolkit"/>
+    <w:bookmarkEnd w:id="32"/>
+    <w:bookmarkStart w:id="34" w:name="cuda-toolkit"/>
     <w:p>
       <w:pPr>
         <w:pStyle w:val="Heading3"/>
@@ -1529,7 +3742,7 @@
       <w:r>
         <w:t xml:space="preserve"> </w:t>
       </w:r>
-      <w:hyperlink r:id="rId27">
+      <w:hyperlink r:id="rId33">
         <w:r>
           <w:rPr>
             <w:rStyle w:val="Hyperlink"/>
@@ -1607,8 +3820,8 @@
         <w:t xml:space="preserve">automatically.</w:t>
       </w:r>
     </w:p>
-    <w:bookmarkEnd w:id="28"/>
-    <w:bookmarkStart w:id="29" w:name="build-tools"/>
+    <w:bookmarkEnd w:id="34"/>
+    <w:bookmarkStart w:id="35" w:name="build-tools"/>
     <w:p>
       <w:pPr>
         <w:pStyle w:val="Heading3"/>
@@ -1730,8 +3943,8 @@
         <w:t xml:space="preserve">Git</w:t>
       </w:r>
     </w:p>
-    <w:bookmarkEnd w:id="29"/>
-    <w:bookmarkStart w:id="30" w:name="vs-code-cuda-extensions"/>
+    <w:bookmarkEnd w:id="35"/>
+    <w:bookmarkStart w:id="36" w:name="vs-code-cuda-extensions"/>
     <w:p>
       <w:pPr>
         <w:pStyle w:val="Heading3"/>
@@ -2015,9 +4228,9 @@
         </w:pict>
       </w:r>
     </w:p>
-    <w:bookmarkEnd w:id="30"/>
-    <w:bookmarkEnd w:id="31"/>
-    <w:bookmarkStart w:id="34" w:name="automated-install-script"/>
+    <w:bookmarkEnd w:id="36"/>
+    <w:bookmarkEnd w:id="37"/>
+    <w:bookmarkStart w:id="40" w:name="automated-install-script"/>
     <w:p>
       <w:pPr>
         <w:pStyle w:val="Heading2"/>
@@ -2057,7 +4270,7 @@
         <w:t xml:space="preserve">) since you’ll usually pick the driver yourself in the NVIDIA App.</w:t>
       </w:r>
     </w:p>
-    <w:bookmarkStart w:id="32" w:name="usage"/>
+    <w:bookmarkStart w:id="38" w:name="usage"/>
     <w:p>
       <w:pPr>
         <w:pStyle w:val="Heading3"/>
@@ -2387,8 +4600,8 @@
         <w:t xml:space="preserve">Detailed</w:t>
       </w:r>
     </w:p>
-    <w:bookmarkEnd w:id="32"/>
-    <w:bookmarkStart w:id="33" w:name="script-contents"/>
+    <w:bookmarkEnd w:id="38"/>
+    <w:bookmarkStart w:id="39" w:name="script-contents"/>
     <w:p>
       <w:pPr>
         <w:pStyle w:val="Heading3"/>
@@ -6498,9 +8711,9 @@
         </w:pict>
       </w:r>
     </w:p>
-    <w:bookmarkEnd w:id="33"/>
-    <w:bookmarkEnd w:id="34"/>
-    <w:bookmarkStart w:id="35" w:name="project-layout"/>
+    <w:bookmarkEnd w:id="39"/>
+    <w:bookmarkEnd w:id="40"/>
+    <w:bookmarkStart w:id="41" w:name="project-layout"/>
     <w:p>
       <w:pPr>
         <w:pStyle w:val="Heading2"/>
@@ -6644,8 +8857,8 @@
         </w:pict>
       </w:r>
     </w:p>
-    <w:bookmarkEnd w:id="35"/>
-    <w:bookmarkStart w:id="37" w:name="build-run"/>
+    <w:bookmarkEnd w:id="41"/>
+    <w:bookmarkStart w:id="43" w:name="build-run"/>
     <w:p>
       <w:pPr>
         <w:pStyle w:val="Heading2"/>
@@ -6849,7 +9062,7 @@
         <w:t xml:space="preserve">build\vector_add.exe</w:t>
       </w:r>
     </w:p>
-    <w:bookmarkStart w:id="36" w:name="Xd8bb07a8add34718e466f0587d7cf5eee5cdb7b"/>
+    <w:bookmarkStart w:id="42" w:name="Xd8bb07a8add34718e466f0587d7cf5eee5cdb7b"/>
     <w:p>
       <w:pPr>
         <w:pStyle w:val="Heading3"/>
@@ -7303,7 +9516,7 @@
       <w:r>
         <w:t xml:space="preserve"> </w:t>
       </w:r>
-      <w:hyperlink r:id="rId20">
+      <w:hyperlink r:id="rId22">
         <w:r>
           <w:rPr>
             <w:rStyle w:val="Hyperlink"/>
@@ -7322,9 +9535,9 @@
         </w:pict>
       </w:r>
     </w:p>
-    <w:bookmarkEnd w:id="36"/>
-    <w:bookmarkEnd w:id="37"/>
-    <w:bookmarkStart w:id="38" w:name="verify-the-install"/>
+    <w:bookmarkEnd w:id="42"/>
+    <w:bookmarkEnd w:id="43"/>
+    <w:bookmarkStart w:id="44" w:name="verify-the-install"/>
     <w:p>
       <w:pPr>
         <w:pStyle w:val="Heading2"/>
@@ -7511,8 +9724,8 @@
         </w:pict>
       </w:r>
     </w:p>
-    <w:bookmarkEnd w:id="38"/>
-    <w:bookmarkStart w:id="44" w:name="driver-rollback-on-windows"/>
+    <w:bookmarkEnd w:id="44"/>
+    <w:bookmarkStart w:id="50" w:name="driver-rollback-on-windows"/>
     <w:p>
       <w:pPr>
         <w:pStyle w:val="Heading2"/>
@@ -7545,7 +9758,7 @@
         <w:t xml:space="preserve">tiers.</w:t>
       </w:r>
     </w:p>
-    <w:bookmarkStart w:id="39" w:name="roll-back-via-device-manager-gentlest"/>
+    <w:bookmarkStart w:id="45" w:name="roll-back-via-device-manager-gentlest"/>
     <w:p>
       <w:pPr>
         <w:pStyle w:val="Heading3"/>
@@ -7560,162 +9773,6 @@
       </w:pPr>
       <w:r>
         <w:t xml:space="preserve">Best when Windows still boots and the new driver is the obvious culprit.</w:t>
-      </w:r>
-    </w:p>
-    <w:p>
-      <w:pPr>
-        <w:numPr>
-          <w:ilvl w:val="0"/>
-          <w:numId w:val="1001"/>
-        </w:numPr>
-        <w:pStyle w:val="Compact"/>
-      </w:pPr>
-      <w:r>
-        <w:rPr>
-          <w:iCs/>
-          <w:i/>
-        </w:rPr>
-        <w:t xml:space="preserve">Start menu → Device Manager</w:t>
-      </w:r>
-      <w:r>
-        <w:t xml:space="preserve">.</w:t>
-      </w:r>
-    </w:p>
-    <w:p>
-      <w:pPr>
-        <w:numPr>
-          <w:ilvl w:val="0"/>
-          <w:numId w:val="1001"/>
-        </w:numPr>
-        <w:pStyle w:val="Compact"/>
-      </w:pPr>
-      <w:r>
-        <w:rPr>
-          <w:iCs/>
-          <w:i/>
-        </w:rPr>
-        <w:t xml:space="preserve">Display adapters</w:t>
-      </w:r>
-      <w:r>
-        <w:t xml:space="preserve"> </w:t>
-      </w:r>
-      <w:r>
-        <w:t xml:space="preserve">→ right-click your NVIDIA GPU →</w:t>
-      </w:r>
-      <w:r>
-        <w:t xml:space="preserve"> </w:t>
-      </w:r>
-      <w:r>
-        <w:rPr>
-          <w:iCs/>
-          <w:i/>
-        </w:rPr>
-        <w:t xml:space="preserve">Properties</w:t>
-      </w:r>
-      <w:r>
-        <w:t xml:space="preserve">.</w:t>
-      </w:r>
-    </w:p>
-    <w:p>
-      <w:pPr>
-        <w:numPr>
-          <w:ilvl w:val="0"/>
-          <w:numId w:val="1001"/>
-        </w:numPr>
-        <w:pStyle w:val="Compact"/>
-      </w:pPr>
-      <w:r>
-        <w:rPr>
-          <w:iCs/>
-          <w:i/>
-        </w:rPr>
-        <w:t xml:space="preserve">Driver</w:t>
-      </w:r>
-      <w:r>
-        <w:t xml:space="preserve"> </w:t>
-      </w:r>
-      <w:r>
-        <w:t xml:space="preserve">tab →</w:t>
-      </w:r>
-      <w:r>
-        <w:t xml:space="preserve"> </w:t>
-      </w:r>
-      <w:r>
-        <w:rPr>
-          <w:bCs/>
-          <w:b/>
-        </w:rPr>
-        <w:t xml:space="preserve">Roll Back Driver</w:t>
-      </w:r>
-      <w:r>
-        <w:t xml:space="preserve">.</w:t>
-      </w:r>
-    </w:p>
-    <w:p>
-      <w:pPr>
-        <w:numPr>
-          <w:ilvl w:val="0"/>
-          <w:numId w:val="1001"/>
-        </w:numPr>
-        <w:pStyle w:val="Compact"/>
-      </w:pPr>
-      <w:r>
-        <w:t xml:space="preserve">Pick a reason, click OK, reboot.</w:t>
-      </w:r>
-    </w:p>
-    <w:p>
-      <w:pPr>
-        <w:pStyle w:val="FirstParagraph"/>
-      </w:pPr>
-      <w:r>
-        <w:t xml:space="preserve">This restores the</w:t>
-      </w:r>
-      <w:r>
-        <w:t xml:space="preserve"> </w:t>
-      </w:r>
-      <w:r>
-        <w:rPr>
-          <w:bCs/>
-          <w:b/>
-        </w:rPr>
-        <w:t xml:space="preserve">immediately previous</w:t>
-      </w:r>
-      <w:r>
-        <w:t xml:space="preserve"> </w:t>
-      </w:r>
-      <w:r>
-        <w:t xml:space="preserve">driver Windows kept staged. If the button is greyed out, no previous driver is available — try §8.2.</w:t>
-      </w:r>
-    </w:p>
-    <w:bookmarkEnd w:id="39"/>
-    <w:bookmarkStart w:id="40" w:name="system-restore-medium"/>
-    <w:p>
-      <w:pPr>
-        <w:pStyle w:val="Heading3"/>
-      </w:pPr>
-      <w:r>
-        <w:t xml:space="preserve">8.2 System Restore (medium)</w:t>
-      </w:r>
-    </w:p>
-    <w:p>
-      <w:pPr>
-        <w:pStyle w:val="FirstParagraph"/>
-      </w:pPr>
-      <w:r>
-        <w:t xml:space="preserve">Windows automatically takes a restore point before driver installs (if System Protection is enabled — check</w:t>
-      </w:r>
-      <w:r>
-        <w:t xml:space="preserve"> </w:t>
-      </w:r>
-      <w:r>
-        <w:rPr>
-          <w:iCs/>
-          <w:i/>
-        </w:rPr>
-        <w:t xml:space="preserve">Settings → System → About → Advanced system settings → System Protection</w:t>
-      </w:r>
-      <w:r>
-        <w:t xml:space="preserve">).</w:t>
       </w:r>
     </w:p>
     <w:p>
@@ -7731,35 +9788,7 @@
           <w:iCs/>
           <w:i/>
         </w:rPr>
-        <w:t xml:space="preserve">Start menu →</w:t>
-      </w:r>
-      <w:r>
-        <w:rPr>
-          <w:iCs/>
-          <w:i/>
-        </w:rPr>
-        <w:t xml:space="preserve"> </w:t>
-      </w:r>
-      <w:r>
-        <w:rPr>
-          <w:iCs/>
-          <w:i/>
-        </w:rPr>
-        <w:t xml:space="preserve">“</w:t>
-      </w:r>
-      <w:r>
-        <w:rPr>
-          <w:iCs/>
-          <w:i/>
-        </w:rPr>
-        <w:t xml:space="preserve">Create a restore point</w:t>
-      </w:r>
-      <w:r>
-        <w:rPr>
-          <w:iCs/>
-          <w:i/>
-        </w:rPr>
-        <w:t xml:space="preserve">”</w:t>
+        <w:t xml:space="preserve">Start menu → Device Manager</w:t>
       </w:r>
       <w:r>
         <w:t xml:space="preserve">.</w:t>
@@ -7778,13 +9807,13 @@
           <w:iCs/>
           <w:i/>
         </w:rPr>
-        <w:t xml:space="preserve">System Restore…</w:t>
-      </w:r>
-      <w:r>
-        <w:t xml:space="preserve"> </w:t>
-      </w:r>
-      <w:r>
-        <w:t xml:space="preserve">→ pick a point dated</w:t>
+        <w:t xml:space="preserve">Display adapters</w:t>
+      </w:r>
+      <w:r>
+        <w:t xml:space="preserve"> </w:t>
+      </w:r>
+      <w:r>
+        <w:t xml:space="preserve">→ right-click your NVIDIA GPU →</w:t>
       </w:r>
       <w:r>
         <w:t xml:space="preserve"> </w:t>
@@ -7794,39 +9823,7 @@
           <w:iCs/>
           <w:i/>
         </w:rPr>
-        <w:t xml:space="preserve">before</w:t>
-      </w:r>
-      <w:r>
-        <w:t xml:space="preserve"> </w:t>
-      </w:r>
-      <w:r>
-        <w:t xml:space="preserve">the driver install →</w:t>
-      </w:r>
-      <w:r>
-        <w:t xml:space="preserve"> </w:t>
-      </w:r>
-      <w:r>
-        <w:rPr>
-          <w:iCs/>
-          <w:i/>
-        </w:rPr>
-        <w:t xml:space="preserve">Next</w:t>
-      </w:r>
-      <w:r>
-        <w:t xml:space="preserve"> </w:t>
-      </w:r>
-      <w:r>
-        <w:t xml:space="preserve">→</w:t>
-      </w:r>
-      <w:r>
-        <w:t xml:space="preserve"> </w:t>
-      </w:r>
-      <w:r>
-        <w:rPr>
-          <w:iCs/>
-          <w:i/>
-        </w:rPr>
-        <w:t xml:space="preserve">Finish</w:t>
+        <w:t xml:space="preserve">Properties</w:t>
       </w:r>
       <w:r>
         <w:t xml:space="preserve">.</w:t>
@@ -7841,7 +9838,42 @@
         <w:pStyle w:val="Compact"/>
       </w:pPr>
       <w:r>
-        <w:t xml:space="preserve">Windows reboots into the restored state.</w:t>
+        <w:rPr>
+          <w:iCs/>
+          <w:i/>
+        </w:rPr>
+        <w:t xml:space="preserve">Driver</w:t>
+      </w:r>
+      <w:r>
+        <w:t xml:space="preserve"> </w:t>
+      </w:r>
+      <w:r>
+        <w:t xml:space="preserve">tab →</w:t>
+      </w:r>
+      <w:r>
+        <w:t xml:space="preserve"> </w:t>
+      </w:r>
+      <w:r>
+        <w:rPr>
+          <w:bCs/>
+          <w:b/>
+        </w:rPr>
+        <w:t xml:space="preserve">Roll Back Driver</w:t>
+      </w:r>
+      <w:r>
+        <w:t xml:space="preserve">.</w:t>
+      </w:r>
+    </w:p>
+    <w:p>
+      <w:pPr>
+        <w:numPr>
+          <w:ilvl w:val="0"/>
+          <w:numId w:val="1002"/>
+        </w:numPr>
+        <w:pStyle w:val="Compact"/>
+      </w:pPr>
+      <w:r>
+        <w:t xml:space="preserve">Pick a reason, click OK, reboot.</w:t>
       </w:r>
     </w:p>
     <w:p>
@@ -7849,17 +9881,33 @@
         <w:pStyle w:val="FirstParagraph"/>
       </w:pPr>
       <w:r>
-        <w:t xml:space="preserve">This reverts driver + registry changes without affecting your files.</w:t>
-      </w:r>
-    </w:p>
-    <w:bookmarkEnd w:id="40"/>
-    <w:bookmarkStart w:id="42" w:name="X3a09383cb05e81505884310cfc5fca4084af4b2"/>
+        <w:t xml:space="preserve">This restores the</w:t>
+      </w:r>
+      <w:r>
+        <w:t xml:space="preserve"> </w:t>
+      </w:r>
+      <w:r>
+        <w:rPr>
+          <w:bCs/>
+          <w:b/>
+        </w:rPr>
+        <w:t xml:space="preserve">immediately previous</w:t>
+      </w:r>
+      <w:r>
+        <w:t xml:space="preserve"> </w:t>
+      </w:r>
+      <w:r>
+        <w:t xml:space="preserve">driver Windows kept staged. If the button is greyed out, no previous driver is available — try §8.2.</w:t>
+      </w:r>
+    </w:p>
+    <w:bookmarkEnd w:id="45"/>
+    <w:bookmarkStart w:id="46" w:name="system-restore-medium"/>
     <w:p>
       <w:pPr>
         <w:pStyle w:val="Heading3"/>
       </w:pPr>
       <w:r>
-        <w:t xml:space="preserve">8.3 DDU (Display Driver Uninstaller) — nuclear option</w:t>
+        <w:t xml:space="preserve">8.2 System Restore (medium)</w:t>
       </w:r>
     </w:p>
     <w:p>
@@ -7867,7 +9915,20 @@
         <w:pStyle w:val="FirstParagraph"/>
       </w:pPr>
       <w:r>
-        <w:t xml:space="preserve">When the install is wedged badly enough that neither rollback method works:</w:t>
+        <w:t xml:space="preserve">Windows automatically takes a restore point before driver installs (if System Protection is enabled — check</w:t>
+      </w:r>
+      <w:r>
+        <w:t xml:space="preserve"> </w:t>
+      </w:r>
+      <w:r>
+        <w:rPr>
+          <w:iCs/>
+          <w:i/>
+        </w:rPr>
+        <w:t xml:space="preserve">Settings → System → About → Advanced system settings → System Protection</w:t>
+      </w:r>
+      <w:r>
+        <w:t xml:space="preserve">).</w:t>
       </w:r>
     </w:p>
     <w:p>
@@ -7879,6 +9940,158 @@
         <w:pStyle w:val="Compact"/>
       </w:pPr>
       <w:r>
+        <w:rPr>
+          <w:iCs/>
+          <w:i/>
+        </w:rPr>
+        <w:t xml:space="preserve">Start menu →</w:t>
+      </w:r>
+      <w:r>
+        <w:rPr>
+          <w:iCs/>
+          <w:i/>
+        </w:rPr>
+        <w:t xml:space="preserve"> </w:t>
+      </w:r>
+      <w:r>
+        <w:rPr>
+          <w:iCs/>
+          <w:i/>
+        </w:rPr>
+        <w:t xml:space="preserve">“</w:t>
+      </w:r>
+      <w:r>
+        <w:rPr>
+          <w:iCs/>
+          <w:i/>
+        </w:rPr>
+        <w:t xml:space="preserve">Create a restore point</w:t>
+      </w:r>
+      <w:r>
+        <w:rPr>
+          <w:iCs/>
+          <w:i/>
+        </w:rPr>
+        <w:t xml:space="preserve">”</w:t>
+      </w:r>
+      <w:r>
+        <w:t xml:space="preserve">.</w:t>
+      </w:r>
+    </w:p>
+    <w:p>
+      <w:pPr>
+        <w:numPr>
+          <w:ilvl w:val="0"/>
+          <w:numId w:val="1003"/>
+        </w:numPr>
+        <w:pStyle w:val="Compact"/>
+      </w:pPr>
+      <w:r>
+        <w:rPr>
+          <w:iCs/>
+          <w:i/>
+        </w:rPr>
+        <w:t xml:space="preserve">System Restore…</w:t>
+      </w:r>
+      <w:r>
+        <w:t xml:space="preserve"> </w:t>
+      </w:r>
+      <w:r>
+        <w:t xml:space="preserve">→ pick a point dated</w:t>
+      </w:r>
+      <w:r>
+        <w:t xml:space="preserve"> </w:t>
+      </w:r>
+      <w:r>
+        <w:rPr>
+          <w:iCs/>
+          <w:i/>
+        </w:rPr>
+        <w:t xml:space="preserve">before</w:t>
+      </w:r>
+      <w:r>
+        <w:t xml:space="preserve"> </w:t>
+      </w:r>
+      <w:r>
+        <w:t xml:space="preserve">the driver install →</w:t>
+      </w:r>
+      <w:r>
+        <w:t xml:space="preserve"> </w:t>
+      </w:r>
+      <w:r>
+        <w:rPr>
+          <w:iCs/>
+          <w:i/>
+        </w:rPr>
+        <w:t xml:space="preserve">Next</w:t>
+      </w:r>
+      <w:r>
+        <w:t xml:space="preserve"> </w:t>
+      </w:r>
+      <w:r>
+        <w:t xml:space="preserve">→</w:t>
+      </w:r>
+      <w:r>
+        <w:t xml:space="preserve"> </w:t>
+      </w:r>
+      <w:r>
+        <w:rPr>
+          <w:iCs/>
+          <w:i/>
+        </w:rPr>
+        <w:t xml:space="preserve">Finish</w:t>
+      </w:r>
+      <w:r>
+        <w:t xml:space="preserve">.</w:t>
+      </w:r>
+    </w:p>
+    <w:p>
+      <w:pPr>
+        <w:numPr>
+          <w:ilvl w:val="0"/>
+          <w:numId w:val="1003"/>
+        </w:numPr>
+        <w:pStyle w:val="Compact"/>
+      </w:pPr>
+      <w:r>
+        <w:t xml:space="preserve">Windows reboots into the restored state.</w:t>
+      </w:r>
+    </w:p>
+    <w:p>
+      <w:pPr>
+        <w:pStyle w:val="FirstParagraph"/>
+      </w:pPr>
+      <w:r>
+        <w:t xml:space="preserve">This reverts driver + registry changes without affecting your files.</w:t>
+      </w:r>
+    </w:p>
+    <w:bookmarkEnd w:id="46"/>
+    <w:bookmarkStart w:id="48" w:name="X3a09383cb05e81505884310cfc5fca4084af4b2"/>
+    <w:p>
+      <w:pPr>
+        <w:pStyle w:val="Heading3"/>
+      </w:pPr>
+      <w:r>
+        <w:t xml:space="preserve">8.3 DDU (Display Driver Uninstaller) — nuclear option</w:t>
+      </w:r>
+    </w:p>
+    <w:p>
+      <w:pPr>
+        <w:pStyle w:val="FirstParagraph"/>
+      </w:pPr>
+      <w:r>
+        <w:t xml:space="preserve">When the install is wedged badly enough that neither rollback method works:</w:t>
+      </w:r>
+    </w:p>
+    <w:p>
+      <w:pPr>
+        <w:numPr>
+          <w:ilvl w:val="0"/>
+          <w:numId w:val="1004"/>
+        </w:numPr>
+        <w:pStyle w:val="Compact"/>
+      </w:pPr>
+      <w:r>
         <w:t xml:space="preserve">Download</w:t>
       </w:r>
       <w:r>
@@ -7900,7 +10113,7 @@
       <w:r>
         <w:t xml:space="preserve"> </w:t>
       </w:r>
-      <w:hyperlink r:id="rId41">
+      <w:hyperlink r:id="rId47">
         <w:r>
           <w:rPr>
             <w:rStyle w:val="Hyperlink"/>
@@ -7916,7 +10129,7 @@
       <w:pPr>
         <w:numPr>
           <w:ilvl w:val="0"/>
-          <w:numId w:val="1003"/>
+          <w:numId w:val="1004"/>
         </w:numPr>
         <w:pStyle w:val="Compact"/>
       </w:pPr>
@@ -7954,7 +10167,7 @@
       <w:pPr>
         <w:numPr>
           <w:ilvl w:val="0"/>
-          <w:numId w:val="1003"/>
+          <w:numId w:val="1004"/>
         </w:numPr>
         <w:pStyle w:val="Compact"/>
       </w:pPr>
@@ -7979,7 +10192,7 @@
       <w:pPr>
         <w:numPr>
           <w:ilvl w:val="0"/>
-          <w:numId w:val="1003"/>
+          <w:numId w:val="1004"/>
         </w:numPr>
         <w:pStyle w:val="Compact"/>
       </w:pPr>
@@ -7989,7 +10202,7 @@
       <w:r>
         <w:t xml:space="preserve"> </w:t>
       </w:r>
-      <w:hyperlink r:id="rId23">
+      <w:hyperlink r:id="rId29">
         <w:r>
           <w:rPr>
             <w:rStyle w:val="Hyperlink"/>
@@ -8009,8 +10222,8 @@
         <w:t xml:space="preserve">DDU removes every NVIDIA driver artifact — registry keys, files, scheduled tasks. Use only when you need to.</w:t>
       </w:r>
     </w:p>
-    <w:bookmarkEnd w:id="42"/>
-    <w:bookmarkStart w:id="43" w:name="pre-emptive-caution"/>
+    <w:bookmarkEnd w:id="48"/>
+    <w:bookmarkStart w:id="49" w:name="pre-emptive-caution"/>
     <w:p>
       <w:pPr>
         <w:pStyle w:val="Heading3"/>
@@ -8025,278 +10238,6 @@
       </w:pPr>
       <w:r>
         <w:t xml:space="preserve">Before any driver upgrade:</w:t>
-      </w:r>
-    </w:p>
-    <w:p>
-      <w:pPr>
-        <w:numPr>
-          <w:ilvl w:val="0"/>
-          <w:numId w:val="1004"/>
-        </w:numPr>
-        <w:pStyle w:val="Compact"/>
-      </w:pPr>
-      <w:r>
-        <w:rPr>
-          <w:iCs/>
-          <w:i/>
-        </w:rPr>
-        <w:t xml:space="preserve">Settings → System → About → Advanced system settings → System Protection</w:t>
-      </w:r>
-      <w:r>
-        <w:t xml:space="preserve"> </w:t>
-      </w:r>
-      <w:r>
-        <w:t xml:space="preserve">→ confirm protection is</w:t>
-      </w:r>
-      <w:r>
-        <w:t xml:space="preserve"> </w:t>
-      </w:r>
-      <w:r>
-        <w:rPr>
-          <w:bCs/>
-          <w:b/>
-        </w:rPr>
-        <w:t xml:space="preserve">On</w:t>
-      </w:r>
-      <w:r>
-        <w:t xml:space="preserve"> </w:t>
-      </w:r>
-      <w:r>
-        <w:t xml:space="preserve">for</w:t>
-      </w:r>
-      <w:r>
-        <w:t xml:space="preserve"> </w:t>
-      </w:r>
-      <w:r>
-        <w:rPr>
-          <w:rStyle w:val="VerbatimChar"/>
-        </w:rPr>
-        <w:t xml:space="preserve">C:</w:t>
-      </w:r>
-      <w:r>
-        <w:t xml:space="preserve">.</w:t>
-      </w:r>
-    </w:p>
-    <w:p>
-      <w:pPr>
-        <w:numPr>
-          <w:ilvl w:val="0"/>
-          <w:numId w:val="1004"/>
-        </w:numPr>
-        <w:pStyle w:val="Compact"/>
-      </w:pPr>
-      <w:r>
-        <w:t xml:space="preserve">Note the current driver:</w:t>
-      </w:r>
-      <w:r>
-        <w:t xml:space="preserve"> </w:t>
-      </w:r>
-      <w:r>
-        <w:rPr>
-          <w:rStyle w:val="VerbatimChar"/>
-        </w:rPr>
-        <w:t xml:space="preserve">nvidia-smi --query-gpu=driver_version --format=csv,noheader &gt; driver-before.txt</w:t>
-      </w:r>
-    </w:p>
-    <w:p>
-      <w:pPr>
-        <w:numPr>
-          <w:ilvl w:val="0"/>
-          <w:numId w:val="1004"/>
-        </w:numPr>
-        <w:pStyle w:val="Compact"/>
-      </w:pPr>
-      <w:r>
-        <w:t xml:space="preserve">Manually create a restore point:</w:t>
-      </w:r>
-      <w:r>
-        <w:t xml:space="preserve"> </w:t>
-      </w:r>
-      <w:r>
-        <w:rPr>
-          <w:iCs/>
-          <w:i/>
-        </w:rPr>
-        <w:t xml:space="preserve">Start →</w:t>
-      </w:r>
-      <w:r>
-        <w:rPr>
-          <w:iCs/>
-          <w:i/>
-        </w:rPr>
-        <w:t xml:space="preserve"> </w:t>
-      </w:r>
-      <w:r>
-        <w:rPr>
-          <w:iCs/>
-          <w:i/>
-        </w:rPr>
-        <w:t xml:space="preserve">“</w:t>
-      </w:r>
-      <w:r>
-        <w:rPr>
-          <w:iCs/>
-          <w:i/>
-        </w:rPr>
-        <w:t xml:space="preserve">Create a restore point</w:t>
-      </w:r>
-      <w:r>
-        <w:rPr>
-          <w:iCs/>
-          <w:i/>
-        </w:rPr>
-        <w:t xml:space="preserve">”</w:t>
-      </w:r>
-      <w:r>
-        <w:rPr>
-          <w:iCs/>
-          <w:i/>
-        </w:rPr>
-        <w:t xml:space="preserve"> </w:t>
-      </w:r>
-      <w:r>
-        <w:rPr>
-          <w:iCs/>
-          <w:i/>
-        </w:rPr>
-        <w:t xml:space="preserve">→ Create</w:t>
-      </w:r>
-      <w:r>
-        <w:t xml:space="preserve">.</w:t>
-      </w:r>
-    </w:p>
-    <w:p>
-      <w:r>
-        <w:pict>
-          <v:rect style="width:0;height:1.5pt" o:hralign="center" o:hrstd="t" o:hr="t"/>
-        </w:pict>
-      </w:r>
-    </w:p>
-    <w:bookmarkEnd w:id="43"/>
-    <w:bookmarkEnd w:id="44"/>
-    <w:bookmarkStart w:id="45" w:name="wsl2-alternative"/>
-    <w:p>
-      <w:pPr>
-        <w:pStyle w:val="Heading2"/>
-      </w:pPr>
-      <w:r>
-        <w:t xml:space="preserve">9. WSL2 alternative</w:t>
-      </w:r>
-    </w:p>
-    <w:p>
-      <w:pPr>
-        <w:pStyle w:val="FirstParagraph"/>
-      </w:pPr>
-      <w:r>
-        <w:t xml:space="preserve">If you’d rather mirror the Linux setup exactly on this same Windows 11 machine:</w:t>
-      </w:r>
-    </w:p>
-    <w:p>
-      <w:pPr>
-        <w:pStyle w:val="SourceCode"/>
-      </w:pPr>
-      <w:r>
-        <w:rPr>
-          <w:rStyle w:val="NormalTok"/>
-        </w:rPr>
-        <w:t xml:space="preserve">wsl </w:t>
-      </w:r>
-      <w:r>
-        <w:rPr>
-          <w:rStyle w:val="OperatorTok"/>
-        </w:rPr>
-        <w:t xml:space="preserve">--</w:t>
-      </w:r>
-      <w:r>
-        <w:rPr>
-          <w:rStyle w:val="NormalTok"/>
-        </w:rPr>
-        <w:t xml:space="preserve">install </w:t>
-      </w:r>
-      <w:r>
-        <w:rPr>
-          <w:rStyle w:val="OperatorTok"/>
-        </w:rPr>
-        <w:t xml:space="preserve">-</w:t>
-      </w:r>
-      <w:r>
-        <w:rPr>
-          <w:rStyle w:val="NormalTok"/>
-        </w:rPr>
-        <w:t xml:space="preserve">d Ubuntu</w:t>
-      </w:r>
-      <w:r>
-        <w:rPr>
-          <w:rStyle w:val="OperatorTok"/>
-        </w:rPr>
-        <w:t xml:space="preserve">-</w:t>
-      </w:r>
-      <w:r>
-        <w:rPr>
-          <w:rStyle w:val="NormalTok"/>
-        </w:rPr>
-        <w:t xml:space="preserve">24</w:t>
-      </w:r>
-      <w:r>
-        <w:rPr>
-          <w:rStyle w:val="OperatorTok"/>
-        </w:rPr>
-        <w:t xml:space="preserve">.</w:t>
-      </w:r>
-      <w:r>
-        <w:rPr>
-          <w:rStyle w:val="FunctionTok"/>
-        </w:rPr>
-        <w:t xml:space="preserve">04</w:t>
-      </w:r>
-    </w:p>
-    <w:p>
-      <w:pPr>
-        <w:pStyle w:val="FirstParagraph"/>
-      </w:pPr>
-      <w:r>
-        <w:t xml:space="preserve">Reboot, complete the Ubuntu setup, then</w:t>
-      </w:r>
-      <w:r>
-        <w:t xml:space="preserve"> </w:t>
-      </w:r>
-      <w:r>
-        <w:rPr>
-          <w:bCs/>
-          <w:b/>
-        </w:rPr>
-        <w:t xml:space="preserve">inside WSL</w:t>
-      </w:r>
-      <w:r>
-        <w:t xml:space="preserve">:</w:t>
-      </w:r>
-    </w:p>
-    <w:p>
-      <w:pPr>
-        <w:pStyle w:val="SourceCode"/>
-      </w:pPr>
-      <w:r>
-        <w:rPr>
-          <w:rStyle w:val="CommentTok"/>
-        </w:rPr>
-        <w:t xml:space="preserve"># Use the Linux install script</w:t>
-      </w:r>
-      <w:r>
-        <w:br/>
-      </w:r>
-      <w:r>
-        <w:rPr>
-          <w:rStyle w:val="ExtensionTok"/>
-        </w:rPr>
-        <w:t xml:space="preserve">./scripts/install.sh</w:t>
-      </w:r>
-    </w:p>
-    <w:p>
-      <w:pPr>
-        <w:pStyle w:val="FirstParagraph"/>
-      </w:pPr>
-      <w:r>
-        <w:t xml:space="preserve">Important caveats:</w:t>
       </w:r>
     </w:p>
     <w:p>
@@ -8309,16 +10250,44 @@
       </w:pPr>
       <w:r>
         <w:rPr>
+          <w:iCs/>
+          <w:i/>
+        </w:rPr>
+        <w:t xml:space="preserve">Settings → System → About → Advanced system settings → System Protection</w:t>
+      </w:r>
+      <w:r>
+        <w:t xml:space="preserve"> </w:t>
+      </w:r>
+      <w:r>
+        <w:t xml:space="preserve">→ confirm protection is</w:t>
+      </w:r>
+      <w:r>
+        <w:t xml:space="preserve"> </w:t>
+      </w:r>
+      <w:r>
+        <w:rPr>
           <w:bCs/>
           <w:b/>
         </w:rPr>
-        <w:t xml:space="preserve">Install the Windows-side NVIDIA driver only.</w:t>
-      </w:r>
-      <w:r>
-        <w:t xml:space="preserve"> </w:t>
-      </w:r>
-      <w:r>
-        <w:t xml:space="preserve">Do not install a Linux driver inside WSL — Microsoft’s WSL kernel ships its own driver shim that talks to the Windows driver. Installing a Linux driver inside WSL will break GPU access.</w:t>
+        <w:t xml:space="preserve">On</w:t>
+      </w:r>
+      <w:r>
+        <w:t xml:space="preserve"> </w:t>
+      </w:r>
+      <w:r>
+        <w:t xml:space="preserve">for</w:t>
+      </w:r>
+      <w:r>
+        <w:t xml:space="preserve"> </w:t>
+      </w:r>
+      <w:r>
+        <w:rPr>
+          <w:rStyle w:val="VerbatimChar"/>
+        </w:rPr>
+        <w:t xml:space="preserve">C:</w:t>
+      </w:r>
+      <w:r>
+        <w:t xml:space="preserve">.</w:t>
       </w:r>
     </w:p>
     <w:p>
@@ -8330,7 +10299,16 @@
         <w:pStyle w:val="Compact"/>
       </w:pPr>
       <w:r>
-        <w:t xml:space="preserve">The Windows driver must be a recent version that supports the WSL CUDA shim — any modern Game Ready / Studio driver does.</w:t>
+        <w:t xml:space="preserve">Note the current driver:</w:t>
+      </w:r>
+      <w:r>
+        <w:t xml:space="preserve"> </w:t>
+      </w:r>
+      <w:r>
+        <w:rPr>
+          <w:rStyle w:val="VerbatimChar"/>
+        </w:rPr>
+        <w:t xml:space="preserve">nvidia-smi --query-gpu=driver_version --format=csv,noheader &gt; driver-before.txt</w:t>
       </w:r>
     </w:p>
     <w:p>
@@ -8342,23 +10320,258 @@
         <w:pStyle w:val="Compact"/>
       </w:pPr>
       <w:r>
-        <w:rPr>
-          <w:rStyle w:val="VerbatimChar"/>
-        </w:rPr>
-        <w:t xml:space="preserve">nvidia-smi</w:t>
-      </w:r>
-      <w:r>
-        <w:t xml:space="preserve"> </w:t>
-      </w:r>
-      <w:r>
-        <w:t xml:space="preserve">works inside WSL once you’ve installed CUDA in WSL — the GPU shows up as if it were native.</w:t>
+        <w:t xml:space="preserve">Manually create a restore point:</w:t>
+      </w:r>
+      <w:r>
+        <w:t xml:space="preserve"> </w:t>
+      </w:r>
+      <w:r>
+        <w:rPr>
+          <w:iCs/>
+          <w:i/>
+        </w:rPr>
+        <w:t xml:space="preserve">Start →</w:t>
+      </w:r>
+      <w:r>
+        <w:rPr>
+          <w:iCs/>
+          <w:i/>
+        </w:rPr>
+        <w:t xml:space="preserve"> </w:t>
+      </w:r>
+      <w:r>
+        <w:rPr>
+          <w:iCs/>
+          <w:i/>
+        </w:rPr>
+        <w:t xml:space="preserve">“</w:t>
+      </w:r>
+      <w:r>
+        <w:rPr>
+          <w:iCs/>
+          <w:i/>
+        </w:rPr>
+        <w:t xml:space="preserve">Create a restore point</w:t>
+      </w:r>
+      <w:r>
+        <w:rPr>
+          <w:iCs/>
+          <w:i/>
+        </w:rPr>
+        <w:t xml:space="preserve">”</w:t>
+      </w:r>
+      <w:r>
+        <w:rPr>
+          <w:iCs/>
+          <w:i/>
+        </w:rPr>
+        <w:t xml:space="preserve"> </w:t>
+      </w:r>
+      <w:r>
+        <w:rPr>
+          <w:iCs/>
+          <w:i/>
+        </w:rPr>
+        <w:t xml:space="preserve">→ Create</w:t>
+      </w:r>
+      <w:r>
+        <w:t xml:space="preserve">.</w:t>
+      </w:r>
+    </w:p>
+    <w:p>
+      <w:r>
+        <w:pict>
+          <v:rect style="width:0;height:1.5pt" o:hralign="center" o:hrstd="t" o:hr="t"/>
+        </w:pict>
+      </w:r>
+    </w:p>
+    <w:bookmarkEnd w:id="49"/>
+    <w:bookmarkEnd w:id="50"/>
+    <w:bookmarkStart w:id="51" w:name="wsl2-alternative"/>
+    <w:p>
+      <w:pPr>
+        <w:pStyle w:val="Heading2"/>
+      </w:pPr>
+      <w:r>
+        <w:t xml:space="preserve">9. WSL2 alternative</w:t>
+      </w:r>
+    </w:p>
+    <w:p>
+      <w:pPr>
+        <w:pStyle w:val="FirstParagraph"/>
+      </w:pPr>
+      <w:r>
+        <w:t xml:space="preserve">If you’d rather mirror the Linux setup exactly on this same Windows 11 machine:</w:t>
+      </w:r>
+    </w:p>
+    <w:p>
+      <w:pPr>
+        <w:pStyle w:val="SourceCode"/>
+      </w:pPr>
+      <w:r>
+        <w:rPr>
+          <w:rStyle w:val="NormalTok"/>
+        </w:rPr>
+        <w:t xml:space="preserve">wsl </w:t>
+      </w:r>
+      <w:r>
+        <w:rPr>
+          <w:rStyle w:val="OperatorTok"/>
+        </w:rPr>
+        <w:t xml:space="preserve">--</w:t>
+      </w:r>
+      <w:r>
+        <w:rPr>
+          <w:rStyle w:val="NormalTok"/>
+        </w:rPr>
+        <w:t xml:space="preserve">install </w:t>
+      </w:r>
+      <w:r>
+        <w:rPr>
+          <w:rStyle w:val="OperatorTok"/>
+        </w:rPr>
+        <w:t xml:space="preserve">-</w:t>
+      </w:r>
+      <w:r>
+        <w:rPr>
+          <w:rStyle w:val="NormalTok"/>
+        </w:rPr>
+        <w:t xml:space="preserve">d Ubuntu</w:t>
+      </w:r>
+      <w:r>
+        <w:rPr>
+          <w:rStyle w:val="OperatorTok"/>
+        </w:rPr>
+        <w:t xml:space="preserve">-</w:t>
+      </w:r>
+      <w:r>
+        <w:rPr>
+          <w:rStyle w:val="NormalTok"/>
+        </w:rPr>
+        <w:t xml:space="preserve">24</w:t>
+      </w:r>
+      <w:r>
+        <w:rPr>
+          <w:rStyle w:val="OperatorTok"/>
+        </w:rPr>
+        <w:t xml:space="preserve">.</w:t>
+      </w:r>
+      <w:r>
+        <w:rPr>
+          <w:rStyle w:val="FunctionTok"/>
+        </w:rPr>
+        <w:t xml:space="preserve">04</w:t>
+      </w:r>
+    </w:p>
+    <w:p>
+      <w:pPr>
+        <w:pStyle w:val="FirstParagraph"/>
+      </w:pPr>
+      <w:r>
+        <w:t xml:space="preserve">Reboot, complete the Ubuntu setup, then</w:t>
+      </w:r>
+      <w:r>
+        <w:t xml:space="preserve"> </w:t>
+      </w:r>
+      <w:r>
+        <w:rPr>
+          <w:bCs/>
+          <w:b/>
+        </w:rPr>
+        <w:t xml:space="preserve">inside WSL</w:t>
+      </w:r>
+      <w:r>
+        <w:t xml:space="preserve">:</w:t>
+      </w:r>
+    </w:p>
+    <w:p>
+      <w:pPr>
+        <w:pStyle w:val="SourceCode"/>
+      </w:pPr>
+      <w:r>
+        <w:rPr>
+          <w:rStyle w:val="CommentTok"/>
+        </w:rPr>
+        <w:t xml:space="preserve"># Use the Linux install script</w:t>
+      </w:r>
+      <w:r>
+        <w:br/>
+      </w:r>
+      <w:r>
+        <w:rPr>
+          <w:rStyle w:val="ExtensionTok"/>
+        </w:rPr>
+        <w:t xml:space="preserve">./scripts/install.sh</w:t>
+      </w:r>
+    </w:p>
+    <w:p>
+      <w:pPr>
+        <w:pStyle w:val="FirstParagraph"/>
+      </w:pPr>
+      <w:r>
+        <w:t xml:space="preserve">Important caveats:</w:t>
       </w:r>
     </w:p>
     <w:p>
       <w:pPr>
         <w:numPr>
           <w:ilvl w:val="0"/>
-          <w:numId w:val="1005"/>
+          <w:numId w:val="1006"/>
+        </w:numPr>
+        <w:pStyle w:val="Compact"/>
+      </w:pPr>
+      <w:r>
+        <w:rPr>
+          <w:bCs/>
+          <w:b/>
+        </w:rPr>
+        <w:t xml:space="preserve">Install the Windows-side NVIDIA driver only.</w:t>
+      </w:r>
+      <w:r>
+        <w:t xml:space="preserve"> </w:t>
+      </w:r>
+      <w:r>
+        <w:t xml:space="preserve">Do not install a Linux driver inside WSL — Microsoft’s WSL kernel ships its own driver shim that talks to the Windows driver. Installing a Linux driver inside WSL will break GPU access.</w:t>
+      </w:r>
+    </w:p>
+    <w:p>
+      <w:pPr>
+        <w:numPr>
+          <w:ilvl w:val="0"/>
+          <w:numId w:val="1006"/>
+        </w:numPr>
+        <w:pStyle w:val="Compact"/>
+      </w:pPr>
+      <w:r>
+        <w:t xml:space="preserve">The Windows driver must be a recent version that supports the WSL CUDA shim — any modern Game Ready / Studio driver does.</w:t>
+      </w:r>
+    </w:p>
+    <w:p>
+      <w:pPr>
+        <w:numPr>
+          <w:ilvl w:val="0"/>
+          <w:numId w:val="1006"/>
+        </w:numPr>
+        <w:pStyle w:val="Compact"/>
+      </w:pPr>
+      <w:r>
+        <w:rPr>
+          <w:rStyle w:val="VerbatimChar"/>
+        </w:rPr>
+        <w:t xml:space="preserve">nvidia-smi</w:t>
+      </w:r>
+      <w:r>
+        <w:t xml:space="preserve"> </w:t>
+      </w:r>
+      <w:r>
+        <w:t xml:space="preserve">works inside WSL once you’ve installed CUDA in WSL — the GPU shows up as if it were native.</w:t>
+      </w:r>
+    </w:p>
+    <w:p>
+      <w:pPr>
+        <w:numPr>
+          <w:ilvl w:val="0"/>
+          <w:numId w:val="1006"/>
         </w:numPr>
         <w:pStyle w:val="Compact"/>
       </w:pPr>
@@ -8613,8 +10826,8 @@
         </w:pict>
       </w:r>
     </w:p>
-    <w:bookmarkEnd w:id="45"/>
-    <w:bookmarkStart w:id="46" w:name="common-windows-specific-pitfalls"/>
+    <w:bookmarkEnd w:id="51"/>
+    <w:bookmarkStart w:id="52" w:name="common-windows-specific-pitfalls"/>
     <w:p>
       <w:pPr>
         <w:pStyle w:val="Heading2"/>
@@ -8627,7 +10840,7 @@
       <w:pPr>
         <w:numPr>
           <w:ilvl w:val="0"/>
-          <w:numId w:val="1006"/>
+          <w:numId w:val="1007"/>
         </w:numPr>
       </w:pPr>
       <w:r>
@@ -8710,7 +10923,7 @@
       <w:pPr>
         <w:numPr>
           <w:ilvl w:val="0"/>
-          <w:numId w:val="1006"/>
+          <w:numId w:val="1007"/>
         </w:numPr>
       </w:pPr>
       <w:r>
@@ -8816,7 +11029,7 @@
       <w:pPr>
         <w:numPr>
           <w:ilvl w:val="0"/>
-          <w:numId w:val="1006"/>
+          <w:numId w:val="1007"/>
         </w:numPr>
       </w:pPr>
       <w:r>
@@ -8963,7 +11176,7 @@
       <w:pPr>
         <w:numPr>
           <w:ilvl w:val="0"/>
-          <w:numId w:val="1006"/>
+          <w:numId w:val="1007"/>
         </w:numPr>
       </w:pPr>
       <w:r>
@@ -9018,181 +11231,6 @@
       </w:r>
       <w:r>
         <w:t xml:space="preserve">).</w:t>
-      </w:r>
-    </w:p>
-    <w:p>
-      <w:pPr>
-        <w:numPr>
-          <w:ilvl w:val="0"/>
-          <w:numId w:val="1006"/>
-        </w:numPr>
-      </w:pPr>
-      <w:r>
-        <w:rPr>
-          <w:bCs/>
-          <w:b/>
-        </w:rPr>
-        <w:t xml:space="preserve">Execution policy blocks</w:t>
-      </w:r>
-      <w:r>
-        <w:rPr>
-          <w:bCs/>
-          <w:b/>
-        </w:rPr>
-        <w:t xml:space="preserve"> </w:t>
-      </w:r>
-      <w:r>
-        <w:rPr>
-          <w:rStyle w:val="VerbatimChar"/>
-          <w:bCs/>
-          <w:b/>
-        </w:rPr>
-        <w:t xml:space="preserve">install.ps1</w:t>
-      </w:r>
-      <w:r>
-        <w:rPr>
-          <w:bCs/>
-          <w:b/>
-        </w:rPr>
-        <w:t xml:space="preserve">.</w:t>
-      </w:r>
-      <w:r>
-        <w:t xml:space="preserve"> </w:t>
-      </w:r>
-      <w:r>
-        <w:t xml:space="preserve">PowerShell refuses to run unsigned local scripts by default. Use</w:t>
-      </w:r>
-      <w:r>
-        <w:t xml:space="preserve"> </w:t>
-      </w:r>
-      <w:r>
-        <w:rPr>
-          <w:rStyle w:val="VerbatimChar"/>
-        </w:rPr>
-        <w:t xml:space="preserve">Set-ExecutionPolicy -Scope Process -ExecutionPolicy Bypass</w:t>
-      </w:r>
-      <w:r>
-        <w:t xml:space="preserve"> </w:t>
-      </w:r>
-      <w:r>
-        <w:t xml:space="preserve">for the current shell only — no permanent system change.</w:t>
-      </w:r>
-    </w:p>
-    <w:p>
-      <w:pPr>
-        <w:numPr>
-          <w:ilvl w:val="0"/>
-          <w:numId w:val="1006"/>
-        </w:numPr>
-      </w:pPr>
-      <w:r>
-        <w:rPr>
-          <w:bCs/>
-          <w:b/>
-        </w:rPr>
-        <w:t xml:space="preserve">PATH not refreshed.</w:t>
-      </w:r>
-      <w:r>
-        <w:t xml:space="preserve"> </w:t>
-      </w:r>
-      <w:r>
-        <w:t xml:space="preserve">After installing CUDA or VS Code via winget, the new</w:t>
-      </w:r>
-      <w:r>
-        <w:t xml:space="preserve"> </w:t>
-      </w:r>
-      <w:r>
-        <w:rPr>
-          <w:rStyle w:val="VerbatimChar"/>
-        </w:rPr>
-        <w:t xml:space="preserve">PATH</w:t>
-      </w:r>
-      <w:r>
-        <w:t xml:space="preserve"> </w:t>
-      </w:r>
-      <w:r>
-        <w:t xml:space="preserve">only takes effect in</w:t>
-      </w:r>
-      <w:r>
-        <w:t xml:space="preserve"> </w:t>
-      </w:r>
-      <w:r>
-        <w:rPr>
-          <w:bCs/>
-          <w:b/>
-        </w:rPr>
-        <w:t xml:space="preserve">new</w:t>
-      </w:r>
-      <w:r>
-        <w:t xml:space="preserve"> </w:t>
-      </w:r>
-      <w:r>
-        <w:t xml:space="preserve">shells. Close and re-open the terminal, don’t just retry in the same window.</w:t>
-      </w:r>
-    </w:p>
-    <w:p>
-      <w:pPr>
-        <w:numPr>
-          <w:ilvl w:val="0"/>
-          <w:numId w:val="1006"/>
-        </w:numPr>
-      </w:pPr>
-      <w:r>
-        <w:rPr>
-          <w:rStyle w:val="VerbatimChar"/>
-          <w:bCs/>
-          <w:b/>
-        </w:rPr>
-        <w:t xml:space="preserve">compute-sanitizer</w:t>
-      </w:r>
-      <w:r>
-        <w:rPr>
-          <w:bCs/>
-          <w:b/>
-        </w:rPr>
-        <w:t xml:space="preserve"> </w:t>
-      </w:r>
-      <w:r>
-        <w:rPr>
-          <w:bCs/>
-          <w:b/>
-        </w:rPr>
-        <w:t xml:space="preserve">works on Windows too</w:t>
-      </w:r>
-      <w:r>
-        <w:t xml:space="preserve"> </w:t>
-      </w:r>
-      <w:r>
-        <w:t xml:space="preserve">— same syntax:</w:t>
-      </w:r>
-      <w:r>
-        <w:t xml:space="preserve"> </w:t>
-      </w:r>
-      <w:r>
-        <w:rPr>
-          <w:rStyle w:val="VerbatimChar"/>
-        </w:rPr>
-        <w:t xml:space="preserve">compute-sanitizer build\vector_add.exe</w:t>
-      </w:r>
-      <w:r>
-        <w:t xml:space="preserve">. Always your first move when a kernel misbehaves.</w:t>
-      </w:r>
-    </w:p>
-    <w:p>
-      <w:r>
-        <w:pict>
-          <v:rect style="width:0;height:1.5pt" o:hralign="center" o:hrstd="t" o:hr="t"/>
-        </w:pict>
-      </w:r>
-    </w:p>
-    <w:bookmarkEnd w:id="46"/>
-    <w:bookmarkStart w:id="51" w:name="where-to-go-next"/>
-    <w:p>
-      <w:pPr>
-        <w:pStyle w:val="Heading2"/>
-      </w:pPr>
-      <w:r>
-        <w:t xml:space="preserve">11. Where to go next</w:t>
       </w:r>
     </w:p>
     <w:p>
@@ -9201,32 +11239,56 @@
           <w:ilvl w:val="0"/>
           <w:numId w:val="1007"/>
         </w:numPr>
-        <w:pStyle w:val="Compact"/>
       </w:pPr>
       <w:r>
         <w:rPr>
           <w:bCs/>
           <w:b/>
         </w:rPr>
-        <w:t xml:space="preserve">Tutorial</w:t>
-      </w:r>
-      <w:r>
-        <w:t xml:space="preserve">: see</w:t>
-      </w:r>
-      <w:r>
+        <w:t xml:space="preserve">Execution policy blocks</w:t>
+      </w:r>
+      <w:r>
+        <w:rPr>
+          <w:bCs/>
+          <w:b/>
+        </w:rPr>
         <w:t xml:space="preserve"> </w:t>
       </w:r>
       <w:r>
         <w:rPr>
           <w:rStyle w:val="VerbatimChar"/>
-        </w:rPr>
-        <w:t xml:space="preserve">docs/CUDA_TUTORIAL.md</w:t>
-      </w:r>
-      <w:r>
-        <w:t xml:space="preserve"> </w:t>
-      </w:r>
-      <w:r>
-        <w:t xml:space="preserve">— 19 sections, all examples are platform-neutral.</w:t>
+          <w:bCs/>
+          <w:b/>
+        </w:rPr>
+        <w:t xml:space="preserve">install.ps1</w:t>
+      </w:r>
+      <w:r>
+        <w:rPr>
+          <w:bCs/>
+          <w:b/>
+        </w:rPr>
+        <w:t xml:space="preserve">.</w:t>
+      </w:r>
+      <w:r>
+        <w:t xml:space="preserve"> </w:t>
+      </w:r>
+      <w:r>
+        <w:t xml:space="preserve">PowerShell refuses to run unsigned local scripts by default. Use</w:t>
+      </w:r>
+      <w:r>
+        <w:t xml:space="preserve"> </w:t>
+      </w:r>
+      <w:r>
+        <w:rPr>
+          <w:rStyle w:val="VerbatimChar"/>
+        </w:rPr>
+        <w:t xml:space="preserve">Set-ExecutionPolicy -Scope Process -ExecutionPolicy Bypass</w:t>
+      </w:r>
+      <w:r>
+        <w:t xml:space="preserve"> </w:t>
+      </w:r>
+      <w:r>
+        <w:t xml:space="preserve">for the current shell only — no permanent system change.</w:t>
       </w:r>
     </w:p>
     <w:p>
@@ -9235,13 +11297,164 @@
           <w:ilvl w:val="0"/>
           <w:numId w:val="1007"/>
         </w:numPr>
-        <w:pStyle w:val="Compact"/>
       </w:pPr>
       <w:r>
         <w:rPr>
           <w:bCs/>
           <w:b/>
         </w:rPr>
+        <w:t xml:space="preserve">PATH not refreshed.</w:t>
+      </w:r>
+      <w:r>
+        <w:t xml:space="preserve"> </w:t>
+      </w:r>
+      <w:r>
+        <w:t xml:space="preserve">After installing CUDA or VS Code via winget, the new</w:t>
+      </w:r>
+      <w:r>
+        <w:t xml:space="preserve"> </w:t>
+      </w:r>
+      <w:r>
+        <w:rPr>
+          <w:rStyle w:val="VerbatimChar"/>
+        </w:rPr>
+        <w:t xml:space="preserve">PATH</w:t>
+      </w:r>
+      <w:r>
+        <w:t xml:space="preserve"> </w:t>
+      </w:r>
+      <w:r>
+        <w:t xml:space="preserve">only takes effect in</w:t>
+      </w:r>
+      <w:r>
+        <w:t xml:space="preserve"> </w:t>
+      </w:r>
+      <w:r>
+        <w:rPr>
+          <w:bCs/>
+          <w:b/>
+        </w:rPr>
+        <w:t xml:space="preserve">new</w:t>
+      </w:r>
+      <w:r>
+        <w:t xml:space="preserve"> </w:t>
+      </w:r>
+      <w:r>
+        <w:t xml:space="preserve">shells. Close and re-open the terminal, don’t just retry in the same window.</w:t>
+      </w:r>
+    </w:p>
+    <w:p>
+      <w:pPr>
+        <w:numPr>
+          <w:ilvl w:val="0"/>
+          <w:numId w:val="1007"/>
+        </w:numPr>
+      </w:pPr>
+      <w:r>
+        <w:rPr>
+          <w:rStyle w:val="VerbatimChar"/>
+          <w:bCs/>
+          <w:b/>
+        </w:rPr>
+        <w:t xml:space="preserve">compute-sanitizer</w:t>
+      </w:r>
+      <w:r>
+        <w:rPr>
+          <w:bCs/>
+          <w:b/>
+        </w:rPr>
+        <w:t xml:space="preserve"> </w:t>
+      </w:r>
+      <w:r>
+        <w:rPr>
+          <w:bCs/>
+          <w:b/>
+        </w:rPr>
+        <w:t xml:space="preserve">works on Windows too</w:t>
+      </w:r>
+      <w:r>
+        <w:t xml:space="preserve"> </w:t>
+      </w:r>
+      <w:r>
+        <w:t xml:space="preserve">— same syntax:</w:t>
+      </w:r>
+      <w:r>
+        <w:t xml:space="preserve"> </w:t>
+      </w:r>
+      <w:r>
+        <w:rPr>
+          <w:rStyle w:val="VerbatimChar"/>
+        </w:rPr>
+        <w:t xml:space="preserve">compute-sanitizer build\vector_add.exe</w:t>
+      </w:r>
+      <w:r>
+        <w:t xml:space="preserve">. Always your first move when a kernel misbehaves.</w:t>
+      </w:r>
+    </w:p>
+    <w:p>
+      <w:r>
+        <w:pict>
+          <v:rect style="width:0;height:1.5pt" o:hralign="center" o:hrstd="t" o:hr="t"/>
+        </w:pict>
+      </w:r>
+    </w:p>
+    <w:bookmarkEnd w:id="52"/>
+    <w:bookmarkStart w:id="57" w:name="where-to-go-next"/>
+    <w:p>
+      <w:pPr>
+        <w:pStyle w:val="Heading2"/>
+      </w:pPr>
+      <w:r>
+        <w:t xml:space="preserve">11. Where to go next</w:t>
+      </w:r>
+    </w:p>
+    <w:p>
+      <w:pPr>
+        <w:numPr>
+          <w:ilvl w:val="0"/>
+          <w:numId w:val="1008"/>
+        </w:numPr>
+        <w:pStyle w:val="Compact"/>
+      </w:pPr>
+      <w:r>
+        <w:rPr>
+          <w:bCs/>
+          <w:b/>
+        </w:rPr>
+        <w:t xml:space="preserve">Tutorial</w:t>
+      </w:r>
+      <w:r>
+        <w:t xml:space="preserve">: see</w:t>
+      </w:r>
+      <w:r>
+        <w:t xml:space="preserve"> </w:t>
+      </w:r>
+      <w:r>
+        <w:rPr>
+          <w:rStyle w:val="VerbatimChar"/>
+        </w:rPr>
+        <w:t xml:space="preserve">docs/CUDA_TUTORIAL.md</w:t>
+      </w:r>
+      <w:r>
+        <w:t xml:space="preserve"> </w:t>
+      </w:r>
+      <w:r>
+        <w:t xml:space="preserve">— 19 sections, all examples are platform-neutral.</w:t>
+      </w:r>
+    </w:p>
+    <w:p>
+      <w:pPr>
+        <w:numPr>
+          <w:ilvl w:val="0"/>
+          <w:numId w:val="1008"/>
+        </w:numPr>
+        <w:pStyle w:val="Compact"/>
+      </w:pPr>
+      <w:r>
+        <w:rPr>
+          <w:bCs/>
+          <w:b/>
+        </w:rPr>
         <w:t xml:space="preserve">NVIDIA Programming Guide</w:t>
       </w:r>
       <w:r>
@@ -9250,7 +11463,7 @@
       <w:r>
         <w:t xml:space="preserve"> </w:t>
       </w:r>
-      <w:hyperlink r:id="rId47">
+      <w:hyperlink r:id="rId53">
         <w:r>
           <w:rPr>
             <w:rStyle w:val="Hyperlink"/>
@@ -9263,7 +11476,7 @@
       <w:pPr>
         <w:numPr>
           <w:ilvl w:val="0"/>
-          <w:numId w:val="1007"/>
+          <w:numId w:val="1008"/>
         </w:numPr>
         <w:pStyle w:val="Compact"/>
       </w:pPr>
@@ -9280,7 +11493,7 @@
       <w:r>
         <w:t xml:space="preserve"> </w:t>
       </w:r>
-      <w:hyperlink r:id="rId48">
+      <w:hyperlink r:id="rId54">
         <w:r>
           <w:rPr>
             <w:rStyle w:val="Hyperlink"/>
@@ -9293,7 +11506,7 @@
       <w:pPr>
         <w:numPr>
           <w:ilvl w:val="0"/>
-          <w:numId w:val="1007"/>
+          <w:numId w:val="1008"/>
         </w:numPr>
         <w:pStyle w:val="Compact"/>
       </w:pPr>
@@ -9310,7 +11523,7 @@
       <w:r>
         <w:t xml:space="preserve"> </w:t>
       </w:r>
-      <w:hyperlink r:id="rId49">
+      <w:hyperlink r:id="rId55">
         <w:r>
           <w:rPr>
             <w:rStyle w:val="Hyperlink"/>
@@ -9323,7 +11536,7 @@
       <w:pPr>
         <w:numPr>
           <w:ilvl w:val="0"/>
-          <w:numId w:val="1007"/>
+          <w:numId w:val="1008"/>
         </w:numPr>
         <w:pStyle w:val="Compact"/>
       </w:pPr>
@@ -9340,7 +11553,7 @@
       <w:r>
         <w:t xml:space="preserve"> </w:t>
       </w:r>
-      <w:hyperlink r:id="rId50">
+      <w:hyperlink r:id="rId56">
         <w:r>
           <w:rPr>
             <w:rStyle w:val="Hyperlink"/>
@@ -9349,8 +11562,8 @@
         </w:r>
       </w:hyperlink>
     </w:p>
-    <w:bookmarkEnd w:id="51"/>
-    <w:bookmarkEnd w:id="52"/>
+    <w:bookmarkEnd w:id="57"/>
+    <w:bookmarkEnd w:id="58"/>
     <w:sectPr/>
   </w:body>
 </w:document>
@@ -9457,6 +11670,82 @@
       </w:pPr>
     </w:lvl>
   </w:abstractNum>
+  <w:abstractNum w:abstractNumId="991">
+    <w:nsid w:val="A991"/>
+    <w:multiLevelType w:val="multilevel"/>
+    <w:lvl w:ilvl="0">
+      <w:numFmt w:val="bullet"/>
+      <w:lvlText w:val="•"/>
+      <w:lvlJc w:val="left"/>
+      <w:pPr>
+        <w:ind w:left="720" w:hanging="480"/>
+      </w:pPr>
+    </w:lvl>
+    <w:lvl w:ilvl="1">
+      <w:numFmt w:val="bullet"/>
+      <w:lvlText w:val="–"/>
+      <w:lvlJc w:val="left"/>
+      <w:pPr>
+        <w:ind w:left="1440" w:hanging="480"/>
+      </w:pPr>
+    </w:lvl>
+    <w:lvl w:ilvl="2">
+      <w:numFmt w:val="bullet"/>
+      <w:lvlText w:val="•"/>
+      <w:lvlJc w:val="left"/>
+      <w:pPr>
+        <w:ind w:left="2160" w:hanging="480"/>
+      </w:pPr>
+    </w:lvl>
+    <w:lvl w:ilvl="3">
+      <w:numFmt w:val="bullet"/>
+      <w:lvlText w:val="–"/>
+      <w:lvlJc w:val="left"/>
+      <w:pPr>
+        <w:ind w:left="2880" w:hanging="480"/>
+      </w:pPr>
+    </w:lvl>
+    <w:lvl w:ilvl="4">
+      <w:numFmt w:val="bullet"/>
+      <w:lvlText w:val="•"/>
+      <w:lvlJc w:val="left"/>
+      <w:pPr>
+        <w:ind w:left="3600" w:hanging="480"/>
+      </w:pPr>
+    </w:lvl>
+    <w:lvl w:ilvl="5">
+      <w:numFmt w:val="bullet"/>
+      <w:lvlText w:val="–"/>
+      <w:lvlJc w:val="left"/>
+      <w:pPr>
+        <w:ind w:left="4320" w:hanging="480"/>
+      </w:pPr>
+    </w:lvl>
+    <w:lvl w:ilvl="6">
+      <w:numFmt w:val="bullet"/>
+      <w:lvlText w:val="•"/>
+      <w:lvlJc w:val="left"/>
+      <w:pPr>
+        <w:ind w:left="5040" w:hanging="480"/>
+      </w:pPr>
+    </w:lvl>
+    <w:lvl w:ilvl="7">
+      <w:numFmt w:val="bullet"/>
+      <w:lvlText w:val="–"/>
+      <w:lvlJc w:val="left"/>
+      <w:pPr>
+        <w:ind w:left="5760" w:hanging="480"/>
+      </w:pPr>
+    </w:lvl>
+    <w:lvl w:ilvl="8">
+      <w:numFmt w:val="bullet"/>
+      <w:lvlText w:val="•"/>
+      <w:lvlJc w:val="left"/>
+      <w:pPr>
+        <w:ind w:left="6480" w:hanging="480"/>
+      </w:pPr>
+    </w:lvl>
+  </w:abstractNum>
   <w:abstractNum w:abstractNumId="99411">
     <w:nsid w:val="A99411"/>
     <w:multiLevelType w:val="multilevel"/>
@@ -9542,114 +11831,11 @@
       </w:pPr>
     </w:lvl>
   </w:abstractNum>
-  <w:abstractNum w:abstractNumId="991">
-    <w:nsid w:val="A991"/>
-    <w:multiLevelType w:val="multilevel"/>
-    <w:lvl w:ilvl="0">
-      <w:numFmt w:val="bullet"/>
-      <w:lvlText w:val="•"/>
-      <w:lvlJc w:val="left"/>
-      <w:pPr>
-        <w:ind w:left="720" w:hanging="480"/>
-      </w:pPr>
-    </w:lvl>
-    <w:lvl w:ilvl="1">
-      <w:numFmt w:val="bullet"/>
-      <w:lvlText w:val="–"/>
-      <w:lvlJc w:val="left"/>
-      <w:pPr>
-        <w:ind w:left="1440" w:hanging="480"/>
-      </w:pPr>
-    </w:lvl>
-    <w:lvl w:ilvl="2">
-      <w:numFmt w:val="bullet"/>
-      <w:lvlText w:val="•"/>
-      <w:lvlJc w:val="left"/>
-      <w:pPr>
-        <w:ind w:left="2160" w:hanging="480"/>
-      </w:pPr>
-    </w:lvl>
-    <w:lvl w:ilvl="3">
-      <w:numFmt w:val="bullet"/>
-      <w:lvlText w:val="–"/>
-      <w:lvlJc w:val="left"/>
-      <w:pPr>
-        <w:ind w:left="2880" w:hanging="480"/>
-      </w:pPr>
-    </w:lvl>
-    <w:lvl w:ilvl="4">
-      <w:numFmt w:val="bullet"/>
-      <w:lvlText w:val="•"/>
-      <w:lvlJc w:val="left"/>
-      <w:pPr>
-        <w:ind w:left="3600" w:hanging="480"/>
-      </w:pPr>
-    </w:lvl>
-    <w:lvl w:ilvl="5">
-      <w:numFmt w:val="bullet"/>
-      <w:lvlText w:val="–"/>
-      <w:lvlJc w:val="left"/>
-      <w:pPr>
-        <w:ind w:left="4320" w:hanging="480"/>
-      </w:pPr>
-    </w:lvl>
-    <w:lvl w:ilvl="6">
-      <w:numFmt w:val="bullet"/>
-      <w:lvlText w:val="•"/>
-      <w:lvlJc w:val="left"/>
-      <w:pPr>
-        <w:ind w:left="5040" w:hanging="480"/>
-      </w:pPr>
-    </w:lvl>
-    <w:lvl w:ilvl="7">
-      <w:numFmt w:val="bullet"/>
-      <w:lvlText w:val="–"/>
-      <w:lvlJc w:val="left"/>
-      <w:pPr>
-        <w:ind w:left="5760" w:hanging="480"/>
-      </w:pPr>
-    </w:lvl>
-    <w:lvl w:ilvl="8">
-      <w:numFmt w:val="bullet"/>
-      <w:lvlText w:val="•"/>
-      <w:lvlJc w:val="left"/>
-      <w:pPr>
-        <w:ind w:left="6480" w:hanging="480"/>
-      </w:pPr>
-    </w:lvl>
-  </w:abstractNum>
   <w:num w:numId="1000">
     <w:abstractNumId w:val="990"/>
   </w:num>
   <w:num w:numId="1001">
-    <w:abstractNumId w:val="99411"/>
-    <w:lvlOverride w:ilvl="0">
-      <w:startOverride w:val="1"/>
-    </w:lvlOverride>
-    <w:lvlOverride w:ilvl="1">
-      <w:startOverride w:val="1"/>
-    </w:lvlOverride>
-    <w:lvlOverride w:ilvl="2">
-      <w:startOverride w:val="1"/>
-    </w:lvlOverride>
-    <w:lvlOverride w:ilvl="3">
-      <w:startOverride w:val="1"/>
-    </w:lvlOverride>
-    <w:lvlOverride w:ilvl="4">
-      <w:startOverride w:val="1"/>
-    </w:lvlOverride>
-    <w:lvlOverride w:ilvl="5">
-      <w:startOverride w:val="1"/>
-    </w:lvlOverride>
-    <w:lvlOverride w:ilvl="6">
-      <w:startOverride w:val="1"/>
-    </w:lvlOverride>
-    <w:lvlOverride w:ilvl="7">
-      <w:startOverride w:val="1"/>
-    </w:lvlOverride>
-    <w:lvlOverride w:ilvl="8">
-      <w:startOverride w:val="1"/>
-    </w:lvlOverride>
+    <w:abstractNumId w:val="991"/>
   </w:num>
   <w:num w:numId="1002">
     <w:abstractNumId w:val="99411"/>
@@ -9712,12 +11898,6 @@
     </w:lvlOverride>
   </w:num>
   <w:num w:numId="1004">
-    <w:abstractNumId w:val="991"/>
-  </w:num>
-  <w:num w:numId="1005">
-    <w:abstractNumId w:val="991"/>
-  </w:num>
-  <w:num w:numId="1006">
     <w:abstractNumId w:val="99411"/>
     <w:lvlOverride w:ilvl="0">
       <w:startOverride w:val="1"/>
@@ -9747,7 +11927,43 @@
       <w:startOverride w:val="1"/>
     </w:lvlOverride>
   </w:num>
+  <w:num w:numId="1005">
+    <w:abstractNumId w:val="991"/>
+  </w:num>
+  <w:num w:numId="1006">
+    <w:abstractNumId w:val="991"/>
+  </w:num>
   <w:num w:numId="1007">
+    <w:abstractNumId w:val="99411"/>
+    <w:lvlOverride w:ilvl="0">
+      <w:startOverride w:val="1"/>
+    </w:lvlOverride>
+    <w:lvlOverride w:ilvl="1">
+      <w:startOverride w:val="1"/>
+    </w:lvlOverride>
+    <w:lvlOverride w:ilvl="2">
+      <w:startOverride w:val="1"/>
+    </w:lvlOverride>
+    <w:lvlOverride w:ilvl="3">
+      <w:startOverride w:val="1"/>
+    </w:lvlOverride>
+    <w:lvlOverride w:ilvl="4">
+      <w:startOverride w:val="1"/>
+    </w:lvlOverride>
+    <w:lvlOverride w:ilvl="5">
+      <w:startOverride w:val="1"/>
+    </w:lvlOverride>
+    <w:lvlOverride w:ilvl="6">
+      <w:startOverride w:val="1"/>
+    </w:lvlOverride>
+    <w:lvlOverride w:ilvl="7">
+      <w:startOverride w:val="1"/>
+    </w:lvlOverride>
+    <w:lvlOverride w:ilvl="8">
+      <w:startOverride w:val="1"/>
+    </w:lvlOverride>
+  </w:num>
+  <w:num w:numId="1008">
     <w:abstractNumId w:val="991"/>
   </w:num>
 </w:numbering>

</xml_diff>

<commit_message>
Add info for the RX 1000 Pro
</commit_message>
<xml_diff>
--- a/docs/SetupWindows.docx
+++ b/docs/SetupWindows.docx
@@ -2,7 +2,7 @@
 <file path=word/document.xml><?xml version="1.0" encoding="utf-8"?>
 <w:document xmlns:w="http://schemas.openxmlformats.org/wordprocessingml/2006/main" xmlns:m="http://schemas.openxmlformats.org/officeDocument/2006/math" xmlns:r="http://schemas.openxmlformats.org/officeDocument/2006/relationships" xmlns:o="urn:schemas-microsoft-com:office:office" xmlns:v="urn:schemas-microsoft-com:vml" xmlns:w10="urn:schemas-microsoft-com:office:word" xmlns:a="http://schemas.openxmlformats.org/drawingml/2006/main" xmlns:pic="http://schemas.openxmlformats.org/drawingml/2006/picture" xmlns:wp="http://schemas.openxmlformats.org/drawingml/2006/wordprocessingDrawing">
   <w:body>
-    <w:bookmarkStart w:id="58" w:name="Xf67453e095810f651d0f1f1371aded0ff409dd7"/>
+    <w:bookmarkStart w:id="59" w:name="Xf67453e095810f651d0f1f1371aded0ff409dd7"/>
     <w:p>
       <w:pPr>
         <w:pStyle w:val="Heading1"/>
@@ -1657,13 +1657,160 @@
           </w:p>
         </w:tc>
       </w:tr>
+      <w:tr>
+        <w:tc>
+          <w:tcPr/>
+          <w:p>
+            <w:pPr>
+              <w:pStyle w:val="Compact"/>
+              <w:jc w:val="left"/>
+            </w:pPr>
+            <w:r>
+              <w:rPr>
+                <w:bCs/>
+                <w:b/>
+              </w:rPr>
+              <w:t xml:space="preserve">RTX Pro Mobile Blackwell (Pro 500 / 1000 / 2000 / 3000 / 4000 / 5000)</w:t>
+            </w:r>
+          </w:p>
+        </w:tc>
+        <w:tc>
+          <w:tcPr/>
+          <w:p>
+            <w:pPr>
+              <w:pStyle w:val="Compact"/>
+              <w:jc w:val="left"/>
+            </w:pPr>
+            <w:r>
+              <w:rPr>
+                <w:bCs/>
+                <w:b/>
+              </w:rPr>
+              <w:t xml:space="preserve">Blackwell (workstation)</w:t>
+            </w:r>
+          </w:p>
+        </w:tc>
+        <w:tc>
+          <w:tcPr/>
+          <w:p>
+            <w:pPr>
+              <w:pStyle w:val="Compact"/>
+              <w:jc w:val="left"/>
+            </w:pPr>
+            <w:r>
+              <w:rPr>
+                <w:rStyle w:val="VerbatimChar"/>
+                <w:bCs/>
+                <w:b/>
+              </w:rPr>
+              <w:t xml:space="preserve">12.0</w:t>
+            </w:r>
+          </w:p>
+        </w:tc>
+        <w:tc>
+          <w:tcPr/>
+          <w:p>
+            <w:pPr>
+              <w:pStyle w:val="Compact"/>
+              <w:jc w:val="left"/>
+            </w:pPr>
+            <w:r>
+              <w:t xml:space="preserve">Fully supported. Requires driver ≥570 and</w:t>
+            </w:r>
+            <w:r>
+              <w:t xml:space="preserve"> </w:t>
+            </w:r>
+            <w:r>
+              <w:rPr>
+                <w:bCs/>
+                <w:b/>
+              </w:rPr>
+              <w:t xml:space="preserve">CUDA ≥12.8</w:t>
+            </w:r>
+            <w:r>
+              <w:t xml:space="preserve"> </w:t>
+            </w:r>
+            <w:r>
+              <w:t xml:space="preserve">(12.8 added sm_120 support). Use latest CUDA 13.x for best support.</w:t>
+            </w:r>
+          </w:p>
+        </w:tc>
+      </w:tr>
+      <w:tr>
+        <w:tc>
+          <w:tcPr/>
+          <w:p>
+            <w:pPr>
+              <w:pStyle w:val="Compact"/>
+              <w:jc w:val="left"/>
+            </w:pPr>
+            <w:r>
+              <w:t xml:space="preserve">RTX Pro 6000 Blackwell (desktop workstation)</w:t>
+            </w:r>
+          </w:p>
+        </w:tc>
+        <w:tc>
+          <w:tcPr/>
+          <w:p>
+            <w:pPr>
+              <w:pStyle w:val="Compact"/>
+              <w:jc w:val="left"/>
+            </w:pPr>
+            <w:r>
+              <w:t xml:space="preserve">Blackwell (datacenter-derived)</w:t>
+            </w:r>
+          </w:p>
+        </w:tc>
+        <w:tc>
+          <w:tcPr/>
+          <w:p>
+            <w:pPr>
+              <w:pStyle w:val="Compact"/>
+              <w:jc w:val="left"/>
+            </w:pPr>
+            <w:r>
+              <w:rPr>
+                <w:rStyle w:val="VerbatimChar"/>
+              </w:rPr>
+              <w:t xml:space="preserve">12.2</w:t>
+            </w:r>
+          </w:p>
+        </w:tc>
+        <w:tc>
+          <w:tcPr/>
+          <w:p>
+            <w:pPr>
+              <w:pStyle w:val="Compact"/>
+              <w:jc w:val="left"/>
+            </w:pPr>
+            <w:r>
+              <w:t xml:space="preserve">Different chip from the mobile Pro line — uses sm_122. Driver ≥570, CUDA ≥12.8.</w:t>
+            </w:r>
+          </w:p>
+        </w:tc>
+      </w:tr>
     </w:tbl>
     <w:p>
       <w:pPr>
         <w:pStyle w:val="BodyText"/>
       </w:pPr>
       <w:r>
-        <w:t xml:space="preserve">If your card isn’t in this short list, the official page above is authoritative.</w:t>
+        <w:t xml:space="preserve">If your card isn’t in this short list, the official page above is authoritative. Note that NVIDIA’s</w:t>
+      </w:r>
+      <w:r>
+        <w:t xml:space="preserve"> </w:t>
+      </w:r>
+      <w:r>
+        <w:rPr>
+          <w:rStyle w:val="VerbatimChar"/>
+        </w:rPr>
+        <w:t xml:space="preserve">developer.nvidia.com/cuda-gpus</w:t>
+      </w:r>
+      <w:r>
+        <w:t xml:space="preserve"> </w:t>
+      </w:r>
+      <w:r>
+        <w:t xml:space="preserve">page sometimes lags new releases by months — for very recent cards, cross-reference the model’s launch architecture instead.</w:t>
       </w:r>
     </w:p>
     <w:bookmarkEnd w:id="23"/>
@@ -8858,7 +9005,7 @@
       </w:r>
     </w:p>
     <w:bookmarkEnd w:id="41"/>
-    <w:bookmarkStart w:id="43" w:name="build-run"/>
+    <w:bookmarkStart w:id="44" w:name="build-run"/>
     <w:p>
       <w:pPr>
         <w:pStyle w:val="Heading2"/>
@@ -9062,13 +9209,13 @@
         <w:t xml:space="preserve">build\vector_add.exe</w:t>
       </w:r>
     </w:p>
-    <w:bookmarkStart w:id="42" w:name="Xd8bb07a8add34718e466f0587d7cf5eee5cdb7b"/>
+    <w:bookmarkStart w:id="42" w:name="Xd8fe450c5dcc1af49404ce2acb6f8b080be20ff"/>
     <w:p>
       <w:pPr>
         <w:pStyle w:val="Heading3"/>
       </w:pPr>
       <w:r>
-        <w:t xml:space="preserve">Override the GPU architecture for your laptop card</w:t>
+        <w:t xml:space="preserve">GPU architecture — auto-detected by default</w:t>
       </w:r>
     </w:p>
     <w:p>
@@ -9091,7 +9238,7 @@
         <w:t xml:space="preserve"> </w:t>
       </w:r>
       <w:r>
-        <w:t xml:space="preserve">in this repo defaults to</w:t>
+        <w:t xml:space="preserve">defaults to</w:t>
       </w:r>
       <w:r>
         <w:t xml:space="preserve"> </w:t>
@@ -9100,474 +9247,20 @@
         <w:rPr>
           <w:rStyle w:val="VerbatimChar"/>
         </w:rPr>
-        <w:t xml:space="preserve">61</w:t>
-      </w:r>
-      <w:r>
-        <w:t xml:space="preserve"> </w:t>
-      </w:r>
-      <w:r>
-        <w:t xml:space="preserve">(Pascal, GTX 1050 Ti) since that’s the desktop hardware it was scaffolded on. For a modern laptop GPU, override at configure time:</w:t>
-      </w:r>
-    </w:p>
-    <w:p>
-      <w:pPr>
-        <w:pStyle w:val="SourceCode"/>
-      </w:pPr>
-      <w:r>
-        <w:rPr>
-          <w:rStyle w:val="NormalTok"/>
-        </w:rPr>
-        <w:t xml:space="preserve">cmake </w:t>
-      </w:r>
-      <w:r>
-        <w:rPr>
-          <w:rStyle w:val="AttributeTok"/>
-        </w:rPr>
-        <w:t xml:space="preserve">-S</w:t>
-      </w:r>
-      <w:r>
-        <w:rPr>
-          <w:rStyle w:val="NormalTok"/>
-        </w:rPr>
-        <w:t xml:space="preserve"> . </w:t>
-      </w:r>
-      <w:r>
-        <w:rPr>
-          <w:rStyle w:val="AttributeTok"/>
-        </w:rPr>
-        <w:t xml:space="preserve">-B</w:t>
-      </w:r>
-      <w:r>
-        <w:rPr>
-          <w:rStyle w:val="NormalTok"/>
-        </w:rPr>
-        <w:t xml:space="preserve"> build </w:t>
-      </w:r>
-      <w:r>
-        <w:rPr>
-          <w:rStyle w:val="AttributeTok"/>
-        </w:rPr>
-        <w:t xml:space="preserve">-G</w:t>
-      </w:r>
-      <w:r>
-        <w:rPr>
-          <w:rStyle w:val="NormalTok"/>
-        </w:rPr>
-        <w:t xml:space="preserve"> Ninja </w:t>
-      </w:r>
-      <w:r>
-        <w:rPr>
-          <w:rStyle w:val="AttributeTok"/>
-        </w:rPr>
-        <w:t xml:space="preserve">-DCMAKE_CUDA_ARCHITECTURES</w:t>
-      </w:r>
-      <w:r>
-        <w:rPr>
-          <w:rStyle w:val="NormalTok"/>
-        </w:rPr>
-        <w:t xml:space="preserve">=86</w:t>
-      </w:r>
-    </w:p>
-    <w:p>
-      <w:pPr>
-        <w:pStyle w:val="FirstParagraph"/>
-      </w:pPr>
-      <w:r>
-        <w:t xml:space="preserve">Common values:</w:t>
-      </w:r>
-    </w:p>
-    <w:tbl>
-      <w:tblPr>
-        <w:tblStyle w:val="Table"/>
-        <w:tblW w:type="auto" w:w="0"/>
-        <w:tblLook w:firstRow="1" w:lastRow="0" w:firstColumn="0" w:lastColumn="0" w:noHBand="0" w:noVBand="0" w:val="0020"/>
-        <w:jc w:val="start"/>
-      </w:tblPr>
-      <w:tblGrid>
-        <w:gridCol w:w="2640"/>
-        <w:gridCol w:w="2640"/>
-        <w:gridCol w:w="2640"/>
-      </w:tblGrid>
-      <w:tr>
-        <w:trPr>
-          <w:tblHeader w:val="true"/>
-        </w:trPr>
-        <w:tc>
-          <w:tcPr/>
-          <w:p>
-            <w:pPr>
-              <w:pStyle w:val="Compact"/>
-              <w:jc w:val="left"/>
-            </w:pPr>
-            <w:r>
-              <w:t xml:space="preserve">Architecture</w:t>
-            </w:r>
-          </w:p>
-        </w:tc>
-        <w:tc>
-          <w:tcPr/>
-          <w:p>
-            <w:pPr>
-              <w:pStyle w:val="Compact"/>
-              <w:jc w:val="left"/>
-            </w:pPr>
-            <w:r>
-              <w:t xml:space="preserve">Compute capability</w:t>
-            </w:r>
-          </w:p>
-        </w:tc>
-        <w:tc>
-          <w:tcPr/>
-          <w:p>
-            <w:pPr>
-              <w:pStyle w:val="Compact"/>
-              <w:jc w:val="left"/>
-            </w:pPr>
-            <w:r>
-              <w:t xml:space="preserve">Example cards</w:t>
-            </w:r>
-          </w:p>
-        </w:tc>
-      </w:tr>
-      <w:tr>
-        <w:tc>
-          <w:tcPr/>
-          <w:p>
-            <w:pPr>
-              <w:pStyle w:val="Compact"/>
-              <w:jc w:val="left"/>
-            </w:pPr>
-            <w:r>
-              <w:t xml:space="preserve">Pascal</w:t>
-            </w:r>
-          </w:p>
-        </w:tc>
-        <w:tc>
-          <w:tcPr/>
-          <w:p>
-            <w:pPr>
-              <w:pStyle w:val="Compact"/>
-              <w:jc w:val="left"/>
-            </w:pPr>
-            <w:r>
-              <w:rPr>
-                <w:rStyle w:val="VerbatimChar"/>
-              </w:rPr>
-              <w:t xml:space="preserve">61</w:t>
-            </w:r>
-          </w:p>
-        </w:tc>
-        <w:tc>
-          <w:tcPr/>
-          <w:p>
-            <w:pPr>
-              <w:pStyle w:val="Compact"/>
-              <w:jc w:val="left"/>
-            </w:pPr>
-            <w:r>
-              <w:t xml:space="preserve">GTX 1050 Ti, 1080</w:t>
-            </w:r>
-          </w:p>
-        </w:tc>
-      </w:tr>
-      <w:tr>
-        <w:tc>
-          <w:tcPr/>
-          <w:p>
-            <w:pPr>
-              <w:pStyle w:val="Compact"/>
-              <w:jc w:val="left"/>
-            </w:pPr>
-            <w:r>
-              <w:t xml:space="preserve">Turing</w:t>
-            </w:r>
-          </w:p>
-        </w:tc>
-        <w:tc>
-          <w:tcPr/>
-          <w:p>
-            <w:pPr>
-              <w:pStyle w:val="Compact"/>
-              <w:jc w:val="left"/>
-            </w:pPr>
-            <w:r>
-              <w:rPr>
-                <w:rStyle w:val="VerbatimChar"/>
-              </w:rPr>
-              <w:t xml:space="preserve">75</w:t>
-            </w:r>
-          </w:p>
-        </w:tc>
-        <w:tc>
-          <w:tcPr/>
-          <w:p>
-            <w:pPr>
-              <w:pStyle w:val="Compact"/>
-              <w:jc w:val="left"/>
-            </w:pPr>
-            <w:r>
-              <w:t xml:space="preserve">GTX 1660, RTX 2060</w:t>
-            </w:r>
-          </w:p>
-        </w:tc>
-      </w:tr>
-      <w:tr>
-        <w:tc>
-          <w:tcPr/>
-          <w:p>
-            <w:pPr>
-              <w:pStyle w:val="Compact"/>
-              <w:jc w:val="left"/>
-            </w:pPr>
-            <w:r>
-              <w:t xml:space="preserve">Ampere</w:t>
-            </w:r>
-          </w:p>
-        </w:tc>
-        <w:tc>
-          <w:tcPr/>
-          <w:p>
-            <w:pPr>
-              <w:pStyle w:val="Compact"/>
-              <w:jc w:val="left"/>
-            </w:pPr>
-            <w:r>
-              <w:rPr>
-                <w:rStyle w:val="VerbatimChar"/>
-              </w:rPr>
-              <w:t xml:space="preserve">80</w:t>
-            </w:r>
-            <w:r>
-              <w:t xml:space="preserve"> </w:t>
-            </w:r>
-            <w:r>
-              <w:t xml:space="preserve">/</w:t>
-            </w:r>
-            <w:r>
-              <w:t xml:space="preserve"> </w:t>
-            </w:r>
-            <w:r>
-              <w:rPr>
-                <w:rStyle w:val="VerbatimChar"/>
-              </w:rPr>
-              <w:t xml:space="preserve">86</w:t>
-            </w:r>
-          </w:p>
-        </w:tc>
-        <w:tc>
-          <w:tcPr/>
-          <w:p>
-            <w:pPr>
-              <w:pStyle w:val="Compact"/>
-              <w:jc w:val="left"/>
-            </w:pPr>
-            <w:r>
-              <w:t xml:space="preserve">A100 (80) / RTX 30-series (86)</w:t>
-            </w:r>
-          </w:p>
-        </w:tc>
-      </w:tr>
-      <w:tr>
-        <w:tc>
-          <w:tcPr/>
-          <w:p>
-            <w:pPr>
-              <w:pStyle w:val="Compact"/>
-              <w:jc w:val="left"/>
-            </w:pPr>
-            <w:r>
-              <w:t xml:space="preserve">Ada</w:t>
-            </w:r>
-          </w:p>
-        </w:tc>
-        <w:tc>
-          <w:tcPr/>
-          <w:p>
-            <w:pPr>
-              <w:pStyle w:val="Compact"/>
-              <w:jc w:val="left"/>
-            </w:pPr>
-            <w:r>
-              <w:rPr>
-                <w:rStyle w:val="VerbatimChar"/>
-              </w:rPr>
-              <w:t xml:space="preserve">89</w:t>
-            </w:r>
-          </w:p>
-        </w:tc>
-        <w:tc>
-          <w:tcPr/>
-          <w:p>
-            <w:pPr>
-              <w:pStyle w:val="Compact"/>
-              <w:jc w:val="left"/>
-            </w:pPr>
-            <w:r>
-              <w:t xml:space="preserve">RTX 40-series</w:t>
-            </w:r>
-          </w:p>
-        </w:tc>
-      </w:tr>
-      <w:tr>
-        <w:tc>
-          <w:tcPr/>
-          <w:p>
-            <w:pPr>
-              <w:pStyle w:val="Compact"/>
-              <w:jc w:val="left"/>
-            </w:pPr>
-            <w:r>
-              <w:t xml:space="preserve">Hopper</w:t>
-            </w:r>
-          </w:p>
-        </w:tc>
-        <w:tc>
-          <w:tcPr/>
-          <w:p>
-            <w:pPr>
-              <w:pStyle w:val="Compact"/>
-              <w:jc w:val="left"/>
-            </w:pPr>
-            <w:r>
-              <w:rPr>
-                <w:rStyle w:val="VerbatimChar"/>
-              </w:rPr>
-              <w:t xml:space="preserve">90</w:t>
-            </w:r>
-          </w:p>
-        </w:tc>
-        <w:tc>
-          <w:tcPr/>
-          <w:p>
-            <w:pPr>
-              <w:pStyle w:val="Compact"/>
-              <w:jc w:val="left"/>
-            </w:pPr>
-            <w:r>
-              <w:t xml:space="preserve">H100</w:t>
-            </w:r>
-          </w:p>
-        </w:tc>
-      </w:tr>
-      <w:tr>
-        <w:tc>
-          <w:tcPr/>
-          <w:p>
-            <w:pPr>
-              <w:pStyle w:val="Compact"/>
-              <w:jc w:val="left"/>
-            </w:pPr>
-            <w:r>
-              <w:t xml:space="preserve">Blackwell</w:t>
-            </w:r>
-          </w:p>
-        </w:tc>
-        <w:tc>
-          <w:tcPr/>
-          <w:p>
-            <w:pPr>
-              <w:pStyle w:val="Compact"/>
-              <w:jc w:val="left"/>
-            </w:pPr>
-            <w:r>
-              <w:rPr>
-                <w:rStyle w:val="VerbatimChar"/>
-              </w:rPr>
-              <w:t xml:space="preserve">100</w:t>
-            </w:r>
-            <w:r>
-              <w:t xml:space="preserve"> </w:t>
-            </w:r>
-            <w:r>
-              <w:t xml:space="preserve">/</w:t>
-            </w:r>
-            <w:r>
-              <w:t xml:space="preserve"> </w:t>
-            </w:r>
-            <w:r>
-              <w:rPr>
-                <w:rStyle w:val="VerbatimChar"/>
-              </w:rPr>
-              <w:t xml:space="preserve">120</w:t>
-            </w:r>
-          </w:p>
-        </w:tc>
-        <w:tc>
-          <w:tcPr/>
-          <w:p>
-            <w:pPr>
-              <w:pStyle w:val="Compact"/>
-              <w:jc w:val="left"/>
-            </w:pPr>
-            <w:r>
-              <w:t xml:space="preserve">RTX 50-series</w:t>
-            </w:r>
-          </w:p>
-        </w:tc>
-      </w:tr>
-    </w:tbl>
-    <w:p>
-      <w:pPr>
-        <w:pStyle w:val="BodyText"/>
-      </w:pPr>
-      <w:r>
-        <w:t xml:space="preserve">Find yours at</w:t>
-      </w:r>
-      <w:r>
-        <w:t xml:space="preserve"> </w:t>
-      </w:r>
-      <w:hyperlink r:id="rId22">
-        <w:r>
-          <w:rPr>
-            <w:rStyle w:val="Hyperlink"/>
-          </w:rPr>
-          <w:t xml:space="preserve">https://developer.nvidia.com/cuda-gpus</w:t>
-        </w:r>
-      </w:hyperlink>
-      <w:r>
-        <w:t xml:space="preserve">.</w:t>
-      </w:r>
-    </w:p>
-    <w:p>
-      <w:r>
-        <w:pict>
-          <v:rect style="width:0;height:1.5pt" o:hralign="center" o:hrstd="t" o:hr="t"/>
-        </w:pict>
-      </w:r>
-    </w:p>
-    <w:bookmarkEnd w:id="42"/>
-    <w:bookmarkEnd w:id="43"/>
-    <w:bookmarkStart w:id="44" w:name="verify-the-install"/>
-    <w:p>
-      <w:pPr>
-        <w:pStyle w:val="Heading2"/>
-      </w:pPr>
-      <w:r>
-        <w:t xml:space="preserve">7. Verify the install</w:t>
-      </w:r>
-    </w:p>
-    <w:p>
-      <w:pPr>
-        <w:pStyle w:val="FirstParagraph"/>
-      </w:pPr>
-      <w:r>
-        <w:t xml:space="preserve">In an</w:t>
-      </w:r>
-      <w:r>
-        <w:t xml:space="preserve"> </w:t>
+        <w:t xml:space="preserve">CMAKE_CUDA_ARCHITECTURES=native</w:t>
+      </w:r>
+      <w:r>
+        <w:t xml:space="preserve">, which queries the local GPU at configure time and picks the right compute capability automatically. So on a Blackwell laptop (e.g. </w:t>
       </w:r>
       <w:r>
         <w:rPr>
           <w:bCs/>
           <w:b/>
         </w:rPr>
-        <w:t xml:space="preserve">x64 Native Tools</w:t>
-      </w:r>
-      <w:r>
-        <w:t xml:space="preserve"> </w:t>
-      </w:r>
-      <w:r>
-        <w:t xml:space="preserve">prompt:</w:t>
+        <w:t xml:space="preserve">RTX Pro 1000 Blackwell</w:t>
+      </w:r>
+      <w:r>
+        <w:t xml:space="preserve">, sm_120) the same command above just works — no override needed:</w:t>
       </w:r>
     </w:p>
     <w:p>
@@ -9578,124 +9271,122 @@
         <w:rPr>
           <w:rStyle w:val="NormalTok"/>
         </w:rPr>
-        <w:t xml:space="preserve">nvidia-smi              :: driver visible, GPU listed</w:t>
-      </w:r>
-      <w:r>
-        <w:br/>
-      </w:r>
-      <w:r>
-        <w:rPr>
-          <w:rStyle w:val="NormalTok"/>
-        </w:rPr>
-        <w:t xml:space="preserve">nvcc -</w:t>
+        <w:t xml:space="preserve">cmake </w:t>
       </w:r>
       <w:r>
         <w:rPr>
           <w:rStyle w:val="AttributeTok"/>
         </w:rPr>
-        <w:t xml:space="preserve">-version</w:t>
-      </w:r>
-      <w:r>
-        <w:rPr>
-          <w:rStyle w:val="NormalTok"/>
-        </w:rPr>
-        <w:t xml:space="preserve">          :: should report 12.x</w:t>
-      </w:r>
-      <w:r>
-        <w:br/>
-      </w:r>
-      <w:r>
-        <w:rPr>
-          <w:rStyle w:val="NormalTok"/>
-        </w:rPr>
-        <w:t xml:space="preserve">ninja -</w:t>
+        <w:t xml:space="preserve">-S</w:t>
+      </w:r>
+      <w:r>
+        <w:rPr>
+          <w:rStyle w:val="NormalTok"/>
+        </w:rPr>
+        <w:t xml:space="preserve"> . </w:t>
       </w:r>
       <w:r>
         <w:rPr>
           <w:rStyle w:val="AttributeTok"/>
         </w:rPr>
-        <w:t xml:space="preserve">-version</w:t>
-      </w:r>
-      <w:r>
-        <w:br/>
-      </w:r>
-      <w:r>
-        <w:rPr>
-          <w:rStyle w:val="NormalTok"/>
-        </w:rPr>
-        <w:t xml:space="preserve">cmake -</w:t>
+        <w:t xml:space="preserve">-B</w:t>
+      </w:r>
+      <w:r>
+        <w:rPr>
+          <w:rStyle w:val="NormalTok"/>
+        </w:rPr>
+        <w:t xml:space="preserve"> build </w:t>
       </w:r>
       <w:r>
         <w:rPr>
           <w:rStyle w:val="AttributeTok"/>
         </w:rPr>
-        <w:t xml:space="preserve">-version</w:t>
-      </w:r>
-      <w:r>
-        <w:rPr>
-          <w:rStyle w:val="NormalTok"/>
-        </w:rPr>
-        <w:t xml:space="preserve">         :: </w:t>
-      </w:r>
-      <w:r>
-        <w:rPr>
-          <w:rStyle w:val="KeywordTok"/>
-        </w:rPr>
-        <w:t xml:space="preserve">&gt;</w:t>
-      </w:r>
-      <w:r>
-        <w:rPr>
-          <w:rStyle w:val="NormalTok"/>
-        </w:rPr>
-        <w:t xml:space="preserve">= 3.24</w:t>
-      </w:r>
-      <w:r>
-        <w:br/>
-      </w:r>
-      <w:r>
-        <w:rPr>
-          <w:rStyle w:val="NormalTok"/>
-        </w:rPr>
-        <w:t xml:space="preserve">cl                      :: should print Microsoft C</w:t>
+        <w:t xml:space="preserve">-G</w:t>
+      </w:r>
+      <w:r>
+        <w:rPr>
+          <w:rStyle w:val="NormalTok"/>
+        </w:rPr>
+        <w:t xml:space="preserve"> Ninja </w:t>
       </w:r>
       <w:r>
         <w:rPr>
           <w:rStyle w:val="AttributeTok"/>
         </w:rPr>
-        <w:t xml:space="preserve">/C</w:t>
-      </w:r>
-      <w:r>
-        <w:rPr>
-          <w:rStyle w:val="NormalTok"/>
-        </w:rPr>
-        <w:t xml:space="preserve">++ Compiler banner</w:t>
-      </w:r>
-      <w:r>
-        <w:br/>
-      </w:r>
-      <w:r>
-        <w:rPr>
-          <w:rStyle w:val="NormalTok"/>
-        </w:rPr>
-        <w:t xml:space="preserve">code -</w:t>
+        <w:t xml:space="preserve">-DCMAKE_BUILD_TYPE</w:t>
+      </w:r>
+      <w:r>
+        <w:rPr>
+          <w:rStyle w:val="NormalTok"/>
+        </w:rPr>
+        <w:t xml:space="preserve">=Release</w:t>
+      </w:r>
+    </w:p>
+    <w:p>
+      <w:pPr>
+        <w:pStyle w:val="FirstParagraph"/>
+      </w:pPr>
+      <w:r>
+        <w:t xml:space="preserve">To pin a specific architecture (e.g. for cross-compiling, distributing a binary, or building on a machine without the target GPU present), override:</w:t>
+      </w:r>
+    </w:p>
+    <w:p>
+      <w:pPr>
+        <w:pStyle w:val="SourceCode"/>
+      </w:pPr>
+      <w:r>
+        <w:rPr>
+          <w:rStyle w:val="NormalTok"/>
+        </w:rPr>
+        <w:t xml:space="preserve">cmake </w:t>
       </w:r>
       <w:r>
         <w:rPr>
           <w:rStyle w:val="AttributeTok"/>
         </w:rPr>
-        <w:t xml:space="preserve">-list-extensions</w:t>
-      </w:r>
-      <w:r>
-        <w:rPr>
-          <w:rStyle w:val="NormalTok"/>
-        </w:rPr>
-        <w:t xml:space="preserve">  :: should include nsight, cpptools, cmake</w:t>
+        <w:t xml:space="preserve">-S</w:t>
+      </w:r>
+      <w:r>
+        <w:rPr>
+          <w:rStyle w:val="NormalTok"/>
+        </w:rPr>
+        <w:t xml:space="preserve"> . </w:t>
       </w:r>
       <w:r>
         <w:rPr>
           <w:rStyle w:val="AttributeTok"/>
         </w:rPr>
-        <w:t xml:space="preserve">-tools</w:t>
+        <w:t xml:space="preserve">-B</w:t>
+      </w:r>
+      <w:r>
+        <w:rPr>
+          <w:rStyle w:val="NormalTok"/>
+        </w:rPr>
+        <w:t xml:space="preserve"> build </w:t>
+      </w:r>
+      <w:r>
+        <w:rPr>
+          <w:rStyle w:val="AttributeTok"/>
+        </w:rPr>
+        <w:t xml:space="preserve">-G</w:t>
+      </w:r>
+      <w:r>
+        <w:rPr>
+          <w:rStyle w:val="NormalTok"/>
+        </w:rPr>
+        <w:t xml:space="preserve"> Ninja </w:t>
+      </w:r>
+      <w:r>
+        <w:rPr>
+          <w:rStyle w:val="AttributeTok"/>
+        </w:rPr>
+        <w:t xml:space="preserve">-DCMAKE_CUDA_ARCHITECTURES</w:t>
+      </w:r>
+      <w:r>
+        <w:rPr>
+          <w:rStyle w:val="NormalTok"/>
+        </w:rPr>
+        <w:t xml:space="preserve">=120</w:t>
       </w:r>
     </w:p>
     <w:p>
@@ -9703,880 +9394,7 @@
         <w:pStyle w:val="FirstParagraph"/>
       </w:pPr>
       <w:r>
-        <w:t xml:space="preserve">Then build and run; success looks like:</w:t>
-      </w:r>
-    </w:p>
-    <w:p>
-      <w:pPr>
-        <w:pStyle w:val="SourceCode"/>
-      </w:pPr>
-      <w:r>
-        <w:rPr>
-          <w:rStyle w:val="VerbatimChar"/>
-        </w:rPr>
-        <w:t xml:space="preserve">OK: 1048576 elements added on GPU</w:t>
-      </w:r>
-    </w:p>
-    <w:p>
-      <w:r>
-        <w:pict>
-          <v:rect style="width:0;height:1.5pt" o:hralign="center" o:hrstd="t" o:hr="t"/>
-        </w:pict>
-      </w:r>
-    </w:p>
-    <w:bookmarkEnd w:id="44"/>
-    <w:bookmarkStart w:id="50" w:name="driver-rollback-on-windows"/>
-    <w:p>
-      <w:pPr>
-        <w:pStyle w:val="Heading2"/>
-      </w:pPr>
-      <w:r>
-        <w:t xml:space="preserve">8. Driver rollback on Windows</w:t>
-      </w:r>
-    </w:p>
-    <w:p>
-      <w:pPr>
-        <w:pStyle w:val="FirstParagraph"/>
-      </w:pPr>
-      <w:r>
-        <w:t xml:space="preserve">If a new driver causes problems, Windows gives you three escalating recovery options. They map roughly to the Linux</w:t>
-      </w:r>
-      <w:r>
-        <w:t xml:space="preserve"> </w:t>
-      </w:r>
-      <w:r>
-        <w:rPr>
-          <w:iCs/>
-          <w:i/>
-        </w:rPr>
-        <w:t xml:space="preserve">Timeshift / apt downgrade / nouveau</w:t>
-      </w:r>
-      <w:r>
-        <w:t xml:space="preserve"> </w:t>
-      </w:r>
-      <w:r>
-        <w:t xml:space="preserve">tiers.</w:t>
-      </w:r>
-    </w:p>
-    <w:bookmarkStart w:id="45" w:name="roll-back-via-device-manager-gentlest"/>
-    <w:p>
-      <w:pPr>
-        <w:pStyle w:val="Heading3"/>
-      </w:pPr>
-      <w:r>
-        <w:t xml:space="preserve">8.1 Roll back via Device Manager (gentlest)</w:t>
-      </w:r>
-    </w:p>
-    <w:p>
-      <w:pPr>
-        <w:pStyle w:val="FirstParagraph"/>
-      </w:pPr>
-      <w:r>
-        <w:t xml:space="preserve">Best when Windows still boots and the new driver is the obvious culprit.</w:t>
-      </w:r>
-    </w:p>
-    <w:p>
-      <w:pPr>
-        <w:numPr>
-          <w:ilvl w:val="0"/>
-          <w:numId w:val="1002"/>
-        </w:numPr>
-        <w:pStyle w:val="Compact"/>
-      </w:pPr>
-      <w:r>
-        <w:rPr>
-          <w:iCs/>
-          <w:i/>
-        </w:rPr>
-        <w:t xml:space="preserve">Start menu → Device Manager</w:t>
-      </w:r>
-      <w:r>
-        <w:t xml:space="preserve">.</w:t>
-      </w:r>
-    </w:p>
-    <w:p>
-      <w:pPr>
-        <w:numPr>
-          <w:ilvl w:val="0"/>
-          <w:numId w:val="1002"/>
-        </w:numPr>
-        <w:pStyle w:val="Compact"/>
-      </w:pPr>
-      <w:r>
-        <w:rPr>
-          <w:iCs/>
-          <w:i/>
-        </w:rPr>
-        <w:t xml:space="preserve">Display adapters</w:t>
-      </w:r>
-      <w:r>
-        <w:t xml:space="preserve"> </w:t>
-      </w:r>
-      <w:r>
-        <w:t xml:space="preserve">→ right-click your NVIDIA GPU →</w:t>
-      </w:r>
-      <w:r>
-        <w:t xml:space="preserve"> </w:t>
-      </w:r>
-      <w:r>
-        <w:rPr>
-          <w:iCs/>
-          <w:i/>
-        </w:rPr>
-        <w:t xml:space="preserve">Properties</w:t>
-      </w:r>
-      <w:r>
-        <w:t xml:space="preserve">.</w:t>
-      </w:r>
-    </w:p>
-    <w:p>
-      <w:pPr>
-        <w:numPr>
-          <w:ilvl w:val="0"/>
-          <w:numId w:val="1002"/>
-        </w:numPr>
-        <w:pStyle w:val="Compact"/>
-      </w:pPr>
-      <w:r>
-        <w:rPr>
-          <w:iCs/>
-          <w:i/>
-        </w:rPr>
-        <w:t xml:space="preserve">Driver</w:t>
-      </w:r>
-      <w:r>
-        <w:t xml:space="preserve"> </w:t>
-      </w:r>
-      <w:r>
-        <w:t xml:space="preserve">tab →</w:t>
-      </w:r>
-      <w:r>
-        <w:t xml:space="preserve"> </w:t>
-      </w:r>
-      <w:r>
-        <w:rPr>
-          <w:bCs/>
-          <w:b/>
-        </w:rPr>
-        <w:t xml:space="preserve">Roll Back Driver</w:t>
-      </w:r>
-      <w:r>
-        <w:t xml:space="preserve">.</w:t>
-      </w:r>
-    </w:p>
-    <w:p>
-      <w:pPr>
-        <w:numPr>
-          <w:ilvl w:val="0"/>
-          <w:numId w:val="1002"/>
-        </w:numPr>
-        <w:pStyle w:val="Compact"/>
-      </w:pPr>
-      <w:r>
-        <w:t xml:space="preserve">Pick a reason, click OK, reboot.</w:t>
-      </w:r>
-    </w:p>
-    <w:p>
-      <w:pPr>
-        <w:pStyle w:val="FirstParagraph"/>
-      </w:pPr>
-      <w:r>
-        <w:t xml:space="preserve">This restores the</w:t>
-      </w:r>
-      <w:r>
-        <w:t xml:space="preserve"> </w:t>
-      </w:r>
-      <w:r>
-        <w:rPr>
-          <w:bCs/>
-          <w:b/>
-        </w:rPr>
-        <w:t xml:space="preserve">immediately previous</w:t>
-      </w:r>
-      <w:r>
-        <w:t xml:space="preserve"> </w:t>
-      </w:r>
-      <w:r>
-        <w:t xml:space="preserve">driver Windows kept staged. If the button is greyed out, no previous driver is available — try §8.2.</w:t>
-      </w:r>
-    </w:p>
-    <w:bookmarkEnd w:id="45"/>
-    <w:bookmarkStart w:id="46" w:name="system-restore-medium"/>
-    <w:p>
-      <w:pPr>
-        <w:pStyle w:val="Heading3"/>
-      </w:pPr>
-      <w:r>
-        <w:t xml:space="preserve">8.2 System Restore (medium)</w:t>
-      </w:r>
-    </w:p>
-    <w:p>
-      <w:pPr>
-        <w:pStyle w:val="FirstParagraph"/>
-      </w:pPr>
-      <w:r>
-        <w:t xml:space="preserve">Windows automatically takes a restore point before driver installs (if System Protection is enabled — check</w:t>
-      </w:r>
-      <w:r>
-        <w:t xml:space="preserve"> </w:t>
-      </w:r>
-      <w:r>
-        <w:rPr>
-          <w:iCs/>
-          <w:i/>
-        </w:rPr>
-        <w:t xml:space="preserve">Settings → System → About → Advanced system settings → System Protection</w:t>
-      </w:r>
-      <w:r>
-        <w:t xml:space="preserve">).</w:t>
-      </w:r>
-    </w:p>
-    <w:p>
-      <w:pPr>
-        <w:numPr>
-          <w:ilvl w:val="0"/>
-          <w:numId w:val="1003"/>
-        </w:numPr>
-        <w:pStyle w:val="Compact"/>
-      </w:pPr>
-      <w:r>
-        <w:rPr>
-          <w:iCs/>
-          <w:i/>
-        </w:rPr>
-        <w:t xml:space="preserve">Start menu →</w:t>
-      </w:r>
-      <w:r>
-        <w:rPr>
-          <w:iCs/>
-          <w:i/>
-        </w:rPr>
-        <w:t xml:space="preserve"> </w:t>
-      </w:r>
-      <w:r>
-        <w:rPr>
-          <w:iCs/>
-          <w:i/>
-        </w:rPr>
-        <w:t xml:space="preserve">“</w:t>
-      </w:r>
-      <w:r>
-        <w:rPr>
-          <w:iCs/>
-          <w:i/>
-        </w:rPr>
-        <w:t xml:space="preserve">Create a restore point</w:t>
-      </w:r>
-      <w:r>
-        <w:rPr>
-          <w:iCs/>
-          <w:i/>
-        </w:rPr>
-        <w:t xml:space="preserve">”</w:t>
-      </w:r>
-      <w:r>
-        <w:t xml:space="preserve">.</w:t>
-      </w:r>
-    </w:p>
-    <w:p>
-      <w:pPr>
-        <w:numPr>
-          <w:ilvl w:val="0"/>
-          <w:numId w:val="1003"/>
-        </w:numPr>
-        <w:pStyle w:val="Compact"/>
-      </w:pPr>
-      <w:r>
-        <w:rPr>
-          <w:iCs/>
-          <w:i/>
-        </w:rPr>
-        <w:t xml:space="preserve">System Restore…</w:t>
-      </w:r>
-      <w:r>
-        <w:t xml:space="preserve"> </w:t>
-      </w:r>
-      <w:r>
-        <w:t xml:space="preserve">→ pick a point dated</w:t>
-      </w:r>
-      <w:r>
-        <w:t xml:space="preserve"> </w:t>
-      </w:r>
-      <w:r>
-        <w:rPr>
-          <w:iCs/>
-          <w:i/>
-        </w:rPr>
-        <w:t xml:space="preserve">before</w:t>
-      </w:r>
-      <w:r>
-        <w:t xml:space="preserve"> </w:t>
-      </w:r>
-      <w:r>
-        <w:t xml:space="preserve">the driver install →</w:t>
-      </w:r>
-      <w:r>
-        <w:t xml:space="preserve"> </w:t>
-      </w:r>
-      <w:r>
-        <w:rPr>
-          <w:iCs/>
-          <w:i/>
-        </w:rPr>
-        <w:t xml:space="preserve">Next</w:t>
-      </w:r>
-      <w:r>
-        <w:t xml:space="preserve"> </w:t>
-      </w:r>
-      <w:r>
-        <w:t xml:space="preserve">→</w:t>
-      </w:r>
-      <w:r>
-        <w:t xml:space="preserve"> </w:t>
-      </w:r>
-      <w:r>
-        <w:rPr>
-          <w:iCs/>
-          <w:i/>
-        </w:rPr>
-        <w:t xml:space="preserve">Finish</w:t>
-      </w:r>
-      <w:r>
-        <w:t xml:space="preserve">.</w:t>
-      </w:r>
-    </w:p>
-    <w:p>
-      <w:pPr>
-        <w:numPr>
-          <w:ilvl w:val="0"/>
-          <w:numId w:val="1003"/>
-        </w:numPr>
-        <w:pStyle w:val="Compact"/>
-      </w:pPr>
-      <w:r>
-        <w:t xml:space="preserve">Windows reboots into the restored state.</w:t>
-      </w:r>
-    </w:p>
-    <w:p>
-      <w:pPr>
-        <w:pStyle w:val="FirstParagraph"/>
-      </w:pPr>
-      <w:r>
-        <w:t xml:space="preserve">This reverts driver + registry changes without affecting your files.</w:t>
-      </w:r>
-    </w:p>
-    <w:bookmarkEnd w:id="46"/>
-    <w:bookmarkStart w:id="48" w:name="X3a09383cb05e81505884310cfc5fca4084af4b2"/>
-    <w:p>
-      <w:pPr>
-        <w:pStyle w:val="Heading3"/>
-      </w:pPr>
-      <w:r>
-        <w:t xml:space="preserve">8.3 DDU (Display Driver Uninstaller) — nuclear option</w:t>
-      </w:r>
-    </w:p>
-    <w:p>
-      <w:pPr>
-        <w:pStyle w:val="FirstParagraph"/>
-      </w:pPr>
-      <w:r>
-        <w:t xml:space="preserve">When the install is wedged badly enough that neither rollback method works:</w:t>
-      </w:r>
-    </w:p>
-    <w:p>
-      <w:pPr>
-        <w:numPr>
-          <w:ilvl w:val="0"/>
-          <w:numId w:val="1004"/>
-        </w:numPr>
-        <w:pStyle w:val="Compact"/>
-      </w:pPr>
-      <w:r>
-        <w:t xml:space="preserve">Download</w:t>
-      </w:r>
-      <w:r>
-        <w:t xml:space="preserve"> </w:t>
-      </w:r>
-      <w:r>
-        <w:rPr>
-          <w:bCs/>
-          <w:b/>
-        </w:rPr>
-        <w:t xml:space="preserve">DDU</w:t>
-      </w:r>
-      <w:r>
-        <w:t xml:space="preserve"> </w:t>
-      </w:r>
-      <w:r>
-        <w:t xml:space="preserve">from</w:t>
-      </w:r>
-      <w:r>
-        <w:t xml:space="preserve"> </w:t>
-      </w:r>
-      <w:hyperlink r:id="rId47">
-        <w:r>
-          <w:rPr>
-            <w:rStyle w:val="Hyperlink"/>
-          </w:rPr>
-          <w:t xml:space="preserve">https://www.guru3d.com/files-categories/category/display-driver-uninstaller-ddu/</w:t>
-        </w:r>
-      </w:hyperlink>
-      <w:r>
-        <w:t xml:space="preserve">.</w:t>
-      </w:r>
-    </w:p>
-    <w:p>
-      <w:pPr>
-        <w:numPr>
-          <w:ilvl w:val="0"/>
-          <w:numId w:val="1004"/>
-        </w:numPr>
-        <w:pStyle w:val="Compact"/>
-      </w:pPr>
-      <w:r>
-        <w:t xml:space="preserve">Boot Windows in</w:t>
-      </w:r>
-      <w:r>
-        <w:t xml:space="preserve"> </w:t>
-      </w:r>
-      <w:r>
-        <w:rPr>
-          <w:bCs/>
-          <w:b/>
-        </w:rPr>
-        <w:t xml:space="preserve">Safe Mode</w:t>
-      </w:r>
-      <w:r>
-        <w:t xml:space="preserve"> </w:t>
-      </w:r>
-      <w:r>
-        <w:t xml:space="preserve">(</w:t>
-      </w:r>
-      <w:r>
-        <w:rPr>
-          <w:iCs/>
-          <w:i/>
-        </w:rPr>
-        <w:t xml:space="preserve">Settings → System → Recovery → Advanced startup → Restart now → Troubleshoot → Advanced options → Startup Settings → Restart → 4</w:t>
-      </w:r>
-      <w:r>
-        <w:t xml:space="preserve">).</w:t>
-      </w:r>
-    </w:p>
-    <w:p>
-      <w:pPr>
-        <w:numPr>
-          <w:ilvl w:val="0"/>
-          <w:numId w:val="1004"/>
-        </w:numPr>
-        <w:pStyle w:val="Compact"/>
-      </w:pPr>
-      <w:r>
-        <w:t xml:space="preserve">Run DDU →</w:t>
-      </w:r>
-      <w:r>
-        <w:t xml:space="preserve"> </w:t>
-      </w:r>
-      <w:r>
-        <w:rPr>
-          <w:iCs/>
-          <w:i/>
-        </w:rPr>
-        <w:t xml:space="preserve">Clean and shutdown</w:t>
-      </w:r>
-      <w:r>
-        <w:t xml:space="preserve">.</w:t>
-      </w:r>
-    </w:p>
-    <w:p>
-      <w:pPr>
-        <w:numPr>
-          <w:ilvl w:val="0"/>
-          <w:numId w:val="1004"/>
-        </w:numPr>
-        <w:pStyle w:val="Compact"/>
-      </w:pPr>
-      <w:r>
-        <w:t xml:space="preserve">Boot normally; install a known-good driver (a specific version from</w:t>
-      </w:r>
-      <w:r>
-        <w:t xml:space="preserve"> </w:t>
-      </w:r>
-      <w:hyperlink r:id="rId29">
-        <w:r>
-          <w:rPr>
-            <w:rStyle w:val="Hyperlink"/>
-          </w:rPr>
-          <w:t xml:space="preserve">https://www.nvidia.com/Download/index.aspx</w:t>
-        </w:r>
-      </w:hyperlink>
-      <w:r>
-        <w:t xml:space="preserve">).</w:t>
-      </w:r>
-    </w:p>
-    <w:p>
-      <w:pPr>
-        <w:pStyle w:val="FirstParagraph"/>
-      </w:pPr>
-      <w:r>
-        <w:t xml:space="preserve">DDU removes every NVIDIA driver artifact — registry keys, files, scheduled tasks. Use only when you need to.</w:t>
-      </w:r>
-    </w:p>
-    <w:bookmarkEnd w:id="48"/>
-    <w:bookmarkStart w:id="49" w:name="pre-emptive-caution"/>
-    <w:p>
-      <w:pPr>
-        <w:pStyle w:val="Heading3"/>
-      </w:pPr>
-      <w:r>
-        <w:t xml:space="preserve">8.4 Pre-emptive caution</w:t>
-      </w:r>
-    </w:p>
-    <w:p>
-      <w:pPr>
-        <w:pStyle w:val="FirstParagraph"/>
-      </w:pPr>
-      <w:r>
-        <w:t xml:space="preserve">Before any driver upgrade:</w:t>
-      </w:r>
-    </w:p>
-    <w:p>
-      <w:pPr>
-        <w:numPr>
-          <w:ilvl w:val="0"/>
-          <w:numId w:val="1005"/>
-        </w:numPr>
-        <w:pStyle w:val="Compact"/>
-      </w:pPr>
-      <w:r>
-        <w:rPr>
-          <w:iCs/>
-          <w:i/>
-        </w:rPr>
-        <w:t xml:space="preserve">Settings → System → About → Advanced system settings → System Protection</w:t>
-      </w:r>
-      <w:r>
-        <w:t xml:space="preserve"> </w:t>
-      </w:r>
-      <w:r>
-        <w:t xml:space="preserve">→ confirm protection is</w:t>
-      </w:r>
-      <w:r>
-        <w:t xml:space="preserve"> </w:t>
-      </w:r>
-      <w:r>
-        <w:rPr>
-          <w:bCs/>
-          <w:b/>
-        </w:rPr>
-        <w:t xml:space="preserve">On</w:t>
-      </w:r>
-      <w:r>
-        <w:t xml:space="preserve"> </w:t>
-      </w:r>
-      <w:r>
-        <w:t xml:space="preserve">for</w:t>
-      </w:r>
-      <w:r>
-        <w:t xml:space="preserve"> </w:t>
-      </w:r>
-      <w:r>
-        <w:rPr>
-          <w:rStyle w:val="VerbatimChar"/>
-        </w:rPr>
-        <w:t xml:space="preserve">C:</w:t>
-      </w:r>
-      <w:r>
-        <w:t xml:space="preserve">.</w:t>
-      </w:r>
-    </w:p>
-    <w:p>
-      <w:pPr>
-        <w:numPr>
-          <w:ilvl w:val="0"/>
-          <w:numId w:val="1005"/>
-        </w:numPr>
-        <w:pStyle w:val="Compact"/>
-      </w:pPr>
-      <w:r>
-        <w:t xml:space="preserve">Note the current driver:</w:t>
-      </w:r>
-      <w:r>
-        <w:t xml:space="preserve"> </w:t>
-      </w:r>
-      <w:r>
-        <w:rPr>
-          <w:rStyle w:val="VerbatimChar"/>
-        </w:rPr>
-        <w:t xml:space="preserve">nvidia-smi --query-gpu=driver_version --format=csv,noheader &gt; driver-before.txt</w:t>
-      </w:r>
-    </w:p>
-    <w:p>
-      <w:pPr>
-        <w:numPr>
-          <w:ilvl w:val="0"/>
-          <w:numId w:val="1005"/>
-        </w:numPr>
-        <w:pStyle w:val="Compact"/>
-      </w:pPr>
-      <w:r>
-        <w:t xml:space="preserve">Manually create a restore point:</w:t>
-      </w:r>
-      <w:r>
-        <w:t xml:space="preserve"> </w:t>
-      </w:r>
-      <w:r>
-        <w:rPr>
-          <w:iCs/>
-          <w:i/>
-        </w:rPr>
-        <w:t xml:space="preserve">Start →</w:t>
-      </w:r>
-      <w:r>
-        <w:rPr>
-          <w:iCs/>
-          <w:i/>
-        </w:rPr>
-        <w:t xml:space="preserve"> </w:t>
-      </w:r>
-      <w:r>
-        <w:rPr>
-          <w:iCs/>
-          <w:i/>
-        </w:rPr>
-        <w:t xml:space="preserve">“</w:t>
-      </w:r>
-      <w:r>
-        <w:rPr>
-          <w:iCs/>
-          <w:i/>
-        </w:rPr>
-        <w:t xml:space="preserve">Create a restore point</w:t>
-      </w:r>
-      <w:r>
-        <w:rPr>
-          <w:iCs/>
-          <w:i/>
-        </w:rPr>
-        <w:t xml:space="preserve">”</w:t>
-      </w:r>
-      <w:r>
-        <w:rPr>
-          <w:iCs/>
-          <w:i/>
-        </w:rPr>
-        <w:t xml:space="preserve"> </w:t>
-      </w:r>
-      <w:r>
-        <w:rPr>
-          <w:iCs/>
-          <w:i/>
-        </w:rPr>
-        <w:t xml:space="preserve">→ Create</w:t>
-      </w:r>
-      <w:r>
-        <w:t xml:space="preserve">.</w:t>
-      </w:r>
-    </w:p>
-    <w:p>
-      <w:r>
-        <w:pict>
-          <v:rect style="width:0;height:1.5pt" o:hralign="center" o:hrstd="t" o:hr="t"/>
-        </w:pict>
-      </w:r>
-    </w:p>
-    <w:bookmarkEnd w:id="49"/>
-    <w:bookmarkEnd w:id="50"/>
-    <w:bookmarkStart w:id="51" w:name="wsl2-alternative"/>
-    <w:p>
-      <w:pPr>
-        <w:pStyle w:val="Heading2"/>
-      </w:pPr>
-      <w:r>
-        <w:t xml:space="preserve">9. WSL2 alternative</w:t>
-      </w:r>
-    </w:p>
-    <w:p>
-      <w:pPr>
-        <w:pStyle w:val="FirstParagraph"/>
-      </w:pPr>
-      <w:r>
-        <w:t xml:space="preserve">If you’d rather mirror the Linux setup exactly on this same Windows 11 machine:</w:t>
-      </w:r>
-    </w:p>
-    <w:p>
-      <w:pPr>
-        <w:pStyle w:val="SourceCode"/>
-      </w:pPr>
-      <w:r>
-        <w:rPr>
-          <w:rStyle w:val="NormalTok"/>
-        </w:rPr>
-        <w:t xml:space="preserve">wsl </w:t>
-      </w:r>
-      <w:r>
-        <w:rPr>
-          <w:rStyle w:val="OperatorTok"/>
-        </w:rPr>
-        <w:t xml:space="preserve">--</w:t>
-      </w:r>
-      <w:r>
-        <w:rPr>
-          <w:rStyle w:val="NormalTok"/>
-        </w:rPr>
-        <w:t xml:space="preserve">install </w:t>
-      </w:r>
-      <w:r>
-        <w:rPr>
-          <w:rStyle w:val="OperatorTok"/>
-        </w:rPr>
-        <w:t xml:space="preserve">-</w:t>
-      </w:r>
-      <w:r>
-        <w:rPr>
-          <w:rStyle w:val="NormalTok"/>
-        </w:rPr>
-        <w:t xml:space="preserve">d Ubuntu</w:t>
-      </w:r>
-      <w:r>
-        <w:rPr>
-          <w:rStyle w:val="OperatorTok"/>
-        </w:rPr>
-        <w:t xml:space="preserve">-</w:t>
-      </w:r>
-      <w:r>
-        <w:rPr>
-          <w:rStyle w:val="NormalTok"/>
-        </w:rPr>
-        <w:t xml:space="preserve">24</w:t>
-      </w:r>
-      <w:r>
-        <w:rPr>
-          <w:rStyle w:val="OperatorTok"/>
-        </w:rPr>
-        <w:t xml:space="preserve">.</w:t>
-      </w:r>
-      <w:r>
-        <w:rPr>
-          <w:rStyle w:val="FunctionTok"/>
-        </w:rPr>
-        <w:t xml:space="preserve">04</w:t>
-      </w:r>
-    </w:p>
-    <w:p>
-      <w:pPr>
-        <w:pStyle w:val="FirstParagraph"/>
-      </w:pPr>
-      <w:r>
-        <w:t xml:space="preserve">Reboot, complete the Ubuntu setup, then</w:t>
-      </w:r>
-      <w:r>
-        <w:t xml:space="preserve"> </w:t>
-      </w:r>
-      <w:r>
-        <w:rPr>
-          <w:bCs/>
-          <w:b/>
-        </w:rPr>
-        <w:t xml:space="preserve">inside WSL</w:t>
-      </w:r>
-      <w:r>
-        <w:t xml:space="preserve">:</w:t>
-      </w:r>
-    </w:p>
-    <w:p>
-      <w:pPr>
-        <w:pStyle w:val="SourceCode"/>
-      </w:pPr>
-      <w:r>
-        <w:rPr>
-          <w:rStyle w:val="CommentTok"/>
-        </w:rPr>
-        <w:t xml:space="preserve"># Use the Linux install script</w:t>
-      </w:r>
-      <w:r>
-        <w:br/>
-      </w:r>
-      <w:r>
-        <w:rPr>
-          <w:rStyle w:val="ExtensionTok"/>
-        </w:rPr>
-        <w:t xml:space="preserve">./scripts/install.sh</w:t>
-      </w:r>
-    </w:p>
-    <w:p>
-      <w:pPr>
-        <w:pStyle w:val="FirstParagraph"/>
-      </w:pPr>
-      <w:r>
-        <w:t xml:space="preserve">Important caveats:</w:t>
-      </w:r>
-    </w:p>
-    <w:p>
-      <w:pPr>
-        <w:numPr>
-          <w:ilvl w:val="0"/>
-          <w:numId w:val="1006"/>
-        </w:numPr>
-        <w:pStyle w:val="Compact"/>
-      </w:pPr>
-      <w:r>
-        <w:rPr>
-          <w:bCs/>
-          <w:b/>
-        </w:rPr>
-        <w:t xml:space="preserve">Install the Windows-side NVIDIA driver only.</w:t>
-      </w:r>
-      <w:r>
-        <w:t xml:space="preserve"> </w:t>
-      </w:r>
-      <w:r>
-        <w:t xml:space="preserve">Do not install a Linux driver inside WSL — Microsoft’s WSL kernel ships its own driver shim that talks to the Windows driver. Installing a Linux driver inside WSL will break GPU access.</w:t>
-      </w:r>
-    </w:p>
-    <w:p>
-      <w:pPr>
-        <w:numPr>
-          <w:ilvl w:val="0"/>
-          <w:numId w:val="1006"/>
-        </w:numPr>
-        <w:pStyle w:val="Compact"/>
-      </w:pPr>
-      <w:r>
-        <w:t xml:space="preserve">The Windows driver must be a recent version that supports the WSL CUDA shim — any modern Game Ready / Studio driver does.</w:t>
-      </w:r>
-    </w:p>
-    <w:p>
-      <w:pPr>
-        <w:numPr>
-          <w:ilvl w:val="0"/>
-          <w:numId w:val="1006"/>
-        </w:numPr>
-        <w:pStyle w:val="Compact"/>
-      </w:pPr>
-      <w:r>
-        <w:rPr>
-          <w:rStyle w:val="VerbatimChar"/>
-        </w:rPr>
-        <w:t xml:space="preserve">nvidia-smi</w:t>
-      </w:r>
-      <w:r>
-        <w:t xml:space="preserve"> </w:t>
-      </w:r>
-      <w:r>
-        <w:t xml:space="preserve">works inside WSL once you’ve installed CUDA in WSL — the GPU shows up as if it were native.</w:t>
-      </w:r>
-    </w:p>
-    <w:p>
-      <w:pPr>
-        <w:numPr>
-          <w:ilvl w:val="0"/>
-          <w:numId w:val="1006"/>
-        </w:numPr>
-        <w:pStyle w:val="Compact"/>
-      </w:pPr>
-      <w:r>
-        <w:t xml:space="preserve">Compute performance is within a few percent of bare Linux.</w:t>
+        <w:t xml:space="preserve">Common values:</w:t>
       </w:r>
     </w:p>
     <w:tbl>
@@ -10600,30 +9418,34 @@
           <w:p>
             <w:pPr>
               <w:pStyle w:val="Compact"/>
-            </w:pPr>
-          </w:p>
-        </w:tc>
-        <w:tc>
-          <w:tcPr/>
-          <w:p>
-            <w:pPr>
-              <w:pStyle w:val="Compact"/>
-              <w:jc w:val="left"/>
-            </w:pPr>
-            <w:r>
-              <w:t xml:space="preserve">Native Windows (this doc)</w:t>
-            </w:r>
-          </w:p>
-        </w:tc>
-        <w:tc>
-          <w:tcPr/>
-          <w:p>
-            <w:pPr>
-              <w:pStyle w:val="Compact"/>
-              <w:jc w:val="left"/>
-            </w:pPr>
-            <w:r>
-              <w:t xml:space="preserve">WSL2</w:t>
+              <w:jc w:val="left"/>
+            </w:pPr>
+            <w:r>
+              <w:t xml:space="preserve">Architecture</w:t>
+            </w:r>
+          </w:p>
+        </w:tc>
+        <w:tc>
+          <w:tcPr/>
+          <w:p>
+            <w:pPr>
+              <w:pStyle w:val="Compact"/>
+              <w:jc w:val="left"/>
+            </w:pPr>
+            <w:r>
+              <w:t xml:space="preserve">Compute capability</w:t>
+            </w:r>
+          </w:p>
+        </w:tc>
+        <w:tc>
+          <w:tcPr/>
+          <w:p>
+            <w:pPr>
+              <w:pStyle w:val="Compact"/>
+              <w:jc w:val="left"/>
+            </w:pPr>
+            <w:r>
+              <w:t xml:space="preserve">Example cards</w:t>
             </w:r>
           </w:p>
         </w:tc>
@@ -10637,31 +9459,34 @@
               <w:jc w:val="left"/>
             </w:pPr>
             <w:r>
-              <w:t xml:space="preserve">Toolchain</w:t>
-            </w:r>
-          </w:p>
-        </w:tc>
-        <w:tc>
-          <w:tcPr/>
-          <w:p>
-            <w:pPr>
-              <w:pStyle w:val="Compact"/>
-              <w:jc w:val="left"/>
-            </w:pPr>
-            <w:r>
-              <w:t xml:space="preserve">MSVC</w:t>
-            </w:r>
-          </w:p>
-        </w:tc>
-        <w:tc>
-          <w:tcPr/>
-          <w:p>
-            <w:pPr>
-              <w:pStyle w:val="Compact"/>
-              <w:jc w:val="left"/>
-            </w:pPr>
-            <w:r>
-              <w:t xml:space="preserve">GCC (same as Linux)</w:t>
+              <w:t xml:space="preserve">Pascal</w:t>
+            </w:r>
+          </w:p>
+        </w:tc>
+        <w:tc>
+          <w:tcPr/>
+          <w:p>
+            <w:pPr>
+              <w:pStyle w:val="Compact"/>
+              <w:jc w:val="left"/>
+            </w:pPr>
+            <w:r>
+              <w:rPr>
+                <w:rStyle w:val="VerbatimChar"/>
+              </w:rPr>
+              <w:t xml:space="preserve">61</w:t>
+            </w:r>
+          </w:p>
+        </w:tc>
+        <w:tc>
+          <w:tcPr/>
+          <w:p>
+            <w:pPr>
+              <w:pStyle w:val="Compact"/>
+              <w:jc w:val="left"/>
+            </w:pPr>
+            <w:r>
+              <w:t xml:space="preserve">GTX 1050 Ti, 1080</w:t>
             </w:r>
           </w:p>
         </w:tc>
@@ -10675,31 +9500,34 @@
               <w:jc w:val="left"/>
             </w:pPr>
             <w:r>
-              <w:t xml:space="preserve">Build identical to Linux?</w:t>
-            </w:r>
-          </w:p>
-        </w:tc>
-        <w:tc>
-          <w:tcPr/>
-          <w:p>
-            <w:pPr>
-              <w:pStyle w:val="Compact"/>
-              <w:jc w:val="left"/>
-            </w:pPr>
-            <w:r>
-              <w:t xml:space="preserve">No</w:t>
-            </w:r>
-          </w:p>
-        </w:tc>
-        <w:tc>
-          <w:tcPr/>
-          <w:p>
-            <w:pPr>
-              <w:pStyle w:val="Compact"/>
-              <w:jc w:val="left"/>
-            </w:pPr>
-            <w:r>
-              <w:t xml:space="preserve">Yes</w:t>
+              <w:t xml:space="preserve">Turing</w:t>
+            </w:r>
+          </w:p>
+        </w:tc>
+        <w:tc>
+          <w:tcPr/>
+          <w:p>
+            <w:pPr>
+              <w:pStyle w:val="Compact"/>
+              <w:jc w:val="left"/>
+            </w:pPr>
+            <w:r>
+              <w:rPr>
+                <w:rStyle w:val="VerbatimChar"/>
+              </w:rPr>
+              <w:t xml:space="preserve">75</w:t>
+            </w:r>
+          </w:p>
+        </w:tc>
+        <w:tc>
+          <w:tcPr/>
+          <w:p>
+            <w:pPr>
+              <w:pStyle w:val="Compact"/>
+              <w:jc w:val="left"/>
+            </w:pPr>
+            <w:r>
+              <w:t xml:space="preserve">GTX 1660, RTX 2060</w:t>
             </w:r>
           </w:p>
         </w:tc>
@@ -10713,31 +9541,49 @@
               <w:jc w:val="left"/>
             </w:pPr>
             <w:r>
-              <w:t xml:space="preserve">GUI debugging via Nsight VSCE</w:t>
-            </w:r>
-          </w:p>
-        </w:tc>
-        <w:tc>
-          <w:tcPr/>
-          <w:p>
-            <w:pPr>
-              <w:pStyle w:val="Compact"/>
-              <w:jc w:val="left"/>
-            </w:pPr>
-            <w:r>
-              <w:t xml:space="preserve">Smoother</w:t>
-            </w:r>
-          </w:p>
-        </w:tc>
-        <w:tc>
-          <w:tcPr/>
-          <w:p>
-            <w:pPr>
-              <w:pStyle w:val="Compact"/>
-              <w:jc w:val="left"/>
-            </w:pPr>
-            <w:r>
-              <w:t xml:space="preserve">Works, slightly more setup</w:t>
+              <w:t xml:space="preserve">Ampere</w:t>
+            </w:r>
+          </w:p>
+        </w:tc>
+        <w:tc>
+          <w:tcPr/>
+          <w:p>
+            <w:pPr>
+              <w:pStyle w:val="Compact"/>
+              <w:jc w:val="left"/>
+            </w:pPr>
+            <w:r>
+              <w:rPr>
+                <w:rStyle w:val="VerbatimChar"/>
+              </w:rPr>
+              <w:t xml:space="preserve">80</w:t>
+            </w:r>
+            <w:r>
+              <w:t xml:space="preserve"> </w:t>
+            </w:r>
+            <w:r>
+              <w:t xml:space="preserve">/</w:t>
+            </w:r>
+            <w:r>
+              <w:t xml:space="preserve"> </w:t>
+            </w:r>
+            <w:r>
+              <w:rPr>
+                <w:rStyle w:val="VerbatimChar"/>
+              </w:rPr>
+              <w:t xml:space="preserve">86</w:t>
+            </w:r>
+          </w:p>
+        </w:tc>
+        <w:tc>
+          <w:tcPr/>
+          <w:p>
+            <w:pPr>
+              <w:pStyle w:val="Compact"/>
+              <w:jc w:val="left"/>
+            </w:pPr>
+            <w:r>
+              <w:t xml:space="preserve">A100 (80) / RTX 30-series (86)</w:t>
             </w:r>
           </w:p>
         </w:tc>
@@ -10751,31 +9597,34 @@
               <w:jc w:val="left"/>
             </w:pPr>
             <w:r>
-              <w:t xml:space="preserve">GPU driver lives where?</w:t>
-            </w:r>
-          </w:p>
-        </w:tc>
-        <w:tc>
-          <w:tcPr/>
-          <w:p>
-            <w:pPr>
-              <w:pStyle w:val="Compact"/>
-              <w:jc w:val="left"/>
-            </w:pPr>
-            <w:r>
-              <w:t xml:space="preserve">Windows</w:t>
-            </w:r>
-          </w:p>
-        </w:tc>
-        <w:tc>
-          <w:tcPr/>
-          <w:p>
-            <w:pPr>
-              <w:pStyle w:val="Compact"/>
-              <w:jc w:val="left"/>
-            </w:pPr>
-            <w:r>
-              <w:t xml:space="preserve">Windows (WSL borrows it)</w:t>
+              <w:t xml:space="preserve">Ada</w:t>
+            </w:r>
+          </w:p>
+        </w:tc>
+        <w:tc>
+          <w:tcPr/>
+          <w:p>
+            <w:pPr>
+              <w:pStyle w:val="Compact"/>
+              <w:jc w:val="left"/>
+            </w:pPr>
+            <w:r>
+              <w:rPr>
+                <w:rStyle w:val="VerbatimChar"/>
+              </w:rPr>
+              <w:t xml:space="preserve">89</w:t>
+            </w:r>
+          </w:p>
+        </w:tc>
+        <w:tc>
+          <w:tcPr/>
+          <w:p>
+            <w:pPr>
+              <w:pStyle w:val="Compact"/>
+              <w:jc w:val="left"/>
+            </w:pPr>
+            <w:r>
+              <w:t xml:space="preserve">RTX 40-series</w:t>
             </w:r>
           </w:p>
         </w:tc>
@@ -10789,36 +9638,285 @@
               <w:jc w:val="left"/>
             </w:pPr>
             <w:r>
-              <w:t xml:space="preserve">When to pick</w:t>
-            </w:r>
-          </w:p>
-        </w:tc>
-        <w:tc>
-          <w:tcPr/>
-          <w:p>
-            <w:pPr>
-              <w:pStyle w:val="Compact"/>
-              <w:jc w:val="left"/>
-            </w:pPr>
-            <w:r>
-              <w:t xml:space="preserve">Tight Visual Studio integration</w:t>
-            </w:r>
-          </w:p>
-        </w:tc>
-        <w:tc>
-          <w:tcPr/>
-          <w:p>
-            <w:pPr>
-              <w:pStyle w:val="Compact"/>
-              <w:jc w:val="left"/>
-            </w:pPr>
-            <w:r>
-              <w:t xml:space="preserve">Mirror of Linux setup, lower friction if you already know Linux</w:t>
+              <w:t xml:space="preserve">Hopper</w:t>
+            </w:r>
+          </w:p>
+        </w:tc>
+        <w:tc>
+          <w:tcPr/>
+          <w:p>
+            <w:pPr>
+              <w:pStyle w:val="Compact"/>
+              <w:jc w:val="left"/>
+            </w:pPr>
+            <w:r>
+              <w:rPr>
+                <w:rStyle w:val="VerbatimChar"/>
+              </w:rPr>
+              <w:t xml:space="preserve">90</w:t>
+            </w:r>
+          </w:p>
+        </w:tc>
+        <w:tc>
+          <w:tcPr/>
+          <w:p>
+            <w:pPr>
+              <w:pStyle w:val="Compact"/>
+              <w:jc w:val="left"/>
+            </w:pPr>
+            <w:r>
+              <w:t xml:space="preserve">H100</w:t>
+            </w:r>
+          </w:p>
+        </w:tc>
+      </w:tr>
+      <w:tr>
+        <w:tc>
+          <w:tcPr/>
+          <w:p>
+            <w:pPr>
+              <w:pStyle w:val="Compact"/>
+              <w:jc w:val="left"/>
+            </w:pPr>
+            <w:r>
+              <w:rPr>
+                <w:bCs/>
+                <w:b/>
+              </w:rPr>
+              <w:t xml:space="preserve">Blackwell (consumer / Pro mobile)</w:t>
+            </w:r>
+          </w:p>
+        </w:tc>
+        <w:tc>
+          <w:tcPr/>
+          <w:p>
+            <w:pPr>
+              <w:pStyle w:val="Compact"/>
+              <w:jc w:val="left"/>
+            </w:pPr>
+            <w:r>
+              <w:rPr>
+                <w:rStyle w:val="VerbatimChar"/>
+                <w:bCs/>
+                <w:b/>
+              </w:rPr>
+              <w:t xml:space="preserve">120</w:t>
+            </w:r>
+          </w:p>
+        </w:tc>
+        <w:tc>
+          <w:tcPr/>
+          <w:p>
+            <w:pPr>
+              <w:pStyle w:val="Compact"/>
+              <w:jc w:val="left"/>
+            </w:pPr>
+            <w:r>
+              <w:rPr>
+                <w:bCs/>
+                <w:b/>
+              </w:rPr>
+              <w:t xml:space="preserve">RTX 50-series, RTX Pro Mobile Blackwell</w:t>
+            </w:r>
+          </w:p>
+        </w:tc>
+      </w:tr>
+      <w:tr>
+        <w:tc>
+          <w:tcPr/>
+          <w:p>
+            <w:pPr>
+              <w:pStyle w:val="Compact"/>
+              <w:jc w:val="left"/>
+            </w:pPr>
+            <w:r>
+              <w:t xml:space="preserve">Blackwell (Pro desktop)</w:t>
+            </w:r>
+          </w:p>
+        </w:tc>
+        <w:tc>
+          <w:tcPr/>
+          <w:p>
+            <w:pPr>
+              <w:pStyle w:val="Compact"/>
+              <w:jc w:val="left"/>
+            </w:pPr>
+            <w:r>
+              <w:rPr>
+                <w:rStyle w:val="VerbatimChar"/>
+              </w:rPr>
+              <w:t xml:space="preserve">122</w:t>
+            </w:r>
+          </w:p>
+        </w:tc>
+        <w:tc>
+          <w:tcPr/>
+          <w:p>
+            <w:pPr>
+              <w:pStyle w:val="Compact"/>
+              <w:jc w:val="left"/>
+            </w:pPr>
+            <w:r>
+              <w:t xml:space="preserve">RTX Pro 6000 Blackwell</w:t>
+            </w:r>
+          </w:p>
+        </w:tc>
+      </w:tr>
+      <w:tr>
+        <w:tc>
+          <w:tcPr/>
+          <w:p>
+            <w:pPr>
+              <w:pStyle w:val="Compact"/>
+              <w:jc w:val="left"/>
+            </w:pPr>
+            <w:r>
+              <w:t xml:space="preserve">Special</w:t>
+            </w:r>
+          </w:p>
+        </w:tc>
+        <w:tc>
+          <w:tcPr/>
+          <w:p>
+            <w:pPr>
+              <w:pStyle w:val="Compact"/>
+              <w:jc w:val="left"/>
+            </w:pPr>
+            <w:r>
+              <w:rPr>
+                <w:rStyle w:val="VerbatimChar"/>
+              </w:rPr>
+              <w:t xml:space="preserve">all-major</w:t>
+            </w:r>
+          </w:p>
+        </w:tc>
+        <w:tc>
+          <w:tcPr/>
+          <w:p>
+            <w:pPr>
+              <w:pStyle w:val="Compact"/>
+              <w:jc w:val="left"/>
+            </w:pPr>
+            <w:r>
+              <w:t xml:space="preserve">Fat binary covering every major arch</w:t>
             </w:r>
           </w:p>
         </w:tc>
       </w:tr>
     </w:tbl>
+    <w:p>
+      <w:pPr>
+        <w:pStyle w:val="BodyText"/>
+      </w:pPr>
+      <w:r>
+        <w:t xml:space="preserve">Find yours at</w:t>
+      </w:r>
+      <w:r>
+        <w:t xml:space="preserve"> </w:t>
+      </w:r>
+      <w:hyperlink r:id="rId22">
+        <w:r>
+          <w:rPr>
+            <w:rStyle w:val="Hyperlink"/>
+          </w:rPr>
+          <w:t xml:space="preserve">https://developer.nvidia.com/cuda-gpus</w:t>
+        </w:r>
+      </w:hyperlink>
+      <w:r>
+        <w:t xml:space="preserve"> </w:t>
+      </w:r>
+      <w:r>
+        <w:t xml:space="preserve">(or see §1.2 of this document).</w:t>
+      </w:r>
+    </w:p>
+    <w:bookmarkEnd w:id="42"/>
+    <w:bookmarkStart w:id="43" w:name="Xe6d637beff3a84f95de55e92d95a17b60f6f342"/>
+    <w:p>
+      <w:pPr>
+        <w:pStyle w:val="Heading3"/>
+      </w:pPr>
+      <w:r>
+        <w:t xml:space="preserve">CUDA Toolkit version — pick the latest your GPU supports</w:t>
+      </w:r>
+    </w:p>
+    <w:p>
+      <w:pPr>
+        <w:pStyle w:val="FirstParagraph"/>
+      </w:pPr>
+      <w:r>
+        <w:t xml:space="preserve">For modern GPUs (Turing and newer) install the</w:t>
+      </w:r>
+      <w:r>
+        <w:t xml:space="preserve"> </w:t>
+      </w:r>
+      <w:r>
+        <w:rPr>
+          <w:bCs/>
+          <w:b/>
+        </w:rPr>
+        <w:t xml:space="preserve">latest CUDA 13.x</w:t>
+      </w:r>
+      <w:r>
+        <w:t xml:space="preserve"> </w:t>
+      </w:r>
+      <w:r>
+        <w:t xml:space="preserve">—</w:t>
+      </w:r>
+      <w:r>
+        <w:t xml:space="preserve"> </w:t>
+      </w:r>
+      <w:r>
+        <w:rPr>
+          <w:rStyle w:val="VerbatimChar"/>
+        </w:rPr>
+        <w:t xml:space="preserve">winget install --id Nvidia.CUDA</w:t>
+      </w:r>
+      <w:r>
+        <w:t xml:space="preserve"> </w:t>
+      </w:r>
+      <w:r>
+        <w:t xml:space="preserve">already does this. CUDA 13 has the newest nvcc, best Blackwell support, and current Nsight tooling.</w:t>
+      </w:r>
+    </w:p>
+    <w:p>
+      <w:pPr>
+        <w:pStyle w:val="BodyText"/>
+      </w:pPr>
+      <w:r>
+        <w:t xml:space="preserve">The Pascal-driven recommendation in</w:t>
+      </w:r>
+      <w:r>
+        <w:t xml:space="preserve"> </w:t>
+      </w:r>
+      <w:r>
+        <w:rPr>
+          <w:rStyle w:val="VerbatimChar"/>
+        </w:rPr>
+        <w:t xml:space="preserve">SETUP.md</w:t>
+      </w:r>
+      <w:r>
+        <w:t xml:space="preserve"> </w:t>
+      </w:r>
+      <w:r>
+        <w:t xml:space="preserve">(Linux) to pin CUDA 12.x</w:t>
+      </w:r>
+      <w:r>
+        <w:t xml:space="preserve"> </w:t>
+      </w:r>
+      <w:r>
+        <w:rPr>
+          <w:bCs/>
+          <w:b/>
+        </w:rPr>
+        <w:t xml:space="preserve">does not apply to this laptop</w:t>
+      </w:r>
+      <w:r>
+        <w:t xml:space="preserve"> </w:t>
+      </w:r>
+      <w:r>
+        <w:t xml:space="preserve">— Blackwell is fully supported by CUDA 13. Use 13.x unless you have a specific compatibility reason to stay on 12.x (e.g. a third-party library that hasn’t been rebuilt against 13).</w:t>
+      </w:r>
+    </w:p>
     <w:p>
       <w:r>
         <w:pict>
@@ -10826,8 +9924,1305 @@
         </w:pict>
       </w:r>
     </w:p>
+    <w:bookmarkEnd w:id="43"/>
+    <w:bookmarkEnd w:id="44"/>
+    <w:bookmarkStart w:id="45" w:name="verify-the-install"/>
+    <w:p>
+      <w:pPr>
+        <w:pStyle w:val="Heading2"/>
+      </w:pPr>
+      <w:r>
+        <w:t xml:space="preserve">7. Verify the install</w:t>
+      </w:r>
+    </w:p>
+    <w:p>
+      <w:pPr>
+        <w:pStyle w:val="FirstParagraph"/>
+      </w:pPr>
+      <w:r>
+        <w:t xml:space="preserve">In an</w:t>
+      </w:r>
+      <w:r>
+        <w:t xml:space="preserve"> </w:t>
+      </w:r>
+      <w:r>
+        <w:rPr>
+          <w:bCs/>
+          <w:b/>
+        </w:rPr>
+        <w:t xml:space="preserve">x64 Native Tools</w:t>
+      </w:r>
+      <w:r>
+        <w:t xml:space="preserve"> </w:t>
+      </w:r>
+      <w:r>
+        <w:t xml:space="preserve">prompt:</w:t>
+      </w:r>
+    </w:p>
+    <w:p>
+      <w:pPr>
+        <w:pStyle w:val="SourceCode"/>
+      </w:pPr>
+      <w:r>
+        <w:rPr>
+          <w:rStyle w:val="NormalTok"/>
+        </w:rPr>
+        <w:t xml:space="preserve">nvidia-smi              :: driver visible, GPU listed</w:t>
+      </w:r>
+      <w:r>
+        <w:br/>
+      </w:r>
+      <w:r>
+        <w:rPr>
+          <w:rStyle w:val="NormalTok"/>
+        </w:rPr>
+        <w:t xml:space="preserve">nvcc -</w:t>
+      </w:r>
+      <w:r>
+        <w:rPr>
+          <w:rStyle w:val="AttributeTok"/>
+        </w:rPr>
+        <w:t xml:space="preserve">-version</w:t>
+      </w:r>
+      <w:r>
+        <w:rPr>
+          <w:rStyle w:val="NormalTok"/>
+        </w:rPr>
+        <w:t xml:space="preserve">          :: should report 12.8 or newer (13.x recommended for Blackwell</w:t>
+      </w:r>
+      <w:r>
+        <w:rPr>
+          <w:rStyle w:val="KeywordTok"/>
+        </w:rPr>
+        <w:t xml:space="preserve">)</w:t>
+      </w:r>
+      <w:r>
+        <w:br/>
+      </w:r>
+      <w:r>
+        <w:rPr>
+          <w:rStyle w:val="NormalTok"/>
+        </w:rPr>
+        <w:t xml:space="preserve">ninja -</w:t>
+      </w:r>
+      <w:r>
+        <w:rPr>
+          <w:rStyle w:val="AttributeTok"/>
+        </w:rPr>
+        <w:t xml:space="preserve">-version</w:t>
+      </w:r>
+      <w:r>
+        <w:br/>
+      </w:r>
+      <w:r>
+        <w:rPr>
+          <w:rStyle w:val="NormalTok"/>
+        </w:rPr>
+        <w:t xml:space="preserve">cmake -</w:t>
+      </w:r>
+      <w:r>
+        <w:rPr>
+          <w:rStyle w:val="AttributeTok"/>
+        </w:rPr>
+        <w:t xml:space="preserve">-version</w:t>
+      </w:r>
+      <w:r>
+        <w:rPr>
+          <w:rStyle w:val="NormalTok"/>
+        </w:rPr>
+        <w:t xml:space="preserve">         :: </w:t>
+      </w:r>
+      <w:r>
+        <w:rPr>
+          <w:rStyle w:val="KeywordTok"/>
+        </w:rPr>
+        <w:t xml:space="preserve">&gt;</w:t>
+      </w:r>
+      <w:r>
+        <w:rPr>
+          <w:rStyle w:val="NormalTok"/>
+        </w:rPr>
+        <w:t xml:space="preserve">= 3.24</w:t>
+      </w:r>
+      <w:r>
+        <w:br/>
+      </w:r>
+      <w:r>
+        <w:rPr>
+          <w:rStyle w:val="NormalTok"/>
+        </w:rPr>
+        <w:t xml:space="preserve">cl                      :: should print Microsoft C</w:t>
+      </w:r>
+      <w:r>
+        <w:rPr>
+          <w:rStyle w:val="AttributeTok"/>
+        </w:rPr>
+        <w:t xml:space="preserve">/C</w:t>
+      </w:r>
+      <w:r>
+        <w:rPr>
+          <w:rStyle w:val="NormalTok"/>
+        </w:rPr>
+        <w:t xml:space="preserve">++ Compiler banner</w:t>
+      </w:r>
+      <w:r>
+        <w:br/>
+      </w:r>
+      <w:r>
+        <w:rPr>
+          <w:rStyle w:val="NormalTok"/>
+        </w:rPr>
+        <w:t xml:space="preserve">code -</w:t>
+      </w:r>
+      <w:r>
+        <w:rPr>
+          <w:rStyle w:val="AttributeTok"/>
+        </w:rPr>
+        <w:t xml:space="preserve">-list-extensions</w:t>
+      </w:r>
+      <w:r>
+        <w:rPr>
+          <w:rStyle w:val="NormalTok"/>
+        </w:rPr>
+        <w:t xml:space="preserve">  :: should include nsight, cpptools, cmake</w:t>
+      </w:r>
+      <w:r>
+        <w:rPr>
+          <w:rStyle w:val="AttributeTok"/>
+        </w:rPr>
+        <w:t xml:space="preserve">-tools</w:t>
+      </w:r>
+    </w:p>
+    <w:p>
+      <w:pPr>
+        <w:pStyle w:val="FirstParagraph"/>
+      </w:pPr>
+      <w:r>
+        <w:t xml:space="preserve">Then build and run; success looks like:</w:t>
+      </w:r>
+    </w:p>
+    <w:p>
+      <w:pPr>
+        <w:pStyle w:val="SourceCode"/>
+      </w:pPr>
+      <w:r>
+        <w:rPr>
+          <w:rStyle w:val="VerbatimChar"/>
+        </w:rPr>
+        <w:t xml:space="preserve">OK: 1048576 elements added on GPU</w:t>
+      </w:r>
+    </w:p>
+    <w:p>
+      <w:r>
+        <w:pict>
+          <v:rect style="width:0;height:1.5pt" o:hralign="center" o:hrstd="t" o:hr="t"/>
+        </w:pict>
+      </w:r>
+    </w:p>
+    <w:bookmarkEnd w:id="45"/>
+    <w:bookmarkStart w:id="51" w:name="driver-rollback-on-windows"/>
+    <w:p>
+      <w:pPr>
+        <w:pStyle w:val="Heading2"/>
+      </w:pPr>
+      <w:r>
+        <w:t xml:space="preserve">8. Driver rollback on Windows</w:t>
+      </w:r>
+    </w:p>
+    <w:p>
+      <w:pPr>
+        <w:pStyle w:val="FirstParagraph"/>
+      </w:pPr>
+      <w:r>
+        <w:t xml:space="preserve">If a new driver causes problems, Windows gives you three escalating recovery options. They map roughly to the Linux</w:t>
+      </w:r>
+      <w:r>
+        <w:t xml:space="preserve"> </w:t>
+      </w:r>
+      <w:r>
+        <w:rPr>
+          <w:iCs/>
+          <w:i/>
+        </w:rPr>
+        <w:t xml:space="preserve">Timeshift / apt downgrade / nouveau</w:t>
+      </w:r>
+      <w:r>
+        <w:t xml:space="preserve"> </w:t>
+      </w:r>
+      <w:r>
+        <w:t xml:space="preserve">tiers.</w:t>
+      </w:r>
+    </w:p>
+    <w:bookmarkStart w:id="46" w:name="roll-back-via-device-manager-gentlest"/>
+    <w:p>
+      <w:pPr>
+        <w:pStyle w:val="Heading3"/>
+      </w:pPr>
+      <w:r>
+        <w:t xml:space="preserve">8.1 Roll back via Device Manager (gentlest)</w:t>
+      </w:r>
+    </w:p>
+    <w:p>
+      <w:pPr>
+        <w:pStyle w:val="FirstParagraph"/>
+      </w:pPr>
+      <w:r>
+        <w:t xml:space="preserve">Best when Windows still boots and the new driver is the obvious culprit.</w:t>
+      </w:r>
+    </w:p>
+    <w:p>
+      <w:pPr>
+        <w:numPr>
+          <w:ilvl w:val="0"/>
+          <w:numId w:val="1002"/>
+        </w:numPr>
+        <w:pStyle w:val="Compact"/>
+      </w:pPr>
+      <w:r>
+        <w:rPr>
+          <w:iCs/>
+          <w:i/>
+        </w:rPr>
+        <w:t xml:space="preserve">Start menu → Device Manager</w:t>
+      </w:r>
+      <w:r>
+        <w:t xml:space="preserve">.</w:t>
+      </w:r>
+    </w:p>
+    <w:p>
+      <w:pPr>
+        <w:numPr>
+          <w:ilvl w:val="0"/>
+          <w:numId w:val="1002"/>
+        </w:numPr>
+        <w:pStyle w:val="Compact"/>
+      </w:pPr>
+      <w:r>
+        <w:rPr>
+          <w:iCs/>
+          <w:i/>
+        </w:rPr>
+        <w:t xml:space="preserve">Display adapters</w:t>
+      </w:r>
+      <w:r>
+        <w:t xml:space="preserve"> </w:t>
+      </w:r>
+      <w:r>
+        <w:t xml:space="preserve">→ right-click your NVIDIA GPU →</w:t>
+      </w:r>
+      <w:r>
+        <w:t xml:space="preserve"> </w:t>
+      </w:r>
+      <w:r>
+        <w:rPr>
+          <w:iCs/>
+          <w:i/>
+        </w:rPr>
+        <w:t xml:space="preserve">Properties</w:t>
+      </w:r>
+      <w:r>
+        <w:t xml:space="preserve">.</w:t>
+      </w:r>
+    </w:p>
+    <w:p>
+      <w:pPr>
+        <w:numPr>
+          <w:ilvl w:val="0"/>
+          <w:numId w:val="1002"/>
+        </w:numPr>
+        <w:pStyle w:val="Compact"/>
+      </w:pPr>
+      <w:r>
+        <w:rPr>
+          <w:iCs/>
+          <w:i/>
+        </w:rPr>
+        <w:t xml:space="preserve">Driver</w:t>
+      </w:r>
+      <w:r>
+        <w:t xml:space="preserve"> </w:t>
+      </w:r>
+      <w:r>
+        <w:t xml:space="preserve">tab →</w:t>
+      </w:r>
+      <w:r>
+        <w:t xml:space="preserve"> </w:t>
+      </w:r>
+      <w:r>
+        <w:rPr>
+          <w:bCs/>
+          <w:b/>
+        </w:rPr>
+        <w:t xml:space="preserve">Roll Back Driver</w:t>
+      </w:r>
+      <w:r>
+        <w:t xml:space="preserve">.</w:t>
+      </w:r>
+    </w:p>
+    <w:p>
+      <w:pPr>
+        <w:numPr>
+          <w:ilvl w:val="0"/>
+          <w:numId w:val="1002"/>
+        </w:numPr>
+        <w:pStyle w:val="Compact"/>
+      </w:pPr>
+      <w:r>
+        <w:t xml:space="preserve">Pick a reason, click OK, reboot.</w:t>
+      </w:r>
+    </w:p>
+    <w:p>
+      <w:pPr>
+        <w:pStyle w:val="FirstParagraph"/>
+      </w:pPr>
+      <w:r>
+        <w:t xml:space="preserve">This restores the</w:t>
+      </w:r>
+      <w:r>
+        <w:t xml:space="preserve"> </w:t>
+      </w:r>
+      <w:r>
+        <w:rPr>
+          <w:bCs/>
+          <w:b/>
+        </w:rPr>
+        <w:t xml:space="preserve">immediately previous</w:t>
+      </w:r>
+      <w:r>
+        <w:t xml:space="preserve"> </w:t>
+      </w:r>
+      <w:r>
+        <w:t xml:space="preserve">driver Windows kept staged. If the button is greyed out, no previous driver is available — try §8.2.</w:t>
+      </w:r>
+    </w:p>
+    <w:bookmarkEnd w:id="46"/>
+    <w:bookmarkStart w:id="47" w:name="system-restore-medium"/>
+    <w:p>
+      <w:pPr>
+        <w:pStyle w:val="Heading3"/>
+      </w:pPr>
+      <w:r>
+        <w:t xml:space="preserve">8.2 System Restore (medium)</w:t>
+      </w:r>
+    </w:p>
+    <w:p>
+      <w:pPr>
+        <w:pStyle w:val="FirstParagraph"/>
+      </w:pPr>
+      <w:r>
+        <w:t xml:space="preserve">Windows automatically takes a restore point before driver installs (if System Protection is enabled — check</w:t>
+      </w:r>
+      <w:r>
+        <w:t xml:space="preserve"> </w:t>
+      </w:r>
+      <w:r>
+        <w:rPr>
+          <w:iCs/>
+          <w:i/>
+        </w:rPr>
+        <w:t xml:space="preserve">Settings → System → About → Advanced system settings → System Protection</w:t>
+      </w:r>
+      <w:r>
+        <w:t xml:space="preserve">).</w:t>
+      </w:r>
+    </w:p>
+    <w:p>
+      <w:pPr>
+        <w:numPr>
+          <w:ilvl w:val="0"/>
+          <w:numId w:val="1003"/>
+        </w:numPr>
+        <w:pStyle w:val="Compact"/>
+      </w:pPr>
+      <w:r>
+        <w:rPr>
+          <w:iCs/>
+          <w:i/>
+        </w:rPr>
+        <w:t xml:space="preserve">Start menu →</w:t>
+      </w:r>
+      <w:r>
+        <w:rPr>
+          <w:iCs/>
+          <w:i/>
+        </w:rPr>
+        <w:t xml:space="preserve"> </w:t>
+      </w:r>
+      <w:r>
+        <w:rPr>
+          <w:iCs/>
+          <w:i/>
+        </w:rPr>
+        <w:t xml:space="preserve">“</w:t>
+      </w:r>
+      <w:r>
+        <w:rPr>
+          <w:iCs/>
+          <w:i/>
+        </w:rPr>
+        <w:t xml:space="preserve">Create a restore point</w:t>
+      </w:r>
+      <w:r>
+        <w:rPr>
+          <w:iCs/>
+          <w:i/>
+        </w:rPr>
+        <w:t xml:space="preserve">”</w:t>
+      </w:r>
+      <w:r>
+        <w:t xml:space="preserve">.</w:t>
+      </w:r>
+    </w:p>
+    <w:p>
+      <w:pPr>
+        <w:numPr>
+          <w:ilvl w:val="0"/>
+          <w:numId w:val="1003"/>
+        </w:numPr>
+        <w:pStyle w:val="Compact"/>
+      </w:pPr>
+      <w:r>
+        <w:rPr>
+          <w:iCs/>
+          <w:i/>
+        </w:rPr>
+        <w:t xml:space="preserve">System Restore…</w:t>
+      </w:r>
+      <w:r>
+        <w:t xml:space="preserve"> </w:t>
+      </w:r>
+      <w:r>
+        <w:t xml:space="preserve">→ pick a point dated</w:t>
+      </w:r>
+      <w:r>
+        <w:t xml:space="preserve"> </w:t>
+      </w:r>
+      <w:r>
+        <w:rPr>
+          <w:iCs/>
+          <w:i/>
+        </w:rPr>
+        <w:t xml:space="preserve">before</w:t>
+      </w:r>
+      <w:r>
+        <w:t xml:space="preserve"> </w:t>
+      </w:r>
+      <w:r>
+        <w:t xml:space="preserve">the driver install →</w:t>
+      </w:r>
+      <w:r>
+        <w:t xml:space="preserve"> </w:t>
+      </w:r>
+      <w:r>
+        <w:rPr>
+          <w:iCs/>
+          <w:i/>
+        </w:rPr>
+        <w:t xml:space="preserve">Next</w:t>
+      </w:r>
+      <w:r>
+        <w:t xml:space="preserve"> </w:t>
+      </w:r>
+      <w:r>
+        <w:t xml:space="preserve">→</w:t>
+      </w:r>
+      <w:r>
+        <w:t xml:space="preserve"> </w:t>
+      </w:r>
+      <w:r>
+        <w:rPr>
+          <w:iCs/>
+          <w:i/>
+        </w:rPr>
+        <w:t xml:space="preserve">Finish</w:t>
+      </w:r>
+      <w:r>
+        <w:t xml:space="preserve">.</w:t>
+      </w:r>
+    </w:p>
+    <w:p>
+      <w:pPr>
+        <w:numPr>
+          <w:ilvl w:val="0"/>
+          <w:numId w:val="1003"/>
+        </w:numPr>
+        <w:pStyle w:val="Compact"/>
+      </w:pPr>
+      <w:r>
+        <w:t xml:space="preserve">Windows reboots into the restored state.</w:t>
+      </w:r>
+    </w:p>
+    <w:p>
+      <w:pPr>
+        <w:pStyle w:val="FirstParagraph"/>
+      </w:pPr>
+      <w:r>
+        <w:t xml:space="preserve">This reverts driver + registry changes without affecting your files.</w:t>
+      </w:r>
+    </w:p>
+    <w:bookmarkEnd w:id="47"/>
+    <w:bookmarkStart w:id="49" w:name="X3a09383cb05e81505884310cfc5fca4084af4b2"/>
+    <w:p>
+      <w:pPr>
+        <w:pStyle w:val="Heading3"/>
+      </w:pPr>
+      <w:r>
+        <w:t xml:space="preserve">8.3 DDU (Display Driver Uninstaller) — nuclear option</w:t>
+      </w:r>
+    </w:p>
+    <w:p>
+      <w:pPr>
+        <w:pStyle w:val="FirstParagraph"/>
+      </w:pPr>
+      <w:r>
+        <w:t xml:space="preserve">When the install is wedged badly enough that neither rollback method works:</w:t>
+      </w:r>
+    </w:p>
+    <w:p>
+      <w:pPr>
+        <w:numPr>
+          <w:ilvl w:val="0"/>
+          <w:numId w:val="1004"/>
+        </w:numPr>
+        <w:pStyle w:val="Compact"/>
+      </w:pPr>
+      <w:r>
+        <w:t xml:space="preserve">Download</w:t>
+      </w:r>
+      <w:r>
+        <w:t xml:space="preserve"> </w:t>
+      </w:r>
+      <w:r>
+        <w:rPr>
+          <w:bCs/>
+          <w:b/>
+        </w:rPr>
+        <w:t xml:space="preserve">DDU</w:t>
+      </w:r>
+      <w:r>
+        <w:t xml:space="preserve"> </w:t>
+      </w:r>
+      <w:r>
+        <w:t xml:space="preserve">from</w:t>
+      </w:r>
+      <w:r>
+        <w:t xml:space="preserve"> </w:t>
+      </w:r>
+      <w:hyperlink r:id="rId48">
+        <w:r>
+          <w:rPr>
+            <w:rStyle w:val="Hyperlink"/>
+          </w:rPr>
+          <w:t xml:space="preserve">https://www.guru3d.com/files-categories/category/display-driver-uninstaller-ddu/</w:t>
+        </w:r>
+      </w:hyperlink>
+      <w:r>
+        <w:t xml:space="preserve">.</w:t>
+      </w:r>
+    </w:p>
+    <w:p>
+      <w:pPr>
+        <w:numPr>
+          <w:ilvl w:val="0"/>
+          <w:numId w:val="1004"/>
+        </w:numPr>
+        <w:pStyle w:val="Compact"/>
+      </w:pPr>
+      <w:r>
+        <w:t xml:space="preserve">Boot Windows in</w:t>
+      </w:r>
+      <w:r>
+        <w:t xml:space="preserve"> </w:t>
+      </w:r>
+      <w:r>
+        <w:rPr>
+          <w:bCs/>
+          <w:b/>
+        </w:rPr>
+        <w:t xml:space="preserve">Safe Mode</w:t>
+      </w:r>
+      <w:r>
+        <w:t xml:space="preserve"> </w:t>
+      </w:r>
+      <w:r>
+        <w:t xml:space="preserve">(</w:t>
+      </w:r>
+      <w:r>
+        <w:rPr>
+          <w:iCs/>
+          <w:i/>
+        </w:rPr>
+        <w:t xml:space="preserve">Settings → System → Recovery → Advanced startup → Restart now → Troubleshoot → Advanced options → Startup Settings → Restart → 4</w:t>
+      </w:r>
+      <w:r>
+        <w:t xml:space="preserve">).</w:t>
+      </w:r>
+    </w:p>
+    <w:p>
+      <w:pPr>
+        <w:numPr>
+          <w:ilvl w:val="0"/>
+          <w:numId w:val="1004"/>
+        </w:numPr>
+        <w:pStyle w:val="Compact"/>
+      </w:pPr>
+      <w:r>
+        <w:t xml:space="preserve">Run DDU →</w:t>
+      </w:r>
+      <w:r>
+        <w:t xml:space="preserve"> </w:t>
+      </w:r>
+      <w:r>
+        <w:rPr>
+          <w:iCs/>
+          <w:i/>
+        </w:rPr>
+        <w:t xml:space="preserve">Clean and shutdown</w:t>
+      </w:r>
+      <w:r>
+        <w:t xml:space="preserve">.</w:t>
+      </w:r>
+    </w:p>
+    <w:p>
+      <w:pPr>
+        <w:numPr>
+          <w:ilvl w:val="0"/>
+          <w:numId w:val="1004"/>
+        </w:numPr>
+        <w:pStyle w:val="Compact"/>
+      </w:pPr>
+      <w:r>
+        <w:t xml:space="preserve">Boot normally; install a known-good driver (a specific version from</w:t>
+      </w:r>
+      <w:r>
+        <w:t xml:space="preserve"> </w:t>
+      </w:r>
+      <w:hyperlink r:id="rId29">
+        <w:r>
+          <w:rPr>
+            <w:rStyle w:val="Hyperlink"/>
+          </w:rPr>
+          <w:t xml:space="preserve">https://www.nvidia.com/Download/index.aspx</w:t>
+        </w:r>
+      </w:hyperlink>
+      <w:r>
+        <w:t xml:space="preserve">).</w:t>
+      </w:r>
+    </w:p>
+    <w:p>
+      <w:pPr>
+        <w:pStyle w:val="FirstParagraph"/>
+      </w:pPr>
+      <w:r>
+        <w:t xml:space="preserve">DDU removes every NVIDIA driver artifact — registry keys, files, scheduled tasks. Use only when you need to.</w:t>
+      </w:r>
+    </w:p>
+    <w:bookmarkEnd w:id="49"/>
+    <w:bookmarkStart w:id="50" w:name="pre-emptive-caution"/>
+    <w:p>
+      <w:pPr>
+        <w:pStyle w:val="Heading3"/>
+      </w:pPr>
+      <w:r>
+        <w:t xml:space="preserve">8.4 Pre-emptive caution</w:t>
+      </w:r>
+    </w:p>
+    <w:p>
+      <w:pPr>
+        <w:pStyle w:val="FirstParagraph"/>
+      </w:pPr>
+      <w:r>
+        <w:t xml:space="preserve">Before any driver upgrade:</w:t>
+      </w:r>
+    </w:p>
+    <w:p>
+      <w:pPr>
+        <w:numPr>
+          <w:ilvl w:val="0"/>
+          <w:numId w:val="1005"/>
+        </w:numPr>
+        <w:pStyle w:val="Compact"/>
+      </w:pPr>
+      <w:r>
+        <w:rPr>
+          <w:iCs/>
+          <w:i/>
+        </w:rPr>
+        <w:t xml:space="preserve">Settings → System → About → Advanced system settings → System Protection</w:t>
+      </w:r>
+      <w:r>
+        <w:t xml:space="preserve"> </w:t>
+      </w:r>
+      <w:r>
+        <w:t xml:space="preserve">→ confirm protection is</w:t>
+      </w:r>
+      <w:r>
+        <w:t xml:space="preserve"> </w:t>
+      </w:r>
+      <w:r>
+        <w:rPr>
+          <w:bCs/>
+          <w:b/>
+        </w:rPr>
+        <w:t xml:space="preserve">On</w:t>
+      </w:r>
+      <w:r>
+        <w:t xml:space="preserve"> </w:t>
+      </w:r>
+      <w:r>
+        <w:t xml:space="preserve">for</w:t>
+      </w:r>
+      <w:r>
+        <w:t xml:space="preserve"> </w:t>
+      </w:r>
+      <w:r>
+        <w:rPr>
+          <w:rStyle w:val="VerbatimChar"/>
+        </w:rPr>
+        <w:t xml:space="preserve">C:</w:t>
+      </w:r>
+      <w:r>
+        <w:t xml:space="preserve">.</w:t>
+      </w:r>
+    </w:p>
+    <w:p>
+      <w:pPr>
+        <w:numPr>
+          <w:ilvl w:val="0"/>
+          <w:numId w:val="1005"/>
+        </w:numPr>
+        <w:pStyle w:val="Compact"/>
+      </w:pPr>
+      <w:r>
+        <w:t xml:space="preserve">Note the current driver:</w:t>
+      </w:r>
+      <w:r>
+        <w:t xml:space="preserve"> </w:t>
+      </w:r>
+      <w:r>
+        <w:rPr>
+          <w:rStyle w:val="VerbatimChar"/>
+        </w:rPr>
+        <w:t xml:space="preserve">nvidia-smi --query-gpu=driver_version --format=csv,noheader &gt; driver-before.txt</w:t>
+      </w:r>
+    </w:p>
+    <w:p>
+      <w:pPr>
+        <w:numPr>
+          <w:ilvl w:val="0"/>
+          <w:numId w:val="1005"/>
+        </w:numPr>
+        <w:pStyle w:val="Compact"/>
+      </w:pPr>
+      <w:r>
+        <w:t xml:space="preserve">Manually create a restore point:</w:t>
+      </w:r>
+      <w:r>
+        <w:t xml:space="preserve"> </w:t>
+      </w:r>
+      <w:r>
+        <w:rPr>
+          <w:iCs/>
+          <w:i/>
+        </w:rPr>
+        <w:t xml:space="preserve">Start →</w:t>
+      </w:r>
+      <w:r>
+        <w:rPr>
+          <w:iCs/>
+          <w:i/>
+        </w:rPr>
+        <w:t xml:space="preserve"> </w:t>
+      </w:r>
+      <w:r>
+        <w:rPr>
+          <w:iCs/>
+          <w:i/>
+        </w:rPr>
+        <w:t xml:space="preserve">“</w:t>
+      </w:r>
+      <w:r>
+        <w:rPr>
+          <w:iCs/>
+          <w:i/>
+        </w:rPr>
+        <w:t xml:space="preserve">Create a restore point</w:t>
+      </w:r>
+      <w:r>
+        <w:rPr>
+          <w:iCs/>
+          <w:i/>
+        </w:rPr>
+        <w:t xml:space="preserve">”</w:t>
+      </w:r>
+      <w:r>
+        <w:rPr>
+          <w:iCs/>
+          <w:i/>
+        </w:rPr>
+        <w:t xml:space="preserve"> </w:t>
+      </w:r>
+      <w:r>
+        <w:rPr>
+          <w:iCs/>
+          <w:i/>
+        </w:rPr>
+        <w:t xml:space="preserve">→ Create</w:t>
+      </w:r>
+      <w:r>
+        <w:t xml:space="preserve">.</w:t>
+      </w:r>
+    </w:p>
+    <w:p>
+      <w:r>
+        <w:pict>
+          <v:rect style="width:0;height:1.5pt" o:hralign="center" o:hrstd="t" o:hr="t"/>
+        </w:pict>
+      </w:r>
+    </w:p>
+    <w:bookmarkEnd w:id="50"/>
     <w:bookmarkEnd w:id="51"/>
-    <w:bookmarkStart w:id="52" w:name="common-windows-specific-pitfalls"/>
+    <w:bookmarkStart w:id="52" w:name="wsl2-alternative"/>
+    <w:p>
+      <w:pPr>
+        <w:pStyle w:val="Heading2"/>
+      </w:pPr>
+      <w:r>
+        <w:t xml:space="preserve">9. WSL2 alternative</w:t>
+      </w:r>
+    </w:p>
+    <w:p>
+      <w:pPr>
+        <w:pStyle w:val="FirstParagraph"/>
+      </w:pPr>
+      <w:r>
+        <w:t xml:space="preserve">If you’d rather mirror the Linux setup exactly on this same Windows 11 machine:</w:t>
+      </w:r>
+    </w:p>
+    <w:p>
+      <w:pPr>
+        <w:pStyle w:val="SourceCode"/>
+      </w:pPr>
+      <w:r>
+        <w:rPr>
+          <w:rStyle w:val="NormalTok"/>
+        </w:rPr>
+        <w:t xml:space="preserve">wsl </w:t>
+      </w:r>
+      <w:r>
+        <w:rPr>
+          <w:rStyle w:val="OperatorTok"/>
+        </w:rPr>
+        <w:t xml:space="preserve">--</w:t>
+      </w:r>
+      <w:r>
+        <w:rPr>
+          <w:rStyle w:val="NormalTok"/>
+        </w:rPr>
+        <w:t xml:space="preserve">install </w:t>
+      </w:r>
+      <w:r>
+        <w:rPr>
+          <w:rStyle w:val="OperatorTok"/>
+        </w:rPr>
+        <w:t xml:space="preserve">-</w:t>
+      </w:r>
+      <w:r>
+        <w:rPr>
+          <w:rStyle w:val="NormalTok"/>
+        </w:rPr>
+        <w:t xml:space="preserve">d Ubuntu</w:t>
+      </w:r>
+      <w:r>
+        <w:rPr>
+          <w:rStyle w:val="OperatorTok"/>
+        </w:rPr>
+        <w:t xml:space="preserve">-</w:t>
+      </w:r>
+      <w:r>
+        <w:rPr>
+          <w:rStyle w:val="NormalTok"/>
+        </w:rPr>
+        <w:t xml:space="preserve">24</w:t>
+      </w:r>
+      <w:r>
+        <w:rPr>
+          <w:rStyle w:val="OperatorTok"/>
+        </w:rPr>
+        <w:t xml:space="preserve">.</w:t>
+      </w:r>
+      <w:r>
+        <w:rPr>
+          <w:rStyle w:val="FunctionTok"/>
+        </w:rPr>
+        <w:t xml:space="preserve">04</w:t>
+      </w:r>
+    </w:p>
+    <w:p>
+      <w:pPr>
+        <w:pStyle w:val="FirstParagraph"/>
+      </w:pPr>
+      <w:r>
+        <w:t xml:space="preserve">Reboot, complete the Ubuntu setup, then</w:t>
+      </w:r>
+      <w:r>
+        <w:t xml:space="preserve"> </w:t>
+      </w:r>
+      <w:r>
+        <w:rPr>
+          <w:bCs/>
+          <w:b/>
+        </w:rPr>
+        <w:t xml:space="preserve">inside WSL</w:t>
+      </w:r>
+      <w:r>
+        <w:t xml:space="preserve">:</w:t>
+      </w:r>
+    </w:p>
+    <w:p>
+      <w:pPr>
+        <w:pStyle w:val="SourceCode"/>
+      </w:pPr>
+      <w:r>
+        <w:rPr>
+          <w:rStyle w:val="CommentTok"/>
+        </w:rPr>
+        <w:t xml:space="preserve"># Use the Linux install script</w:t>
+      </w:r>
+      <w:r>
+        <w:br/>
+      </w:r>
+      <w:r>
+        <w:rPr>
+          <w:rStyle w:val="ExtensionTok"/>
+        </w:rPr>
+        <w:t xml:space="preserve">./scripts/install.sh</w:t>
+      </w:r>
+    </w:p>
+    <w:p>
+      <w:pPr>
+        <w:pStyle w:val="FirstParagraph"/>
+      </w:pPr>
+      <w:r>
+        <w:t xml:space="preserve">Important caveats:</w:t>
+      </w:r>
+    </w:p>
+    <w:p>
+      <w:pPr>
+        <w:numPr>
+          <w:ilvl w:val="0"/>
+          <w:numId w:val="1006"/>
+        </w:numPr>
+        <w:pStyle w:val="Compact"/>
+      </w:pPr>
+      <w:r>
+        <w:rPr>
+          <w:bCs/>
+          <w:b/>
+        </w:rPr>
+        <w:t xml:space="preserve">Install the Windows-side NVIDIA driver only.</w:t>
+      </w:r>
+      <w:r>
+        <w:t xml:space="preserve"> </w:t>
+      </w:r>
+      <w:r>
+        <w:t xml:space="preserve">Do not install a Linux driver inside WSL — Microsoft’s WSL kernel ships its own driver shim that talks to the Windows driver. Installing a Linux driver inside WSL will break GPU access.</w:t>
+      </w:r>
+    </w:p>
+    <w:p>
+      <w:pPr>
+        <w:numPr>
+          <w:ilvl w:val="0"/>
+          <w:numId w:val="1006"/>
+        </w:numPr>
+        <w:pStyle w:val="Compact"/>
+      </w:pPr>
+      <w:r>
+        <w:t xml:space="preserve">The Windows driver must be a recent version that supports the WSL CUDA shim — any modern Game Ready / Studio driver does.</w:t>
+      </w:r>
+    </w:p>
+    <w:p>
+      <w:pPr>
+        <w:numPr>
+          <w:ilvl w:val="0"/>
+          <w:numId w:val="1006"/>
+        </w:numPr>
+        <w:pStyle w:val="Compact"/>
+      </w:pPr>
+      <w:r>
+        <w:rPr>
+          <w:rStyle w:val="VerbatimChar"/>
+        </w:rPr>
+        <w:t xml:space="preserve">nvidia-smi</w:t>
+      </w:r>
+      <w:r>
+        <w:t xml:space="preserve"> </w:t>
+      </w:r>
+      <w:r>
+        <w:t xml:space="preserve">works inside WSL once you’ve installed CUDA in WSL — the GPU shows up as if it were native.</w:t>
+      </w:r>
+    </w:p>
+    <w:p>
+      <w:pPr>
+        <w:numPr>
+          <w:ilvl w:val="0"/>
+          <w:numId w:val="1006"/>
+        </w:numPr>
+        <w:pStyle w:val="Compact"/>
+      </w:pPr>
+      <w:r>
+        <w:t xml:space="preserve">Compute performance is within a few percent of bare Linux.</w:t>
+      </w:r>
+    </w:p>
+    <w:tbl>
+      <w:tblPr>
+        <w:tblStyle w:val="Table"/>
+        <w:tblW w:type="pct" w:w="5000"/>
+        <w:tblLook w:firstRow="1" w:lastRow="0" w:firstColumn="0" w:lastColumn="0" w:noHBand="0" w:noVBand="0" w:val="0020"/>
+        <w:jc w:val="start"/>
+      </w:tblPr>
+      <w:tblGrid>
+        <w:gridCol w:w="2640"/>
+        <w:gridCol w:w="2640"/>
+        <w:gridCol w:w="2640"/>
+      </w:tblGrid>
+      <w:tr>
+        <w:trPr>
+          <w:tblHeader w:val="true"/>
+        </w:trPr>
+        <w:tc>
+          <w:tcPr/>
+          <w:p>
+            <w:pPr>
+              <w:pStyle w:val="Compact"/>
+            </w:pPr>
+          </w:p>
+        </w:tc>
+        <w:tc>
+          <w:tcPr/>
+          <w:p>
+            <w:pPr>
+              <w:pStyle w:val="Compact"/>
+              <w:jc w:val="left"/>
+            </w:pPr>
+            <w:r>
+              <w:t xml:space="preserve">Native Windows (this doc)</w:t>
+            </w:r>
+          </w:p>
+        </w:tc>
+        <w:tc>
+          <w:tcPr/>
+          <w:p>
+            <w:pPr>
+              <w:pStyle w:val="Compact"/>
+              <w:jc w:val="left"/>
+            </w:pPr>
+            <w:r>
+              <w:t xml:space="preserve">WSL2</w:t>
+            </w:r>
+          </w:p>
+        </w:tc>
+      </w:tr>
+      <w:tr>
+        <w:tc>
+          <w:tcPr/>
+          <w:p>
+            <w:pPr>
+              <w:pStyle w:val="Compact"/>
+              <w:jc w:val="left"/>
+            </w:pPr>
+            <w:r>
+              <w:t xml:space="preserve">Toolchain</w:t>
+            </w:r>
+          </w:p>
+        </w:tc>
+        <w:tc>
+          <w:tcPr/>
+          <w:p>
+            <w:pPr>
+              <w:pStyle w:val="Compact"/>
+              <w:jc w:val="left"/>
+            </w:pPr>
+            <w:r>
+              <w:t xml:space="preserve">MSVC</w:t>
+            </w:r>
+          </w:p>
+        </w:tc>
+        <w:tc>
+          <w:tcPr/>
+          <w:p>
+            <w:pPr>
+              <w:pStyle w:val="Compact"/>
+              <w:jc w:val="left"/>
+            </w:pPr>
+            <w:r>
+              <w:t xml:space="preserve">GCC (same as Linux)</w:t>
+            </w:r>
+          </w:p>
+        </w:tc>
+      </w:tr>
+      <w:tr>
+        <w:tc>
+          <w:tcPr/>
+          <w:p>
+            <w:pPr>
+              <w:pStyle w:val="Compact"/>
+              <w:jc w:val="left"/>
+            </w:pPr>
+            <w:r>
+              <w:t xml:space="preserve">Build identical to Linux?</w:t>
+            </w:r>
+          </w:p>
+        </w:tc>
+        <w:tc>
+          <w:tcPr/>
+          <w:p>
+            <w:pPr>
+              <w:pStyle w:val="Compact"/>
+              <w:jc w:val="left"/>
+            </w:pPr>
+            <w:r>
+              <w:t xml:space="preserve">No</w:t>
+            </w:r>
+          </w:p>
+        </w:tc>
+        <w:tc>
+          <w:tcPr/>
+          <w:p>
+            <w:pPr>
+              <w:pStyle w:val="Compact"/>
+              <w:jc w:val="left"/>
+            </w:pPr>
+            <w:r>
+              <w:t xml:space="preserve">Yes</w:t>
+            </w:r>
+          </w:p>
+        </w:tc>
+      </w:tr>
+      <w:tr>
+        <w:tc>
+          <w:tcPr/>
+          <w:p>
+            <w:pPr>
+              <w:pStyle w:val="Compact"/>
+              <w:jc w:val="left"/>
+            </w:pPr>
+            <w:r>
+              <w:t xml:space="preserve">GUI debugging via Nsight VSCE</w:t>
+            </w:r>
+          </w:p>
+        </w:tc>
+        <w:tc>
+          <w:tcPr/>
+          <w:p>
+            <w:pPr>
+              <w:pStyle w:val="Compact"/>
+              <w:jc w:val="left"/>
+            </w:pPr>
+            <w:r>
+              <w:t xml:space="preserve">Smoother</w:t>
+            </w:r>
+          </w:p>
+        </w:tc>
+        <w:tc>
+          <w:tcPr/>
+          <w:p>
+            <w:pPr>
+              <w:pStyle w:val="Compact"/>
+              <w:jc w:val="left"/>
+            </w:pPr>
+            <w:r>
+              <w:t xml:space="preserve">Works, slightly more setup</w:t>
+            </w:r>
+          </w:p>
+        </w:tc>
+      </w:tr>
+      <w:tr>
+        <w:tc>
+          <w:tcPr/>
+          <w:p>
+            <w:pPr>
+              <w:pStyle w:val="Compact"/>
+              <w:jc w:val="left"/>
+            </w:pPr>
+            <w:r>
+              <w:t xml:space="preserve">GPU driver lives where?</w:t>
+            </w:r>
+          </w:p>
+        </w:tc>
+        <w:tc>
+          <w:tcPr/>
+          <w:p>
+            <w:pPr>
+              <w:pStyle w:val="Compact"/>
+              <w:jc w:val="left"/>
+            </w:pPr>
+            <w:r>
+              <w:t xml:space="preserve">Windows</w:t>
+            </w:r>
+          </w:p>
+        </w:tc>
+        <w:tc>
+          <w:tcPr/>
+          <w:p>
+            <w:pPr>
+              <w:pStyle w:val="Compact"/>
+              <w:jc w:val="left"/>
+            </w:pPr>
+            <w:r>
+              <w:t xml:space="preserve">Windows (WSL borrows it)</w:t>
+            </w:r>
+          </w:p>
+        </w:tc>
+      </w:tr>
+      <w:tr>
+        <w:tc>
+          <w:tcPr/>
+          <w:p>
+            <w:pPr>
+              <w:pStyle w:val="Compact"/>
+              <w:jc w:val="left"/>
+            </w:pPr>
+            <w:r>
+              <w:t xml:space="preserve">When to pick</w:t>
+            </w:r>
+          </w:p>
+        </w:tc>
+        <w:tc>
+          <w:tcPr/>
+          <w:p>
+            <w:pPr>
+              <w:pStyle w:val="Compact"/>
+              <w:jc w:val="left"/>
+            </w:pPr>
+            <w:r>
+              <w:t xml:space="preserve">Tight Visual Studio integration</w:t>
+            </w:r>
+          </w:p>
+        </w:tc>
+        <w:tc>
+          <w:tcPr/>
+          <w:p>
+            <w:pPr>
+              <w:pStyle w:val="Compact"/>
+              <w:jc w:val="left"/>
+            </w:pPr>
+            <w:r>
+              <w:t xml:space="preserve">Mirror of Linux setup, lower friction if you already know Linux</w:t>
+            </w:r>
+          </w:p>
+        </w:tc>
+      </w:tr>
+    </w:tbl>
+    <w:p>
+      <w:r>
+        <w:pict>
+          <v:rect style="width:0;height:1.5pt" o:hralign="center" o:hrstd="t" o:hr="t"/>
+        </w:pict>
+      </w:r>
+    </w:p>
+    <w:bookmarkEnd w:id="52"/>
+    <w:bookmarkStart w:id="53" w:name="common-windows-specific-pitfalls"/>
     <w:p>
       <w:pPr>
         <w:pStyle w:val="Heading2"/>
@@ -11398,8 +11793,8 @@
         </w:pict>
       </w:r>
     </w:p>
-    <w:bookmarkEnd w:id="52"/>
-    <w:bookmarkStart w:id="57" w:name="where-to-go-next"/>
+    <w:bookmarkEnd w:id="53"/>
+    <w:bookmarkStart w:id="58" w:name="where-to-go-next"/>
     <w:p>
       <w:pPr>
         <w:pStyle w:val="Heading2"/>
@@ -11463,7 +11858,7 @@
       <w:r>
         <w:t xml:space="preserve"> </w:t>
       </w:r>
-      <w:hyperlink r:id="rId53">
+      <w:hyperlink r:id="rId54">
         <w:r>
           <w:rPr>
             <w:rStyle w:val="Hyperlink"/>
@@ -11493,7 +11888,7 @@
       <w:r>
         <w:t xml:space="preserve"> </w:t>
       </w:r>
-      <w:hyperlink r:id="rId54">
+      <w:hyperlink r:id="rId55">
         <w:r>
           <w:rPr>
             <w:rStyle w:val="Hyperlink"/>
@@ -11523,7 +11918,7 @@
       <w:r>
         <w:t xml:space="preserve"> </w:t>
       </w:r>
-      <w:hyperlink r:id="rId55">
+      <w:hyperlink r:id="rId56">
         <w:r>
           <w:rPr>
             <w:rStyle w:val="Hyperlink"/>
@@ -11553,7 +11948,7 @@
       <w:r>
         <w:t xml:space="preserve"> </w:t>
       </w:r>
-      <w:hyperlink r:id="rId56">
+      <w:hyperlink r:id="rId57">
         <w:r>
           <w:rPr>
             <w:rStyle w:val="Hyperlink"/>
@@ -11562,8 +11957,8 @@
         </w:r>
       </w:hyperlink>
     </w:p>
-    <w:bookmarkEnd w:id="57"/>
     <w:bookmarkEnd w:id="58"/>
+    <w:bookmarkEnd w:id="59"/>
     <w:sectPr/>
   </w:body>
 </w:document>

</xml_diff>